<commit_message>
Research: add SHAI x CSS item-by-item analysis (appendix) and AI-classification sensitivity caveat
Co-Authored-By: Claude Opus 5.5 <noreply@anthropic.com>
Claude-Session: https://claude.ai/code/session_0186tGPQJ67bKVgWZR7S3c4o
</commit_message>
<xml_diff>
--- a/research/output/Cyberchondria_Research_Baghdad.docx
+++ b/research/output/Cyberchondria_Research_Baghdad.docx
@@ -1663,7 +1663,7 @@
           <w:sz w:val="26"/>
         </w:rPr>
         <w:tab/>
-        <w:t>27</w:t>
+        <w:t>28</w:t>
       </w:r>
     </w:p>
     <w:p>
@@ -1695,6 +1695,37 @@
         </w:rPr>
         <w:tab/>
         <w:t>28</w:t>
+      </w:r>
+    </w:p>
+    <w:p>
+      <w:pPr>
+        <w:tabs>
+          <w:tab w:pos="1134" w:val="left"/>
+          <w:tab w:pos="8787" w:val="right" w:leader="dot"/>
+        </w:tabs>
+        <w:spacing w:line="276" w:lineRule="auto" w:after="80"/>
+        <w:ind w:left="1134" w:hanging="1134"/>
+      </w:pPr>
+      <w:r>
+        <w:rPr>
+          <w:b/>
+          <w:sz w:val="26"/>
+        </w:rPr>
+        <w:t>Figure 9.</w:t>
+        <w:tab/>
+      </w:r>
+      <w:r>
+        <w:rPr>
+          <w:sz w:val="26"/>
+        </w:rPr>
+        <w:t>Item-by-item correlations between SHAI-14 and CSS-12 items (Spearman ρ). * significant after FDR correction across the 168 pairs; ** also significant after Holm–Bonferroni correction.</w:t>
+      </w:r>
+      <w:r>
+        <w:rPr>
+          <w:sz w:val="26"/>
+        </w:rPr>
+        <w:tab/>
+        <w:t>42</w:t>
         <w:fldChar w:fldCharType="end"/>
       </w:r>
     </w:p>
@@ -1788,7 +1819,7 @@
         <w:rPr>
           <w:rFonts w:ascii="Times New Roman" w:hAnsi="Times New Roman"/>
         </w:rPr>
-        <w:t xml:space="preserve"> Participants were mostly young (aged 20–29: 62.3%), female (56.3%) and from health-related fields (63.3%). AI chatbots were the most used tool (88.7%), ahead of search engines (56.3%). Both scales were reliable (α = 0.81 and 0.86). Mean SHAI was 12.3 ± 5.8 and 19.0% scored ≥18. Health anxiety correlated moderately with cyberchondria (r = 0.47, 95% CI 0.38–0.55), independent of covariates (partial r = 0.48), most strongly with excessive searching and post-search distress. Health anxiety was the strongest independent predictor of cyberchondria (β = 0.48), adding 18.4% explained variance; AI-chatbot use was independently associated with higher cyberchondria (B = 5.3). Excessive searching partly mediated the link between health anxiety and post-search distress, and post-search distress almost fully mediated its link with reassurance-seeking consultations. After searching, 34.7% delayed or skipped care because they felt reassured, and 31.7% never disclosed their searches to their doctor for fear of being judged.</w:t>
+        <w:t xml:space="preserve"> Participants were mostly young (aged 20–29: 62.3%), female (56.3%) and from health-related fields (63.3%). AI chatbots were the most used tool (88.7%), ahead of search engines (56.3%). Both scales were reliable (α = 0.81 and 0.86). Mean SHAI was 12.3 ± 5.8 and 19.0% scored ≥18. Health anxiety correlated moderately with cyberchondria (r = 0.47, 95% CI 0.38–0.55), independent of covariates (partial r = 0.48), most strongly with excessive searching and post-search distress. Health anxiety was the strongest independent predictor of cyberchondria (β = 0.48), adding 18.4% explained variance; AI-chatbot use was associated with higher cyberchondria (B = 5.3), although this depended on how inconsistent answers were classified. Excessive searching partly mediated the link between health anxiety and post-search distress, and post-search distress almost fully mediated its link with reassurance-seeking consultations. After searching, 34.7% delayed or skipped care because they felt reassured, and 31.7% never disclosed their searches to their doctor for fear of being judged.</w:t>
       </w:r>
     </w:p>
     <w:p>
@@ -1834,7 +1865,7 @@
     <w:p>
       <w:pPr>
         <w:sectPr>
-          <w:footerReference w:type="default" r:id="rId17"/>
+          <w:footerReference w:type="default" r:id="rId18"/>
           <w:pgSz w:w="11906" w:h="16838"/>
           <w:pgMar w:top="1417" w:right="1417" w:bottom="1417" w:left="1701" w:header="720" w:footer="720" w:gutter="0"/>
           <w:cols w:space="720"/>
@@ -8874,7 +8905,7 @@
         <w:rPr>
           <w:rFonts w:ascii="Times New Roman" w:hAnsi="Times New Roman"/>
         </w:rPr>
-        <w:t>At item level, the CSS items most strongly linked to health anxiety were panicking when reading that a symptom could signal a rare or serious condition (ρ = 0.46), searching whenever an unexplained sensation is noticed (ρ = 0.43) and feeling more anxious after searching (ρ = 0.43). Among SHAI items, fear of serious illness (ρ = 0.39) and interpretation of bodily sensations (ρ = 0.33) correlated most with cyberchondria, whereas simple awareness of bodily sensations and of aches and pains did not (ρ = 0.09 and 0.08, q &gt; 0.10). The more tools and motives participants reported, the higher both scores were, whereas trust in online/AI information was associated only with excessiveness (ρ = 0.19).</w:t>
+        <w:t>At item level, the CSS items most strongly linked to health anxiety were panicking when reading that a symptom could signal a rare or serious condition (ρ = 0.46), searching whenever an unexplained sensation is noticed (ρ = 0.43) and feeling more anxious after searching (ρ = 0.43). Among SHAI items, fear of serious illness (ρ = 0.39) and interpretation of bodily sensations (ρ = 0.33) correlated most with cyberchondria, whereas simple awareness of bodily sensations and of aches and pains did not (ρ = 0.09 and 0.08, q &gt; 0.10). The more tools and motives participants reported, the higher both scores were, whereas trust in online/AI information was associated only with excessiveness (ρ = 0.19). A full item-by-item analysis of all 168 SHAI × CSS item pairs (Appendix, Figure 9) showed that 111 pairs remained significant after FDR correction and 58 after Holm–Bonferroni correction; the strongest were fear of serious illness with panic on reading about a rare or serious condition (ρ = 0.43), interpreting bodily sensations with searching whenever a sensation is noticed (ρ = 0.42), and difficulty distracting oneself from health thoughts with the same panic item (ρ = 0.41). Simple awareness of aches, pains and bodily sensations (SHAI items 2 and 3) was largely unrelated to any searching behaviour.</w:t>
       </w:r>
     </w:p>
     <w:p>
@@ -17104,7 +17135,7 @@
         <w:rPr>
           <w:rFonts w:ascii="Times New Roman" w:hAnsi="Times New Roman"/>
         </w:rPr>
-        <w:t>In the hierarchical regression (Table 7), socio-demographic variables alone explained little of the variance in cyberchondria (R² = 0.030). Adding digital-use variables raised R² to 0.133 (ΔR² = 0.103, p &lt; 0.001), and adding health anxiety raised it to 0.317 (ΔR² = 0.184, p &lt; 0.001; adjusted R² = 0.268). In the final model, health anxiety was by far the strongest predictor (B = 0.68, 95% CI 0.53–0.84, β = 0.48, p &lt; 0.001): each additional SHAI point was associated with a 0.68-point higher CSS score. AI-chatbot use was independently associated with a 5.3-point higher CSS score (95% CI 2.34–8.32, β = 0.20, p &lt; 0.001), and age 30–39 years with higher cyberchondria than age 20–29 (p = 0.043). Occupation, health background, gender, chronic disease, language, trust and motives were not independently associated with cyberchondria. Multicollinearity was low (maximum VIF = 3.9), and the bootstrap 95% CI for the SHAI coefficient (0.54–0.83) confirmed its stability. Quantile regression showed a consistent effect of health anxiety across the distribution of cyberchondria (B from 0.55 to 0.85), and a quadratic term was not significant (p = 0.245), indicating a linear association.</w:t>
+        <w:t>In the hierarchical regression (Table 7), socio-demographic variables alone explained little of the variance in cyberchondria (R² = 0.030). Adding digital-use variables raised R² to 0.133 (ΔR² = 0.103, p &lt; 0.001), and adding health anxiety raised it to 0.317 (ΔR² = 0.184, p &lt; 0.001; adjusted R² = 0.268). In the final model, health anxiety was by far the strongest predictor (B = 0.68, 95% CI 0.53–0.84, β = 0.48, p &lt; 0.001): each additional SHAI point was associated with a 0.68-point higher CSS score. AI-chatbot use was independently associated with a 5.3-point higher CSS score (95% CI 2.34–8.32, β = 0.20, p &lt; 0.001), and age 30–39 years with higher cyberchondria than age 20–29 (p = 0.043). This AI finding was sensitive to how AI use was defined: when only respondents who ticked "AI chatbots" were counted as users (n = 234), so that the 32 who named a chatbot without ticking it fell into the comparison group, the association was no longer significant (B = 1.49, p = 0.314). The 32 reclassified respondents had the highest cyberchondria of any group (mean 31.6), and the true non-user group was small (n = 34). Occupation, health background, gender, chronic disease, language, trust and motives were not independently associated with cyberchondria. Multicollinearity was low (maximum VIF = 3.9), and the bootstrap 95% CI for the SHAI coefficient (0.54–0.83) confirmed its stability. Quantile regression showed a consistent effect of health anxiety across the distribution of cyberchondria (B from 0.55 to 0.85), and a quadratic term was not significant (p = 0.245), indicating a linear association.</w:t>
       </w:r>
     </w:p>
     <w:p>
@@ -23141,7 +23172,7 @@
         <w:rPr>
           <w:rFonts w:ascii="Times New Roman" w:hAnsi="Times New Roman"/>
         </w:rPr>
-        <w:t>The dominance of AI chatbots (88.7%) is a new finding and contrasts with a 2024 US survey in which about one in five respondents reported using ChatGPT for health information [26]. Our sample was young and highly educated, which partly explains the difference: AI use fell from 96% in those aged 18–19 to 72% in those aged 40 and over. AI users had higher cyberchondria, and AI use remained an independent predictor after adjustment for health anxiety, age, occupation and other tools. The effect was concentrated in excessiveness and reassurance seeking. Two interpretations are possible. Because LLM chatbots answer in fluent, personalised and empathetic language [24,25], they may invite repeated, conversational querying (asking "one more question"), which is the behavioural core of the excessiveness dimension. Alternatively, people who already search more heavily may simply have adopted every available tool, so that AI use marks intensity rather than causes it. The comparison group of non-users was small (n = 34) and older, and AI use did not modify the strength of the health anxiety–cyberchondria link. On current evidence, AI chatbots appear to be a new channel for, rather than a qualitatively different driver of, cyberchondria, which is consistent with observations that health-anxious people are over-represented among users of digital symptom checkers [27].</w:t>
+        <w:t>The dominance of AI chatbots (88.7%) is a new finding and contrasts with a 2024 US survey in which about one in five respondents reported using ChatGPT for health information [26]. Our sample was young and highly educated, which partly explains the difference: AI use fell from 96% in those aged 18–19 to 72% in those aged 40 and over. AI users had higher cyberchondria, and AI use remained an independent predictor after adjustment for health anxiety, age, occupation and other tools. The effect was concentrated in excessiveness and reassurance seeking. Two interpretations are possible. Because LLM chatbots answer in fluent, personalised and empathetic language [24,25], they may invite repeated, conversational querying (asking "one more question"), which is the behavioural core of the excessiveness dimension. Alternatively, people who already search more heavily may simply have adopted every available tool, so that AI use marks intensity rather than causes it. The comparison group of non-users was small (n = 34) and older, the association disappeared when the 32 respondents with inconsistent answers about AI use were classed as non-users, and AI use did not modify the strength of the health anxiety–cyberchondria link. On current evidence, AI chatbots appear to be a new channel for, rather than a qualitatively different driver of, cyberchondria, which is consistent with observations that health-anxious people are over-represented among users of digital symptom checkers [27].</w:t>
       </w:r>
     </w:p>
     <w:p>
@@ -23398,6 +23429,26 @@
           <w:rFonts w:ascii="Times New Roman" w:hAnsi="Times New Roman"/>
           <w:b/>
         </w:rPr>
+        <w:t>Classification of AI use:</w:t>
+      </w:r>
+      <w:r>
+        <w:rPr>
+          <w:rFonts w:ascii="Times New Roman" w:hAnsi="Times New Roman"/>
+        </w:rPr>
+        <w:t xml:space="preserve"> 32 respondents named an AI chatbot without ticking the AI option. They were classed as users, and the independent association between AI use and cyberchondria depended on this decision, so it should be regarded as tentative.</w:t>
+      </w:r>
+    </w:p>
+    <w:p>
+      <w:pPr>
+        <w:pStyle w:val="ListBullet"/>
+        <w:spacing w:after="60"/>
+        <w:jc w:val="both"/>
+      </w:pPr>
+      <w:r>
+        <w:rPr>
+          <w:rFonts w:ascii="Times New Roman" w:hAnsi="Times New Roman"/>
+          <w:b/>
+        </w:rPr>
         <w:t>Data quality:</w:t>
       </w:r>
       <w:r>
@@ -23485,7 +23536,7 @@
         <w:rPr>
           <w:rFonts w:ascii="Times New Roman" w:hAnsi="Times New Roman"/>
         </w:rPr>
-        <w:t>AI-chatbot use is independently associated with higher cyberchondria, mainly excessive searching and reassurance seeking, but does not change the strength of the health anxiety–cyberchondria link.</w:t>
+        <w:t>AI-chatbot use is associated with higher cyberchondria, mainly excessive searching and reassurance seeking, although this depends on how inconsistent answers are classified; AI use does not change the strength of the health anxiety–cyberchondria link.</w:t>
       </w:r>
     </w:p>
     <w:p>
@@ -24391,8 +24442,136 @@
         <w:t>Waterman LZ, Weinman JA. Medical student syndrome: fact or fiction? A cross-sectional study. JRSM Open. 2014;5(2). doi:10.1177/2042533313512480</w:t>
       </w:r>
     </w:p>
+    <w:p>
+      <w:r>
+        <w:br w:type="page"/>
+      </w:r>
+    </w:p>
+    <w:p>
+      <w:pPr>
+        <w:pStyle w:val="Heading1"/>
+      </w:pPr>
+      <w:r>
+        <w:t>Appendix</w:t>
+      </w:r>
+    </w:p>
+    <w:p>
+      <w:pPr>
+        <w:spacing w:after="120"/>
+        <w:jc w:val="both"/>
+      </w:pPr>
+      <w:r>
+        <w:rPr>
+          <w:rFonts w:ascii="Times New Roman" w:hAnsi="Times New Roman"/>
+        </w:rPr>
+        <w:t>Item-by-item Spearman correlations between all 14 SHAI-14 items and all 12 CSS-12 items (168 pairs). Correction for multiple testing was applied within this family of 168 tests: 111 pairs were significant after Benjamini–Hochberg FDR correction and 58 after Holm–Bonferroni correction. Full values are given in the supplementary workbook (sheet T28_item_by_item).</w:t>
+      </w:r>
+    </w:p>
+    <w:p>
+      <w:pPr>
+        <w:keepNext/>
+        <w:jc w:val="center"/>
+      </w:pPr>
+      <w:r>
+        <w:drawing>
+          <wp:inline xmlns:a="http://schemas.openxmlformats.org/drawingml/2006/main" xmlns:pic="http://schemas.openxmlformats.org/drawingml/2006/picture">
+            <wp:extent cx="5760000" cy="4917116"/>
+            <wp:docPr id="9" name="Picture 9"/>
+            <wp:cNvGraphicFramePr>
+              <a:graphicFrameLocks noChangeAspect="1"/>
+            </wp:cNvGraphicFramePr>
+            <a:graphic>
+              <a:graphicData uri="http://schemas.openxmlformats.org/drawingml/2006/picture">
+                <pic:pic>
+                  <pic:nvPicPr>
+                    <pic:cNvPr id="0" name="fig9_item_by_item.png"/>
+                    <pic:cNvPicPr/>
+                  </pic:nvPicPr>
+                  <pic:blipFill>
+                    <a:blip r:embed="rId17"/>
+                    <a:stretch>
+                      <a:fillRect/>
+                    </a:stretch>
+                  </pic:blipFill>
+                  <pic:spPr>
+                    <a:xfrm>
+                      <a:off x="0" y="0"/>
+                      <a:ext cx="5760000" cy="4917116"/>
+                    </a:xfrm>
+                    <a:prstGeom prst="rect"/>
+                  </pic:spPr>
+                </pic:pic>
+              </a:graphicData>
+            </a:graphic>
+          </wp:inline>
+        </w:drawing>
+      </w:r>
+    </w:p>
+    <w:p>
+      <w:pPr>
+        <w:keepNext w:val="0"/>
+        <w:spacing w:before="120" w:after="80" w:line="240" w:lineRule="auto"/>
+        <w:jc w:val="left"/>
+      </w:pPr>
+      <w:r>
+        <w:rPr>
+          <w:b/>
+          <w:sz w:val="24"/>
+        </w:rPr>
+        <w:t xml:space="preserve">Figure </w:t>
+      </w:r>
+      <w:r>
+        <w:rPr>
+          <w:b/>
+          <w:sz w:val="24"/>
+        </w:rPr>
+        <w:fldChar w:fldCharType="begin"/>
+      </w:r>
+      <w:r>
+        <w:rPr>
+          <w:b/>
+          <w:sz w:val="24"/>
+        </w:rPr>
+        <w:instrText xml:space="preserve"> SEQ Figure \* ARABIC </w:instrText>
+      </w:r>
+      <w:r>
+        <w:rPr>
+          <w:b/>
+          <w:sz w:val="24"/>
+        </w:rPr>
+        <w:fldChar w:fldCharType="separate"/>
+      </w:r>
+      <w:r>
+        <w:rPr>
+          <w:b/>
+          <w:sz w:val="24"/>
+        </w:rPr>
+        <w:t>9</w:t>
+      </w:r>
+      <w:r>
+        <w:rPr>
+          <w:b/>
+          <w:sz w:val="24"/>
+        </w:rPr>
+        <w:fldChar w:fldCharType="end"/>
+      </w:r>
+      <w:r>
+        <w:rPr>
+          <w:b/>
+          <w:sz w:val="24"/>
+        </w:rPr>
+        <w:t xml:space="preserve">. </w:t>
+      </w:r>
+      <w:r>
+        <w:rPr>
+          <w:i/>
+          <w:sz w:val="24"/>
+        </w:rPr>
+        <w:t>Item-by-item correlations between SHAI-14 and CSS-12 items (Spearman ρ). * significant after FDR correction across the 168 pairs; ** also significant after Holm–Bonferroni correction.</w:t>
+      </w:r>
+    </w:p>
     <w:sectPr>
-      <w:footerReference w:type="default" r:id="rId18"/>
+      <w:footerReference w:type="default" r:id="rId19"/>
       <w:pgSz w:w="11906" w:h="16838"/>
       <w:pgMar w:top="1417" w:right="1417" w:bottom="1417" w:left="1701" w:header="720" w:footer="720" w:gutter="0"/>
       <w:cols w:space="720"/>

</xml_diff>

<commit_message>
Research: table of contents, questionnaire appendix, and defence presentation deck
Co-Authored-By: Claude Opus 5.5 <noreply@anthropic.com>
Claude-Session: https://claude.ai/code/session_0186tGPQJ67bKVgWZR7S3c4o
</commit_message>
<xml_diff>
--- a/research/output/Cyberchondria_Research_Baghdad.docx
+++ b/research/output/Cyberchondria_Research_Baghdad.docx
@@ -212,6 +212,1061 @@
         <w:pStyle w:val="Heading1"/>
       </w:pPr>
       <w:r>
+        <w:t>Table of Contents</w:t>
+      </w:r>
+    </w:p>
+    <w:p/>
+    <w:p>
+      <w:pPr>
+        <w:tabs>
+          <w:tab w:pos="8787" w:val="right" w:leader="dot"/>
+        </w:tabs>
+        <w:spacing w:line="276" w:lineRule="auto" w:after="100"/>
+        <w:ind w:left="0"/>
+      </w:pPr>
+      <w:r>
+        <w:fldChar w:fldCharType="begin"/>
+        <w:instrText xml:space="preserve">TOC \o "1-2" \h \z \u</w:instrText>
+        <w:fldChar w:fldCharType="separate"/>
+      </w:r>
+      <w:r>
+        <w:rPr>
+          <w:b/>
+          <w:sz w:val="26"/>
+        </w:rPr>
+        <w:t>Summary / Abstract</w:t>
+      </w:r>
+      <w:r>
+        <w:rPr>
+          <w:sz w:val="26"/>
+        </w:rPr>
+        <w:tab/>
+        <w:t>viii</w:t>
+      </w:r>
+    </w:p>
+    <w:p>
+      <w:pPr>
+        <w:tabs>
+          <w:tab w:pos="8787" w:val="right" w:leader="dot"/>
+        </w:tabs>
+        <w:spacing w:line="276" w:lineRule="auto" w:after="100"/>
+        <w:ind w:left="0"/>
+      </w:pPr>
+      <w:r>
+        <w:rPr>
+          <w:b/>
+          <w:sz w:val="26"/>
+        </w:rPr>
+        <w:t>1. Introduction</w:t>
+      </w:r>
+      <w:r>
+        <w:rPr>
+          <w:sz w:val="26"/>
+        </w:rPr>
+        <w:tab/>
+        <w:t>1</w:t>
+      </w:r>
+    </w:p>
+    <w:p>
+      <w:pPr>
+        <w:tabs>
+          <w:tab w:pos="8787" w:val="right" w:leader="dot"/>
+        </w:tabs>
+        <w:spacing w:line="276" w:lineRule="auto" w:after="60"/>
+        <w:ind w:left="454"/>
+      </w:pPr>
+      <w:r>
+        <w:rPr>
+          <w:b w:val="0"/>
+          <w:sz w:val="24"/>
+        </w:rPr>
+        <w:t>1.1 Background</w:t>
+      </w:r>
+      <w:r>
+        <w:rPr>
+          <w:sz w:val="24"/>
+        </w:rPr>
+        <w:tab/>
+        <w:t>1</w:t>
+      </w:r>
+    </w:p>
+    <w:p>
+      <w:pPr>
+        <w:tabs>
+          <w:tab w:pos="8787" w:val="right" w:leader="dot"/>
+        </w:tabs>
+        <w:spacing w:line="276" w:lineRule="auto" w:after="60"/>
+        <w:ind w:left="454"/>
+      </w:pPr>
+      <w:r>
+        <w:rPr>
+          <w:b w:val="0"/>
+          <w:sz w:val="24"/>
+        </w:rPr>
+        <w:t>1.2 Health anxiety</w:t>
+      </w:r>
+      <w:r>
+        <w:rPr>
+          <w:sz w:val="24"/>
+        </w:rPr>
+        <w:tab/>
+        <w:t>1</w:t>
+      </w:r>
+    </w:p>
+    <w:p>
+      <w:pPr>
+        <w:tabs>
+          <w:tab w:pos="8787" w:val="right" w:leader="dot"/>
+        </w:tabs>
+        <w:spacing w:line="276" w:lineRule="auto" w:after="60"/>
+        <w:ind w:left="454"/>
+      </w:pPr>
+      <w:r>
+        <w:rPr>
+          <w:b w:val="0"/>
+          <w:sz w:val="24"/>
+        </w:rPr>
+        <w:t>1.3 Cyberchondria</w:t>
+      </w:r>
+      <w:r>
+        <w:rPr>
+          <w:sz w:val="24"/>
+        </w:rPr>
+        <w:tab/>
+        <w:t>2</w:t>
+      </w:r>
+    </w:p>
+    <w:p>
+      <w:pPr>
+        <w:tabs>
+          <w:tab w:pos="8787" w:val="right" w:leader="dot"/>
+        </w:tabs>
+        <w:spacing w:line="276" w:lineRule="auto" w:after="60"/>
+        <w:ind w:left="454"/>
+      </w:pPr>
+      <w:r>
+        <w:rPr>
+          <w:b w:val="0"/>
+          <w:sz w:val="24"/>
+        </w:rPr>
+        <w:t>1.4 The relationship between health anxiety and cyberchondria</w:t>
+      </w:r>
+      <w:r>
+        <w:rPr>
+          <w:sz w:val="24"/>
+        </w:rPr>
+        <w:tab/>
+        <w:t>3</w:t>
+      </w:r>
+    </w:p>
+    <w:p>
+      <w:pPr>
+        <w:tabs>
+          <w:tab w:pos="8787" w:val="right" w:leader="dot"/>
+        </w:tabs>
+        <w:spacing w:line="276" w:lineRule="auto" w:after="60"/>
+        <w:ind w:left="454"/>
+      </w:pPr>
+      <w:r>
+        <w:rPr>
+          <w:b w:val="0"/>
+          <w:sz w:val="24"/>
+        </w:rPr>
+        <w:t>1.5 From search engines to AI chatbots</w:t>
+      </w:r>
+      <w:r>
+        <w:rPr>
+          <w:sz w:val="24"/>
+        </w:rPr>
+        <w:tab/>
+        <w:t>4</w:t>
+      </w:r>
+    </w:p>
+    <w:p>
+      <w:pPr>
+        <w:tabs>
+          <w:tab w:pos="8787" w:val="right" w:leader="dot"/>
+        </w:tabs>
+        <w:spacing w:line="276" w:lineRule="auto" w:after="60"/>
+        <w:ind w:left="454"/>
+      </w:pPr>
+      <w:r>
+        <w:rPr>
+          <w:b w:val="0"/>
+          <w:sz w:val="24"/>
+        </w:rPr>
+        <w:t>1.6 Online searching and the doctor–patient relationship</w:t>
+      </w:r>
+      <w:r>
+        <w:rPr>
+          <w:sz w:val="24"/>
+        </w:rPr>
+        <w:tab/>
+        <w:t>4</w:t>
+      </w:r>
+    </w:p>
+    <w:p>
+      <w:pPr>
+        <w:tabs>
+          <w:tab w:pos="8787" w:val="right" w:leader="dot"/>
+        </w:tabs>
+        <w:spacing w:line="276" w:lineRule="auto" w:after="60"/>
+        <w:ind w:left="454"/>
+      </w:pPr>
+      <w:r>
+        <w:rPr>
+          <w:b w:val="0"/>
+          <w:sz w:val="24"/>
+        </w:rPr>
+        <w:t>1.7 Rationale</w:t>
+      </w:r>
+      <w:r>
+        <w:rPr>
+          <w:sz w:val="24"/>
+        </w:rPr>
+        <w:tab/>
+        <w:t>5</w:t>
+      </w:r>
+    </w:p>
+    <w:p>
+      <w:pPr>
+        <w:tabs>
+          <w:tab w:pos="8787" w:val="right" w:leader="dot"/>
+        </w:tabs>
+        <w:spacing w:line="276" w:lineRule="auto" w:after="60"/>
+        <w:ind w:left="454"/>
+      </w:pPr>
+      <w:r>
+        <w:rPr>
+          <w:b w:val="0"/>
+          <w:sz w:val="24"/>
+        </w:rPr>
+        <w:t>1.8 Aim and objectives</w:t>
+      </w:r>
+      <w:r>
+        <w:rPr>
+          <w:sz w:val="24"/>
+        </w:rPr>
+        <w:tab/>
+        <w:t>5</w:t>
+      </w:r>
+    </w:p>
+    <w:p>
+      <w:pPr>
+        <w:tabs>
+          <w:tab w:pos="8787" w:val="right" w:leader="dot"/>
+        </w:tabs>
+        <w:spacing w:line="276" w:lineRule="auto" w:after="100"/>
+        <w:ind w:left="0"/>
+      </w:pPr>
+      <w:r>
+        <w:rPr>
+          <w:b/>
+          <w:sz w:val="26"/>
+        </w:rPr>
+        <w:t>2. Method</w:t>
+      </w:r>
+      <w:r>
+        <w:rPr>
+          <w:sz w:val="26"/>
+        </w:rPr>
+        <w:tab/>
+        <w:t>6</w:t>
+      </w:r>
+    </w:p>
+    <w:p>
+      <w:pPr>
+        <w:tabs>
+          <w:tab w:pos="8787" w:val="right" w:leader="dot"/>
+        </w:tabs>
+        <w:spacing w:line="276" w:lineRule="auto" w:after="60"/>
+        <w:ind w:left="454"/>
+      </w:pPr>
+      <w:r>
+        <w:rPr>
+          <w:b w:val="0"/>
+          <w:sz w:val="24"/>
+        </w:rPr>
+        <w:t>2.1 Study design and setting</w:t>
+      </w:r>
+      <w:r>
+        <w:rPr>
+          <w:sz w:val="24"/>
+        </w:rPr>
+        <w:tab/>
+        <w:t>6</w:t>
+      </w:r>
+    </w:p>
+    <w:p>
+      <w:pPr>
+        <w:tabs>
+          <w:tab w:pos="8787" w:val="right" w:leader="dot"/>
+        </w:tabs>
+        <w:spacing w:line="276" w:lineRule="auto" w:after="60"/>
+        <w:ind w:left="454"/>
+      </w:pPr>
+      <w:r>
+        <w:rPr>
+          <w:b w:val="0"/>
+          <w:sz w:val="24"/>
+        </w:rPr>
+        <w:t>2.2 Participants and sampling</w:t>
+      </w:r>
+      <w:r>
+        <w:rPr>
+          <w:sz w:val="24"/>
+        </w:rPr>
+        <w:tab/>
+        <w:t>6</w:t>
+      </w:r>
+    </w:p>
+    <w:p>
+      <w:pPr>
+        <w:tabs>
+          <w:tab w:pos="8787" w:val="right" w:leader="dot"/>
+        </w:tabs>
+        <w:spacing w:line="276" w:lineRule="auto" w:after="60"/>
+        <w:ind w:left="454"/>
+      </w:pPr>
+      <w:r>
+        <w:rPr>
+          <w:b w:val="0"/>
+          <w:sz w:val="24"/>
+        </w:rPr>
+        <w:t>2.3 Sample size</w:t>
+      </w:r>
+      <w:r>
+        <w:rPr>
+          <w:sz w:val="24"/>
+        </w:rPr>
+        <w:tab/>
+        <w:t>7</w:t>
+      </w:r>
+    </w:p>
+    <w:p>
+      <w:pPr>
+        <w:tabs>
+          <w:tab w:pos="8787" w:val="right" w:leader="dot"/>
+        </w:tabs>
+        <w:spacing w:line="276" w:lineRule="auto" w:after="60"/>
+        <w:ind w:left="454"/>
+      </w:pPr>
+      <w:r>
+        <w:rPr>
+          <w:b w:val="0"/>
+          <w:sz w:val="24"/>
+        </w:rPr>
+        <w:t>2.4 Data collection instrument</w:t>
+      </w:r>
+      <w:r>
+        <w:rPr>
+          <w:sz w:val="24"/>
+        </w:rPr>
+        <w:tab/>
+        <w:t>7</w:t>
+      </w:r>
+    </w:p>
+    <w:p>
+      <w:pPr>
+        <w:tabs>
+          <w:tab w:pos="8787" w:val="right" w:leader="dot"/>
+        </w:tabs>
+        <w:spacing w:line="276" w:lineRule="auto" w:after="60"/>
+        <w:ind w:left="454"/>
+      </w:pPr>
+      <w:r>
+        <w:rPr>
+          <w:b w:val="0"/>
+          <w:sz w:val="24"/>
+        </w:rPr>
+        <w:t>2.5 Variables and operational definitions</w:t>
+      </w:r>
+      <w:r>
+        <w:rPr>
+          <w:sz w:val="24"/>
+        </w:rPr>
+        <w:tab/>
+        <w:t>9</w:t>
+      </w:r>
+    </w:p>
+    <w:p>
+      <w:pPr>
+        <w:tabs>
+          <w:tab w:pos="8787" w:val="right" w:leader="dot"/>
+        </w:tabs>
+        <w:spacing w:line="276" w:lineRule="auto" w:after="60"/>
+        <w:ind w:left="454"/>
+      </w:pPr>
+      <w:r>
+        <w:rPr>
+          <w:b w:val="0"/>
+          <w:sz w:val="24"/>
+        </w:rPr>
+        <w:t>2.6 Statistical analysis</w:t>
+      </w:r>
+      <w:r>
+        <w:rPr>
+          <w:sz w:val="24"/>
+        </w:rPr>
+        <w:tab/>
+        <w:t>9</w:t>
+      </w:r>
+    </w:p>
+    <w:p>
+      <w:pPr>
+        <w:tabs>
+          <w:tab w:pos="8787" w:val="right" w:leader="dot"/>
+        </w:tabs>
+        <w:spacing w:line="276" w:lineRule="auto" w:after="60"/>
+        <w:ind w:left="454"/>
+      </w:pPr>
+      <w:r>
+        <w:rPr>
+          <w:b w:val="0"/>
+          <w:sz w:val="24"/>
+        </w:rPr>
+        <w:t>2.7 Ethical considerations</w:t>
+      </w:r>
+      <w:r>
+        <w:rPr>
+          <w:sz w:val="24"/>
+        </w:rPr>
+        <w:tab/>
+        <w:t>11</w:t>
+      </w:r>
+    </w:p>
+    <w:p>
+      <w:pPr>
+        <w:tabs>
+          <w:tab w:pos="8787" w:val="right" w:leader="dot"/>
+        </w:tabs>
+        <w:spacing w:line="276" w:lineRule="auto" w:after="100"/>
+        <w:ind w:left="0"/>
+      </w:pPr>
+      <w:r>
+        <w:rPr>
+          <w:b/>
+          <w:sz w:val="26"/>
+        </w:rPr>
+        <w:t>3. Results</w:t>
+      </w:r>
+      <w:r>
+        <w:rPr>
+          <w:sz w:val="26"/>
+        </w:rPr>
+        <w:tab/>
+        <w:t>12</w:t>
+      </w:r>
+    </w:p>
+    <w:p>
+      <w:pPr>
+        <w:tabs>
+          <w:tab w:pos="8787" w:val="right" w:leader="dot"/>
+        </w:tabs>
+        <w:spacing w:line="276" w:lineRule="auto" w:after="60"/>
+        <w:ind w:left="454"/>
+      </w:pPr>
+      <w:r>
+        <w:rPr>
+          <w:b w:val="0"/>
+          <w:sz w:val="24"/>
+        </w:rPr>
+        <w:t>3.1 Characteristics of participants</w:t>
+      </w:r>
+      <w:r>
+        <w:rPr>
+          <w:sz w:val="24"/>
+        </w:rPr>
+        <w:tab/>
+        <w:t>12</w:t>
+      </w:r>
+    </w:p>
+    <w:p>
+      <w:pPr>
+        <w:tabs>
+          <w:tab w:pos="8787" w:val="right" w:leader="dot"/>
+        </w:tabs>
+        <w:spacing w:line="276" w:lineRule="auto" w:after="60"/>
+        <w:ind w:left="454"/>
+      </w:pPr>
+      <w:r>
+        <w:rPr>
+          <w:b w:val="0"/>
+          <w:sz w:val="24"/>
+        </w:rPr>
+        <w:t>3.2 Patterns of online health information seeking</w:t>
+      </w:r>
+      <w:r>
+        <w:rPr>
+          <w:sz w:val="24"/>
+        </w:rPr>
+        <w:tab/>
+        <w:t>13</w:t>
+      </w:r>
+    </w:p>
+    <w:p>
+      <w:pPr>
+        <w:tabs>
+          <w:tab w:pos="8787" w:val="right" w:leader="dot"/>
+        </w:tabs>
+        <w:spacing w:line="276" w:lineRule="auto" w:after="60"/>
+        <w:ind w:left="454"/>
+      </w:pPr>
+      <w:r>
+        <w:rPr>
+          <w:b w:val="0"/>
+          <w:sz w:val="24"/>
+        </w:rPr>
+        <w:t>3.3 Pre-consultation behaviour and the doctor–patient relationship</w:t>
+      </w:r>
+      <w:r>
+        <w:rPr>
+          <w:sz w:val="24"/>
+        </w:rPr>
+        <w:tab/>
+        <w:t>14</w:t>
+      </w:r>
+    </w:p>
+    <w:p>
+      <w:pPr>
+        <w:tabs>
+          <w:tab w:pos="8787" w:val="right" w:leader="dot"/>
+        </w:tabs>
+        <w:spacing w:line="276" w:lineRule="auto" w:after="60"/>
+        <w:ind w:left="454"/>
+      </w:pPr>
+      <w:r>
+        <w:rPr>
+          <w:b w:val="0"/>
+          <w:sz w:val="24"/>
+        </w:rPr>
+        <w:t>3.4 Levels of health anxiety and cyberchondria, and psychometric properties</w:t>
+      </w:r>
+      <w:r>
+        <w:rPr>
+          <w:sz w:val="24"/>
+        </w:rPr>
+        <w:tab/>
+        <w:t>15</w:t>
+      </w:r>
+    </w:p>
+    <w:p>
+      <w:pPr>
+        <w:tabs>
+          <w:tab w:pos="8787" w:val="right" w:leader="dot"/>
+        </w:tabs>
+        <w:spacing w:line="276" w:lineRule="auto" w:after="60"/>
+        <w:ind w:left="454"/>
+      </w:pPr>
+      <w:r>
+        <w:rPr>
+          <w:b w:val="0"/>
+          <w:sz w:val="24"/>
+        </w:rPr>
+        <w:t>3.5 Association between health anxiety and cyberchondria</w:t>
+      </w:r>
+      <w:r>
+        <w:rPr>
+          <w:sz w:val="24"/>
+        </w:rPr>
+        <w:tab/>
+        <w:t>16</w:t>
+      </w:r>
+    </w:p>
+    <w:p>
+      <w:pPr>
+        <w:tabs>
+          <w:tab w:pos="8787" w:val="right" w:leader="dot"/>
+        </w:tabs>
+        <w:spacing w:line="276" w:lineRule="auto" w:after="60"/>
+        <w:ind w:left="454"/>
+      </w:pPr>
+      <w:r>
+        <w:rPr>
+          <w:b w:val="0"/>
+          <w:sz w:val="24"/>
+        </w:rPr>
+        <w:t>3.6 Factors associated with health anxiety and cyberchondria (bivariate analysis)</w:t>
+      </w:r>
+      <w:r>
+        <w:rPr>
+          <w:sz w:val="24"/>
+        </w:rPr>
+        <w:tab/>
+        <w:t>19</w:t>
+      </w:r>
+    </w:p>
+    <w:p>
+      <w:pPr>
+        <w:tabs>
+          <w:tab w:pos="8787" w:val="right" w:leader="dot"/>
+        </w:tabs>
+        <w:spacing w:line="276" w:lineRule="auto" w:after="60"/>
+        <w:ind w:left="454"/>
+      </w:pPr>
+      <w:r>
+        <w:rPr>
+          <w:b w:val="0"/>
+          <w:sz w:val="24"/>
+        </w:rPr>
+        <w:t>3.7 Independent predictors (multivariable analysis)</w:t>
+      </w:r>
+      <w:r>
+        <w:rPr>
+          <w:sz w:val="24"/>
+        </w:rPr>
+        <w:tab/>
+        <w:t>23</w:t>
+      </w:r>
+    </w:p>
+    <w:p>
+      <w:pPr>
+        <w:tabs>
+          <w:tab w:pos="8787" w:val="right" w:leader="dot"/>
+        </w:tabs>
+        <w:spacing w:line="276" w:lineRule="auto" w:after="60"/>
+        <w:ind w:left="454"/>
+      </w:pPr>
+      <w:r>
+        <w:rPr>
+          <w:b w:val="0"/>
+          <w:sz w:val="24"/>
+        </w:rPr>
+        <w:t>3.8 Health anxiety, cyberchondria and pre-consultation behaviour</w:t>
+      </w:r>
+      <w:r>
+        <w:rPr>
+          <w:sz w:val="24"/>
+        </w:rPr>
+        <w:tab/>
+        <w:t>25</w:t>
+      </w:r>
+    </w:p>
+    <w:p>
+      <w:pPr>
+        <w:tabs>
+          <w:tab w:pos="8787" w:val="right" w:leader="dot"/>
+        </w:tabs>
+        <w:spacing w:line="276" w:lineRule="auto" w:after="60"/>
+        <w:ind w:left="454"/>
+      </w:pPr>
+      <w:r>
+        <w:rPr>
+          <w:b w:val="0"/>
+          <w:sz w:val="24"/>
+        </w:rPr>
+        <w:t>3.9 Pathways: mediation and moderation</w:t>
+      </w:r>
+      <w:r>
+        <w:rPr>
+          <w:sz w:val="24"/>
+        </w:rPr>
+        <w:tab/>
+        <w:t>26</w:t>
+      </w:r>
+    </w:p>
+    <w:p>
+      <w:pPr>
+        <w:tabs>
+          <w:tab w:pos="8787" w:val="right" w:leader="dot"/>
+        </w:tabs>
+        <w:spacing w:line="276" w:lineRule="auto" w:after="60"/>
+        <w:ind w:left="454"/>
+      </w:pPr>
+      <w:r>
+        <w:rPr>
+          <w:b w:val="0"/>
+          <w:sz w:val="24"/>
+        </w:rPr>
+        <w:t>3.10 Sensitivity analyses</w:t>
+      </w:r>
+      <w:r>
+        <w:rPr>
+          <w:sz w:val="24"/>
+        </w:rPr>
+        <w:tab/>
+        <w:t>28</w:t>
+      </w:r>
+    </w:p>
+    <w:p>
+      <w:pPr>
+        <w:tabs>
+          <w:tab w:pos="8787" w:val="right" w:leader="dot"/>
+        </w:tabs>
+        <w:spacing w:line="276" w:lineRule="auto" w:after="100"/>
+        <w:ind w:left="0"/>
+      </w:pPr>
+      <w:r>
+        <w:rPr>
+          <w:b/>
+          <w:sz w:val="26"/>
+        </w:rPr>
+        <w:t>4. Discussion</w:t>
+      </w:r>
+      <w:r>
+        <w:rPr>
+          <w:sz w:val="26"/>
+        </w:rPr>
+        <w:tab/>
+        <w:t>29</w:t>
+      </w:r>
+    </w:p>
+    <w:p>
+      <w:pPr>
+        <w:tabs>
+          <w:tab w:pos="8787" w:val="right" w:leader="dot"/>
+        </w:tabs>
+        <w:spacing w:line="276" w:lineRule="auto" w:after="60"/>
+        <w:ind w:left="454"/>
+      </w:pPr>
+      <w:r>
+        <w:rPr>
+          <w:b w:val="0"/>
+          <w:sz w:val="24"/>
+        </w:rPr>
+        <w:t>4.1 Principal findings</w:t>
+      </w:r>
+      <w:r>
+        <w:rPr>
+          <w:sz w:val="24"/>
+        </w:rPr>
+        <w:tab/>
+        <w:t>29</w:t>
+      </w:r>
+    </w:p>
+    <w:p>
+      <w:pPr>
+        <w:tabs>
+          <w:tab w:pos="8787" w:val="right" w:leader="dot"/>
+        </w:tabs>
+        <w:spacing w:line="276" w:lineRule="auto" w:after="60"/>
+        <w:ind w:left="454"/>
+      </w:pPr>
+      <w:r>
+        <w:rPr>
+          <w:b w:val="0"/>
+          <w:sz w:val="24"/>
+        </w:rPr>
+        <w:t>4.2 Health anxiety and cyberchondria</w:t>
+      </w:r>
+      <w:r>
+        <w:rPr>
+          <w:sz w:val="24"/>
+        </w:rPr>
+        <w:tab/>
+        <w:t>29</w:t>
+      </w:r>
+    </w:p>
+    <w:p>
+      <w:pPr>
+        <w:tabs>
+          <w:tab w:pos="8787" w:val="right" w:leader="dot"/>
+        </w:tabs>
+        <w:spacing w:line="276" w:lineRule="auto" w:after="60"/>
+        <w:ind w:left="454"/>
+      </w:pPr>
+      <w:r>
+        <w:rPr>
+          <w:b w:val="0"/>
+          <w:sz w:val="24"/>
+        </w:rPr>
+        <w:t>4.3 Do health anxiety and cyberchondria fuel each other?</w:t>
+      </w:r>
+      <w:r>
+        <w:rPr>
+          <w:sz w:val="24"/>
+        </w:rPr>
+        <w:tab/>
+        <w:t>30</w:t>
+      </w:r>
+    </w:p>
+    <w:p>
+      <w:pPr>
+        <w:tabs>
+          <w:tab w:pos="8787" w:val="right" w:leader="dot"/>
+        </w:tabs>
+        <w:spacing w:line="276" w:lineRule="auto" w:after="60"/>
+        <w:ind w:left="454"/>
+      </w:pPr>
+      <w:r>
+        <w:rPr>
+          <w:b w:val="0"/>
+          <w:sz w:val="24"/>
+        </w:rPr>
+        <w:t>4.4 The role of AI chatbots</w:t>
+      </w:r>
+      <w:r>
+        <w:rPr>
+          <w:sz w:val="24"/>
+        </w:rPr>
+        <w:tab/>
+        <w:t>31</w:t>
+      </w:r>
+    </w:p>
+    <w:p>
+      <w:pPr>
+        <w:tabs>
+          <w:tab w:pos="8787" w:val="right" w:leader="dot"/>
+        </w:tabs>
+        <w:spacing w:line="276" w:lineRule="auto" w:after="60"/>
+        <w:ind w:left="454"/>
+      </w:pPr>
+      <w:r>
+        <w:rPr>
+          <w:b w:val="0"/>
+          <w:sz w:val="24"/>
+        </w:rPr>
+        <w:t>4.5 Pre-consultation behaviour and the doctor–patient relationship</w:t>
+      </w:r>
+      <w:r>
+        <w:rPr>
+          <w:sz w:val="24"/>
+        </w:rPr>
+        <w:tab/>
+        <w:t>32</w:t>
+      </w:r>
+    </w:p>
+    <w:p>
+      <w:pPr>
+        <w:tabs>
+          <w:tab w:pos="8787" w:val="right" w:leader="dot"/>
+        </w:tabs>
+        <w:spacing w:line="276" w:lineRule="auto" w:after="60"/>
+        <w:ind w:left="454"/>
+      </w:pPr>
+      <w:r>
+        <w:rPr>
+          <w:b w:val="0"/>
+          <w:sz w:val="24"/>
+        </w:rPr>
+        <w:t>4.6 Medical and health-science students</w:t>
+      </w:r>
+      <w:r>
+        <w:rPr>
+          <w:sz w:val="24"/>
+        </w:rPr>
+        <w:tab/>
+        <w:t>33</w:t>
+      </w:r>
+    </w:p>
+    <w:p>
+      <w:pPr>
+        <w:tabs>
+          <w:tab w:pos="8787" w:val="right" w:leader="dot"/>
+        </w:tabs>
+        <w:spacing w:line="276" w:lineRule="auto" w:after="60"/>
+        <w:ind w:left="454"/>
+      </w:pPr>
+      <w:r>
+        <w:rPr>
+          <w:b w:val="0"/>
+          <w:sz w:val="24"/>
+        </w:rPr>
+        <w:t>4.7 Comparison with regional studies</w:t>
+      </w:r>
+      <w:r>
+        <w:rPr>
+          <w:sz w:val="24"/>
+        </w:rPr>
+        <w:tab/>
+        <w:t>33</w:t>
+      </w:r>
+    </w:p>
+    <w:p>
+      <w:pPr>
+        <w:tabs>
+          <w:tab w:pos="8787" w:val="right" w:leader="dot"/>
+        </w:tabs>
+        <w:spacing w:line="276" w:lineRule="auto" w:after="60"/>
+        <w:ind w:left="454"/>
+      </w:pPr>
+      <w:r>
+        <w:rPr>
+          <w:b w:val="0"/>
+          <w:sz w:val="24"/>
+        </w:rPr>
+        <w:t>4.8 Strengths and limitations</w:t>
+      </w:r>
+      <w:r>
+        <w:rPr>
+          <w:sz w:val="24"/>
+        </w:rPr>
+        <w:tab/>
+        <w:t>33</w:t>
+      </w:r>
+    </w:p>
+    <w:p>
+      <w:pPr>
+        <w:tabs>
+          <w:tab w:pos="8787" w:val="right" w:leader="dot"/>
+        </w:tabs>
+        <w:spacing w:line="276" w:lineRule="auto" w:after="100"/>
+        <w:ind w:left="0"/>
+      </w:pPr>
+      <w:r>
+        <w:rPr>
+          <w:b/>
+          <w:sz w:val="26"/>
+        </w:rPr>
+        <w:t>5. Conclusions and Recommendations</w:t>
+      </w:r>
+      <w:r>
+        <w:rPr>
+          <w:sz w:val="26"/>
+        </w:rPr>
+        <w:tab/>
+        <w:t>35</w:t>
+      </w:r>
+    </w:p>
+    <w:p>
+      <w:pPr>
+        <w:tabs>
+          <w:tab w:pos="8787" w:val="right" w:leader="dot"/>
+        </w:tabs>
+        <w:spacing w:line="276" w:lineRule="auto" w:after="60"/>
+        <w:ind w:left="454"/>
+      </w:pPr>
+      <w:r>
+        <w:rPr>
+          <w:b w:val="0"/>
+          <w:sz w:val="24"/>
+        </w:rPr>
+        <w:t>5.1 Conclusions</w:t>
+      </w:r>
+      <w:r>
+        <w:rPr>
+          <w:sz w:val="24"/>
+        </w:rPr>
+        <w:tab/>
+        <w:t>35</w:t>
+      </w:r>
+    </w:p>
+    <w:p>
+      <w:pPr>
+        <w:tabs>
+          <w:tab w:pos="8787" w:val="right" w:leader="dot"/>
+        </w:tabs>
+        <w:spacing w:line="276" w:lineRule="auto" w:after="60"/>
+        <w:ind w:left="454"/>
+      </w:pPr>
+      <w:r>
+        <w:rPr>
+          <w:b w:val="0"/>
+          <w:sz w:val="24"/>
+        </w:rPr>
+        <w:t>5.2 Recommendations</w:t>
+      </w:r>
+      <w:r>
+        <w:rPr>
+          <w:sz w:val="24"/>
+        </w:rPr>
+        <w:tab/>
+        <w:t>36</w:t>
+      </w:r>
+    </w:p>
+    <w:p>
+      <w:pPr>
+        <w:tabs>
+          <w:tab w:pos="8787" w:val="right" w:leader="dot"/>
+        </w:tabs>
+        <w:spacing w:line="276" w:lineRule="auto" w:after="100"/>
+        <w:ind w:left="0"/>
+      </w:pPr>
+      <w:r>
+        <w:rPr>
+          <w:b/>
+          <w:sz w:val="26"/>
+        </w:rPr>
+        <w:t>6. References</w:t>
+      </w:r>
+      <w:r>
+        <w:rPr>
+          <w:sz w:val="26"/>
+        </w:rPr>
+        <w:tab/>
+        <w:t>37</w:t>
+      </w:r>
+    </w:p>
+    <w:p>
+      <w:pPr>
+        <w:tabs>
+          <w:tab w:pos="8787" w:val="right" w:leader="dot"/>
+        </w:tabs>
+        <w:spacing w:line="276" w:lineRule="auto" w:after="100"/>
+        <w:ind w:left="0"/>
+      </w:pPr>
+      <w:r>
+        <w:rPr>
+          <w:b/>
+          <w:sz w:val="26"/>
+        </w:rPr>
+        <w:t>Appendices</w:t>
+      </w:r>
+      <w:r>
+        <w:rPr>
+          <w:sz w:val="26"/>
+        </w:rPr>
+        <w:tab/>
+        <w:t>42</w:t>
+      </w:r>
+    </w:p>
+    <w:p>
+      <w:pPr>
+        <w:tabs>
+          <w:tab w:pos="8787" w:val="right" w:leader="dot"/>
+        </w:tabs>
+        <w:spacing w:line="276" w:lineRule="auto" w:after="60"/>
+        <w:ind w:left="454"/>
+      </w:pPr>
+      <w:r>
+        <w:rPr>
+          <w:b w:val="0"/>
+          <w:sz w:val="24"/>
+        </w:rPr>
+        <w:t>Appendix A. Item-by-item correlations between the SHAI-14 and CSS-12</w:t>
+      </w:r>
+      <w:r>
+        <w:rPr>
+          <w:sz w:val="24"/>
+        </w:rPr>
+        <w:tab/>
+        <w:t>42</w:t>
+      </w:r>
+    </w:p>
+    <w:p>
+      <w:pPr>
+        <w:tabs>
+          <w:tab w:pos="8787" w:val="right" w:leader="dot"/>
+        </w:tabs>
+        <w:spacing w:line="276" w:lineRule="auto" w:after="60"/>
+        <w:ind w:left="454"/>
+      </w:pPr>
+      <w:r>
+        <w:rPr>
+          <w:b w:val="0"/>
+          <w:sz w:val="24"/>
+        </w:rPr>
+        <w:t>Appendix B. Study questionnaire</w:t>
+      </w:r>
+      <w:r>
+        <w:rPr>
+          <w:sz w:val="24"/>
+        </w:rPr>
+        <w:tab/>
+        <w:t>43</w:t>
+        <w:fldChar w:fldCharType="end"/>
+      </w:r>
+    </w:p>
+    <w:p>
+      <w:r>
+        <w:br w:type="page"/>
+      </w:r>
+    </w:p>
+    <w:p>
+      <w:pPr>
+        <w:pStyle w:val="Heading1"/>
+      </w:pPr>
+      <w:r>
         <w:t>List of Abbreviations</w:t>
       </w:r>
     </w:p>
@@ -1865,7 +2920,7 @@
     <w:p>
       <w:pPr>
         <w:sectPr>
-          <w:footerReference w:type="default" r:id="rId18"/>
+          <w:footerReference w:type="default" r:id="rId38"/>
           <w:pgSz w:w="11906" w:h="16838"/>
           <w:pgMar w:top="1417" w:right="1417" w:bottom="1417" w:left="1701" w:header="720" w:footer="720" w:gutter="0"/>
           <w:cols w:space="720"/>
@@ -24452,7 +25507,15 @@
         <w:pStyle w:val="Heading1"/>
       </w:pPr>
       <w:r>
-        <w:t>Appendix</w:t>
+        <w:t>Appendices</w:t>
+      </w:r>
+    </w:p>
+    <w:p>
+      <w:pPr>
+        <w:pStyle w:val="Heading2"/>
+      </w:pPr>
+      <w:r>
+        <w:t>Appendix A. Item-by-item correlations between the SHAI-14 and CSS-12</w:t>
       </w:r>
     </w:p>
     <w:p>
@@ -24570,8 +25633,833 @@
         <w:t>Item-by-item correlations between SHAI-14 and CSS-12 items (Spearman ρ). * significant after FDR correction across the 168 pairs; ** also significant after Holm–Bonferroni correction.</w:t>
       </w:r>
     </w:p>
+    <w:p>
+      <w:r>
+        <w:br w:type="page"/>
+      </w:r>
+    </w:p>
+    <w:p>
+      <w:pPr>
+        <w:pStyle w:val="Heading2"/>
+      </w:pPr>
+      <w:r>
+        <w:t>Appendix B. Study questionnaire</w:t>
+      </w:r>
+    </w:p>
+    <w:p>
+      <w:pPr>
+        <w:spacing w:after="120"/>
+        <w:jc w:val="both"/>
+      </w:pPr>
+      <w:r>
+        <w:rPr>
+          <w:rFonts w:ascii="Times New Roman" w:hAnsi="Times New Roman"/>
+        </w:rPr>
+        <w:t>The bilingual (English–Arabic) questionnaire as administered through Google Forms is reproduced below (41 questions).</w:t>
+      </w:r>
+    </w:p>
+    <w:p>
+      <w:pPr>
+        <w:spacing w:after="80" w:line="240" w:lineRule="auto"/>
+        <w:jc w:val="center"/>
+      </w:pPr>
+      <w:r>
+        <w:drawing>
+          <wp:inline xmlns:a="http://schemas.openxmlformats.org/drawingml/2006/main" xmlns:pic="http://schemas.openxmlformats.org/drawingml/2006/picture">
+            <wp:extent cx="4500000" cy="5746506"/>
+            <wp:docPr id="10" name="Picture 10"/>
+            <wp:cNvGraphicFramePr>
+              <a:graphicFrameLocks noChangeAspect="1"/>
+            </wp:cNvGraphicFramePr>
+            <a:graphic>
+              <a:graphicData uri="http://schemas.openxmlformats.org/drawingml/2006/picture">
+                <pic:pic>
+                  <pic:nvPicPr>
+                    <pic:cNvPr id="0" name="c-01.png"/>
+                    <pic:cNvPicPr/>
+                  </pic:nvPicPr>
+                  <pic:blipFill>
+                    <a:blip r:embed="rId18"/>
+                    <a:stretch>
+                      <a:fillRect/>
+                    </a:stretch>
+                  </pic:blipFill>
+                  <pic:spPr>
+                    <a:xfrm>
+                      <a:off x="0" y="0"/>
+                      <a:ext cx="4500000" cy="5746506"/>
+                    </a:xfrm>
+                    <a:prstGeom prst="rect"/>
+                  </pic:spPr>
+                </pic:pic>
+              </a:graphicData>
+            </a:graphic>
+          </wp:inline>
+        </w:drawing>
+      </w:r>
+    </w:p>
+    <w:p>
+      <w:pPr>
+        <w:spacing w:after="80" w:line="240" w:lineRule="auto"/>
+        <w:jc w:val="center"/>
+      </w:pPr>
+      <w:r>
+        <w:drawing>
+          <wp:inline xmlns:a="http://schemas.openxmlformats.org/drawingml/2006/main" xmlns:pic="http://schemas.openxmlformats.org/drawingml/2006/picture">
+            <wp:extent cx="1575000" cy="3611842"/>
+            <wp:docPr id="11" name="Picture 11"/>
+            <wp:cNvGraphicFramePr>
+              <a:graphicFrameLocks noChangeAspect="1"/>
+            </wp:cNvGraphicFramePr>
+            <a:graphic>
+              <a:graphicData uri="http://schemas.openxmlformats.org/drawingml/2006/picture">
+                <pic:pic>
+                  <pic:nvPicPr>
+                    <pic:cNvPr id="0" name="c-02.png"/>
+                    <pic:cNvPicPr/>
+                  </pic:nvPicPr>
+                  <pic:blipFill>
+                    <a:blip r:embed="rId19"/>
+                    <a:stretch>
+                      <a:fillRect/>
+                    </a:stretch>
+                  </pic:blipFill>
+                  <pic:spPr>
+                    <a:xfrm>
+                      <a:off x="0" y="0"/>
+                      <a:ext cx="1575000" cy="3611842"/>
+                    </a:xfrm>
+                    <a:prstGeom prst="rect"/>
+                  </pic:spPr>
+                </pic:pic>
+              </a:graphicData>
+            </a:graphic>
+          </wp:inline>
+        </w:drawing>
+      </w:r>
+    </w:p>
+    <w:p>
+      <w:pPr>
+        <w:spacing w:after="80" w:line="240" w:lineRule="auto"/>
+        <w:jc w:val="center"/>
+      </w:pPr>
+      <w:r>
+        <w:drawing>
+          <wp:inline xmlns:a="http://schemas.openxmlformats.org/drawingml/2006/main" xmlns:pic="http://schemas.openxmlformats.org/drawingml/2006/picture">
+            <wp:extent cx="4363815" cy="5873683"/>
+            <wp:docPr id="12" name="Picture 12"/>
+            <wp:cNvGraphicFramePr>
+              <a:graphicFrameLocks noChangeAspect="1"/>
+            </wp:cNvGraphicFramePr>
+            <a:graphic>
+              <a:graphicData uri="http://schemas.openxmlformats.org/drawingml/2006/picture">
+                <pic:pic>
+                  <pic:nvPicPr>
+                    <pic:cNvPr id="0" name="c-03.png"/>
+                    <pic:cNvPicPr/>
+                  </pic:nvPicPr>
+                  <pic:blipFill>
+                    <a:blip r:embed="rId20"/>
+                    <a:stretch>
+                      <a:fillRect/>
+                    </a:stretch>
+                  </pic:blipFill>
+                  <pic:spPr>
+                    <a:xfrm>
+                      <a:off x="0" y="0"/>
+                      <a:ext cx="4363815" cy="5873683"/>
+                    </a:xfrm>
+                    <a:prstGeom prst="rect"/>
+                  </pic:spPr>
+                </pic:pic>
+              </a:graphicData>
+            </a:graphic>
+          </wp:inline>
+        </w:drawing>
+      </w:r>
+    </w:p>
+    <w:p>
+      <w:pPr>
+        <w:spacing w:after="80" w:line="240" w:lineRule="auto"/>
+        <w:jc w:val="center"/>
+      </w:pPr>
+      <w:r>
+        <w:drawing>
+          <wp:inline xmlns:a="http://schemas.openxmlformats.org/drawingml/2006/main" xmlns:pic="http://schemas.openxmlformats.org/drawingml/2006/picture">
+            <wp:extent cx="4440789" cy="4588815"/>
+            <wp:docPr id="13" name="Picture 13"/>
+            <wp:cNvGraphicFramePr>
+              <a:graphicFrameLocks noChangeAspect="1"/>
+            </wp:cNvGraphicFramePr>
+            <a:graphic>
+              <a:graphicData uri="http://schemas.openxmlformats.org/drawingml/2006/picture">
+                <pic:pic>
+                  <pic:nvPicPr>
+                    <pic:cNvPr id="0" name="c-04.png"/>
+                    <pic:cNvPicPr/>
+                  </pic:nvPicPr>
+                  <pic:blipFill>
+                    <a:blip r:embed="rId21"/>
+                    <a:stretch>
+                      <a:fillRect/>
+                    </a:stretch>
+                  </pic:blipFill>
+                  <pic:spPr>
+                    <a:xfrm>
+                      <a:off x="0" y="0"/>
+                      <a:ext cx="4440789" cy="4588815"/>
+                    </a:xfrm>
+                    <a:prstGeom prst="rect"/>
+                  </pic:spPr>
+                </pic:pic>
+              </a:graphicData>
+            </a:graphic>
+          </wp:inline>
+        </w:drawing>
+      </w:r>
+    </w:p>
+    <w:p>
+      <w:pPr>
+        <w:spacing w:after="80" w:line="240" w:lineRule="auto"/>
+        <w:jc w:val="center"/>
+      </w:pPr>
+      <w:r>
+        <w:drawing>
+          <wp:inline xmlns:a="http://schemas.openxmlformats.org/drawingml/2006/main" xmlns:pic="http://schemas.openxmlformats.org/drawingml/2006/picture">
+            <wp:extent cx="4440789" cy="5198684"/>
+            <wp:docPr id="14" name="Picture 14"/>
+            <wp:cNvGraphicFramePr>
+              <a:graphicFrameLocks noChangeAspect="1"/>
+            </wp:cNvGraphicFramePr>
+            <a:graphic>
+              <a:graphicData uri="http://schemas.openxmlformats.org/drawingml/2006/picture">
+                <pic:pic>
+                  <pic:nvPicPr>
+                    <pic:cNvPr id="0" name="c-05.png"/>
+                    <pic:cNvPicPr/>
+                  </pic:nvPicPr>
+                  <pic:blipFill>
+                    <a:blip r:embed="rId22"/>
+                    <a:stretch>
+                      <a:fillRect/>
+                    </a:stretch>
+                  </pic:blipFill>
+                  <pic:spPr>
+                    <a:xfrm>
+                      <a:off x="0" y="0"/>
+                      <a:ext cx="4440789" cy="5198684"/>
+                    </a:xfrm>
+                    <a:prstGeom prst="rect"/>
+                  </pic:spPr>
+                </pic:pic>
+              </a:graphicData>
+            </a:graphic>
+          </wp:inline>
+        </w:drawing>
+      </w:r>
+    </w:p>
+    <w:p>
+      <w:pPr>
+        <w:spacing w:after="80" w:line="240" w:lineRule="auto"/>
+        <w:jc w:val="center"/>
+      </w:pPr>
+      <w:r>
+        <w:drawing>
+          <wp:inline xmlns:a="http://schemas.openxmlformats.org/drawingml/2006/main" xmlns:pic="http://schemas.openxmlformats.org/drawingml/2006/picture">
+            <wp:extent cx="4434868" cy="4440789"/>
+            <wp:docPr id="15" name="Picture 15"/>
+            <wp:cNvGraphicFramePr>
+              <a:graphicFrameLocks noChangeAspect="1"/>
+            </wp:cNvGraphicFramePr>
+            <a:graphic>
+              <a:graphicData uri="http://schemas.openxmlformats.org/drawingml/2006/picture">
+                <pic:pic>
+                  <pic:nvPicPr>
+                    <pic:cNvPr id="0" name="c-06.png"/>
+                    <pic:cNvPicPr/>
+                  </pic:nvPicPr>
+                  <pic:blipFill>
+                    <a:blip r:embed="rId23"/>
+                    <a:stretch>
+                      <a:fillRect/>
+                    </a:stretch>
+                  </pic:blipFill>
+                  <pic:spPr>
+                    <a:xfrm>
+                      <a:off x="0" y="0"/>
+                      <a:ext cx="4434868" cy="4440789"/>
+                    </a:xfrm>
+                    <a:prstGeom prst="rect"/>
+                  </pic:spPr>
+                </pic:pic>
+              </a:graphicData>
+            </a:graphic>
+          </wp:inline>
+        </w:drawing>
+      </w:r>
+    </w:p>
+    <w:p>
+      <w:pPr>
+        <w:spacing w:after="80" w:line="240" w:lineRule="auto"/>
+        <w:jc w:val="center"/>
+      </w:pPr>
+      <w:r>
+        <w:drawing>
+          <wp:inline xmlns:a="http://schemas.openxmlformats.org/drawingml/2006/main" xmlns:pic="http://schemas.openxmlformats.org/drawingml/2006/picture">
+            <wp:extent cx="4363815" cy="4280920"/>
+            <wp:docPr id="16" name="Picture 16"/>
+            <wp:cNvGraphicFramePr>
+              <a:graphicFrameLocks noChangeAspect="1"/>
+            </wp:cNvGraphicFramePr>
+            <a:graphic>
+              <a:graphicData uri="http://schemas.openxmlformats.org/drawingml/2006/picture">
+                <pic:pic>
+                  <pic:nvPicPr>
+                    <pic:cNvPr id="0" name="c-07.png"/>
+                    <pic:cNvPicPr/>
+                  </pic:nvPicPr>
+                  <pic:blipFill>
+                    <a:blip r:embed="rId24"/>
+                    <a:stretch>
+                      <a:fillRect/>
+                    </a:stretch>
+                  </pic:blipFill>
+                  <pic:spPr>
+                    <a:xfrm>
+                      <a:off x="0" y="0"/>
+                      <a:ext cx="4363815" cy="4280920"/>
+                    </a:xfrm>
+                    <a:prstGeom prst="rect"/>
+                  </pic:spPr>
+                </pic:pic>
+              </a:graphicData>
+            </a:graphic>
+          </wp:inline>
+        </w:drawing>
+      </w:r>
+    </w:p>
+    <w:p>
+      <w:pPr>
+        <w:spacing w:after="80" w:line="240" w:lineRule="auto"/>
+        <w:jc w:val="center"/>
+      </w:pPr>
+      <w:r>
+        <w:drawing>
+          <wp:inline xmlns:a="http://schemas.openxmlformats.org/drawingml/2006/main" xmlns:pic="http://schemas.openxmlformats.org/drawingml/2006/picture">
+            <wp:extent cx="4346052" cy="5962499"/>
+            <wp:docPr id="17" name="Picture 17"/>
+            <wp:cNvGraphicFramePr>
+              <a:graphicFrameLocks noChangeAspect="1"/>
+            </wp:cNvGraphicFramePr>
+            <a:graphic>
+              <a:graphicData uri="http://schemas.openxmlformats.org/drawingml/2006/picture">
+                <pic:pic>
+                  <pic:nvPicPr>
+                    <pic:cNvPr id="0" name="c-08.png"/>
+                    <pic:cNvPicPr/>
+                  </pic:nvPicPr>
+                  <pic:blipFill>
+                    <a:blip r:embed="rId25"/>
+                    <a:stretch>
+                      <a:fillRect/>
+                    </a:stretch>
+                  </pic:blipFill>
+                  <pic:spPr>
+                    <a:xfrm>
+                      <a:off x="0" y="0"/>
+                      <a:ext cx="4346052" cy="5962499"/>
+                    </a:xfrm>
+                    <a:prstGeom prst="rect"/>
+                  </pic:spPr>
+                </pic:pic>
+              </a:graphicData>
+            </a:graphic>
+          </wp:inline>
+        </w:drawing>
+      </w:r>
+    </w:p>
+    <w:p>
+      <w:pPr>
+        <w:spacing w:after="80" w:line="240" w:lineRule="auto"/>
+        <w:jc w:val="center"/>
+      </w:pPr>
+      <w:r>
+        <w:drawing>
+          <wp:inline xmlns:a="http://schemas.openxmlformats.org/drawingml/2006/main" xmlns:pic="http://schemas.openxmlformats.org/drawingml/2006/picture">
+            <wp:extent cx="4357894" cy="4411183"/>
+            <wp:docPr id="18" name="Picture 18"/>
+            <wp:cNvGraphicFramePr>
+              <a:graphicFrameLocks noChangeAspect="1"/>
+            </wp:cNvGraphicFramePr>
+            <a:graphic>
+              <a:graphicData uri="http://schemas.openxmlformats.org/drawingml/2006/picture">
+                <pic:pic>
+                  <pic:nvPicPr>
+                    <pic:cNvPr id="0" name="c-09.png"/>
+                    <pic:cNvPicPr/>
+                  </pic:nvPicPr>
+                  <pic:blipFill>
+                    <a:blip r:embed="rId26"/>
+                    <a:stretch>
+                      <a:fillRect/>
+                    </a:stretch>
+                  </pic:blipFill>
+                  <pic:spPr>
+                    <a:xfrm>
+                      <a:off x="0" y="0"/>
+                      <a:ext cx="4357894" cy="4411183"/>
+                    </a:xfrm>
+                    <a:prstGeom prst="rect"/>
+                  </pic:spPr>
+                </pic:pic>
+              </a:graphicData>
+            </a:graphic>
+          </wp:inline>
+        </w:drawing>
+      </w:r>
+    </w:p>
+    <w:p>
+      <w:pPr>
+        <w:spacing w:after="80" w:line="240" w:lineRule="auto"/>
+        <w:jc w:val="center"/>
+      </w:pPr>
+      <w:r>
+        <w:drawing>
+          <wp:inline xmlns:a="http://schemas.openxmlformats.org/drawingml/2006/main" xmlns:pic="http://schemas.openxmlformats.org/drawingml/2006/picture">
+            <wp:extent cx="4369736" cy="4417104"/>
+            <wp:docPr id="19" name="Picture 19"/>
+            <wp:cNvGraphicFramePr>
+              <a:graphicFrameLocks noChangeAspect="1"/>
+            </wp:cNvGraphicFramePr>
+            <a:graphic>
+              <a:graphicData uri="http://schemas.openxmlformats.org/drawingml/2006/picture">
+                <pic:pic>
+                  <pic:nvPicPr>
+                    <pic:cNvPr id="0" name="c-10.png"/>
+                    <pic:cNvPicPr/>
+                  </pic:nvPicPr>
+                  <pic:blipFill>
+                    <a:blip r:embed="rId27"/>
+                    <a:stretch>
+                      <a:fillRect/>
+                    </a:stretch>
+                  </pic:blipFill>
+                  <pic:spPr>
+                    <a:xfrm>
+                      <a:off x="0" y="0"/>
+                      <a:ext cx="4369736" cy="4417104"/>
+                    </a:xfrm>
+                    <a:prstGeom prst="rect"/>
+                  </pic:spPr>
+                </pic:pic>
+              </a:graphicData>
+            </a:graphic>
+          </wp:inline>
+        </w:drawing>
+      </w:r>
+    </w:p>
+    <w:p>
+      <w:pPr>
+        <w:spacing w:after="80" w:line="240" w:lineRule="auto"/>
+        <w:jc w:val="center"/>
+      </w:pPr>
+      <w:r>
+        <w:drawing>
+          <wp:inline xmlns:a="http://schemas.openxmlformats.org/drawingml/2006/main" xmlns:pic="http://schemas.openxmlformats.org/drawingml/2006/picture">
+            <wp:extent cx="4369736" cy="6424341"/>
+            <wp:docPr id="20" name="Picture 20"/>
+            <wp:cNvGraphicFramePr>
+              <a:graphicFrameLocks noChangeAspect="1"/>
+            </wp:cNvGraphicFramePr>
+            <a:graphic>
+              <a:graphicData uri="http://schemas.openxmlformats.org/drawingml/2006/picture">
+                <pic:pic>
+                  <pic:nvPicPr>
+                    <pic:cNvPr id="0" name="c-11.png"/>
+                    <pic:cNvPicPr/>
+                  </pic:nvPicPr>
+                  <pic:blipFill>
+                    <a:blip r:embed="rId28"/>
+                    <a:stretch>
+                      <a:fillRect/>
+                    </a:stretch>
+                  </pic:blipFill>
+                  <pic:spPr>
+                    <a:xfrm>
+                      <a:off x="0" y="0"/>
+                      <a:ext cx="4369736" cy="6424341"/>
+                    </a:xfrm>
+                    <a:prstGeom prst="rect"/>
+                  </pic:spPr>
+                </pic:pic>
+              </a:graphicData>
+            </a:graphic>
+          </wp:inline>
+        </w:drawing>
+      </w:r>
+    </w:p>
+    <w:p>
+      <w:pPr>
+        <w:spacing w:after="80" w:line="240" w:lineRule="auto"/>
+        <w:jc w:val="center"/>
+      </w:pPr>
+      <w:r>
+        <w:drawing>
+          <wp:inline xmlns:a="http://schemas.openxmlformats.org/drawingml/2006/main" xmlns:pic="http://schemas.openxmlformats.org/drawingml/2006/picture">
+            <wp:extent cx="4357894" cy="4393420"/>
+            <wp:docPr id="21" name="Picture 21"/>
+            <wp:cNvGraphicFramePr>
+              <a:graphicFrameLocks noChangeAspect="1"/>
+            </wp:cNvGraphicFramePr>
+            <a:graphic>
+              <a:graphicData uri="http://schemas.openxmlformats.org/drawingml/2006/picture">
+                <pic:pic>
+                  <pic:nvPicPr>
+                    <pic:cNvPr id="0" name="c-12.png"/>
+                    <pic:cNvPicPr/>
+                  </pic:nvPicPr>
+                  <pic:blipFill>
+                    <a:blip r:embed="rId29"/>
+                    <a:stretch>
+                      <a:fillRect/>
+                    </a:stretch>
+                  </pic:blipFill>
+                  <pic:spPr>
+                    <a:xfrm>
+                      <a:off x="0" y="0"/>
+                      <a:ext cx="4357894" cy="4393420"/>
+                    </a:xfrm>
+                    <a:prstGeom prst="rect"/>
+                  </pic:spPr>
+                </pic:pic>
+              </a:graphicData>
+            </a:graphic>
+          </wp:inline>
+        </w:drawing>
+      </w:r>
+    </w:p>
+    <w:p>
+      <w:pPr>
+        <w:spacing w:after="80" w:line="240" w:lineRule="auto"/>
+        <w:jc w:val="center"/>
+      </w:pPr>
+      <w:r>
+        <w:drawing>
+          <wp:inline xmlns:a="http://schemas.openxmlformats.org/drawingml/2006/main" xmlns:pic="http://schemas.openxmlformats.org/drawingml/2006/picture">
+            <wp:extent cx="4245394" cy="4505920"/>
+            <wp:docPr id="22" name="Picture 22"/>
+            <wp:cNvGraphicFramePr>
+              <a:graphicFrameLocks noChangeAspect="1"/>
+            </wp:cNvGraphicFramePr>
+            <a:graphic>
+              <a:graphicData uri="http://schemas.openxmlformats.org/drawingml/2006/picture">
+                <pic:pic>
+                  <pic:nvPicPr>
+                    <pic:cNvPr id="0" name="c-13.png"/>
+                    <pic:cNvPicPr/>
+                  </pic:nvPicPr>
+                  <pic:blipFill>
+                    <a:blip r:embed="rId30"/>
+                    <a:stretch>
+                      <a:fillRect/>
+                    </a:stretch>
+                  </pic:blipFill>
+                  <pic:spPr>
+                    <a:xfrm>
+                      <a:off x="0" y="0"/>
+                      <a:ext cx="4245394" cy="4505920"/>
+                    </a:xfrm>
+                    <a:prstGeom prst="rect"/>
+                  </pic:spPr>
+                </pic:pic>
+              </a:graphicData>
+            </a:graphic>
+          </wp:inline>
+        </w:drawing>
+      </w:r>
+    </w:p>
+    <w:p>
+      <w:pPr>
+        <w:spacing w:after="80" w:line="240" w:lineRule="auto"/>
+        <w:jc w:val="center"/>
+      </w:pPr>
+      <w:r>
+        <w:drawing>
+          <wp:inline xmlns:a="http://schemas.openxmlformats.org/drawingml/2006/main" xmlns:pic="http://schemas.openxmlformats.org/drawingml/2006/picture">
+            <wp:extent cx="4440789" cy="5157236"/>
+            <wp:docPr id="23" name="Picture 23"/>
+            <wp:cNvGraphicFramePr>
+              <a:graphicFrameLocks noChangeAspect="1"/>
+            </wp:cNvGraphicFramePr>
+            <a:graphic>
+              <a:graphicData uri="http://schemas.openxmlformats.org/drawingml/2006/picture">
+                <pic:pic>
+                  <pic:nvPicPr>
+                    <pic:cNvPr id="0" name="c-14.png"/>
+                    <pic:cNvPicPr/>
+                  </pic:nvPicPr>
+                  <pic:blipFill>
+                    <a:blip r:embed="rId31"/>
+                    <a:stretch>
+                      <a:fillRect/>
+                    </a:stretch>
+                  </pic:blipFill>
+                  <pic:spPr>
+                    <a:xfrm>
+                      <a:off x="0" y="0"/>
+                      <a:ext cx="4440789" cy="5157236"/>
+                    </a:xfrm>
+                    <a:prstGeom prst="rect"/>
+                  </pic:spPr>
+                </pic:pic>
+              </a:graphicData>
+            </a:graphic>
+          </wp:inline>
+        </w:drawing>
+      </w:r>
+    </w:p>
+    <w:p>
+      <w:pPr>
+        <w:spacing w:after="80" w:line="240" w:lineRule="auto"/>
+        <w:jc w:val="center"/>
+      </w:pPr>
+      <w:r>
+        <w:drawing>
+          <wp:inline xmlns:a="http://schemas.openxmlformats.org/drawingml/2006/main" xmlns:pic="http://schemas.openxmlformats.org/drawingml/2006/picture">
+            <wp:extent cx="4434868" cy="5157236"/>
+            <wp:docPr id="24" name="Picture 24"/>
+            <wp:cNvGraphicFramePr>
+              <a:graphicFrameLocks noChangeAspect="1"/>
+            </wp:cNvGraphicFramePr>
+            <a:graphic>
+              <a:graphicData uri="http://schemas.openxmlformats.org/drawingml/2006/picture">
+                <pic:pic>
+                  <pic:nvPicPr>
+                    <pic:cNvPr id="0" name="c-15.png"/>
+                    <pic:cNvPicPr/>
+                  </pic:nvPicPr>
+                  <pic:blipFill>
+                    <a:blip r:embed="rId32"/>
+                    <a:stretch>
+                      <a:fillRect/>
+                    </a:stretch>
+                  </pic:blipFill>
+                  <pic:spPr>
+                    <a:xfrm>
+                      <a:off x="0" y="0"/>
+                      <a:ext cx="4434868" cy="5157236"/>
+                    </a:xfrm>
+                    <a:prstGeom prst="rect"/>
+                  </pic:spPr>
+                </pic:pic>
+              </a:graphicData>
+            </a:graphic>
+          </wp:inline>
+        </w:drawing>
+      </w:r>
+    </w:p>
+    <w:p>
+      <w:pPr>
+        <w:spacing w:after="80" w:line="240" w:lineRule="auto"/>
+        <w:jc w:val="center"/>
+      </w:pPr>
+      <w:r>
+        <w:drawing>
+          <wp:inline xmlns:a="http://schemas.openxmlformats.org/drawingml/2006/main" xmlns:pic="http://schemas.openxmlformats.org/drawingml/2006/picture">
+            <wp:extent cx="4434868" cy="4671710"/>
+            <wp:docPr id="25" name="Picture 25"/>
+            <wp:cNvGraphicFramePr>
+              <a:graphicFrameLocks noChangeAspect="1"/>
+            </wp:cNvGraphicFramePr>
+            <a:graphic>
+              <a:graphicData uri="http://schemas.openxmlformats.org/drawingml/2006/picture">
+                <pic:pic>
+                  <pic:nvPicPr>
+                    <pic:cNvPr id="0" name="c-16.png"/>
+                    <pic:cNvPicPr/>
+                  </pic:nvPicPr>
+                  <pic:blipFill>
+                    <a:blip r:embed="rId33"/>
+                    <a:stretch>
+                      <a:fillRect/>
+                    </a:stretch>
+                  </pic:blipFill>
+                  <pic:spPr>
+                    <a:xfrm>
+                      <a:off x="0" y="0"/>
+                      <a:ext cx="4434868" cy="4671710"/>
+                    </a:xfrm>
+                    <a:prstGeom prst="rect"/>
+                  </pic:spPr>
+                </pic:pic>
+              </a:graphicData>
+            </a:graphic>
+          </wp:inline>
+        </w:drawing>
+      </w:r>
+    </w:p>
+    <w:p>
+      <w:pPr>
+        <w:spacing w:after="80" w:line="240" w:lineRule="auto"/>
+        <w:jc w:val="center"/>
+      </w:pPr>
+      <w:r>
+        <w:drawing>
+          <wp:inline xmlns:a="http://schemas.openxmlformats.org/drawingml/2006/main" xmlns:pic="http://schemas.openxmlformats.org/drawingml/2006/picture">
+            <wp:extent cx="4434868" cy="5157236"/>
+            <wp:docPr id="26" name="Picture 26"/>
+            <wp:cNvGraphicFramePr>
+              <a:graphicFrameLocks noChangeAspect="1"/>
+            </wp:cNvGraphicFramePr>
+            <a:graphic>
+              <a:graphicData uri="http://schemas.openxmlformats.org/drawingml/2006/picture">
+                <pic:pic>
+                  <pic:nvPicPr>
+                    <pic:cNvPr id="0" name="c-17.png"/>
+                    <pic:cNvPicPr/>
+                  </pic:nvPicPr>
+                  <pic:blipFill>
+                    <a:blip r:embed="rId34"/>
+                    <a:stretch>
+                      <a:fillRect/>
+                    </a:stretch>
+                  </pic:blipFill>
+                  <pic:spPr>
+                    <a:xfrm>
+                      <a:off x="0" y="0"/>
+                      <a:ext cx="4434868" cy="5157236"/>
+                    </a:xfrm>
+                    <a:prstGeom prst="rect"/>
+                  </pic:spPr>
+                </pic:pic>
+              </a:graphicData>
+            </a:graphic>
+          </wp:inline>
+        </w:drawing>
+      </w:r>
+    </w:p>
+    <w:p>
+      <w:pPr>
+        <w:spacing w:after="80" w:line="240" w:lineRule="auto"/>
+        <w:jc w:val="center"/>
+      </w:pPr>
+      <w:r>
+        <w:drawing>
+          <wp:inline xmlns:a="http://schemas.openxmlformats.org/drawingml/2006/main" xmlns:pic="http://schemas.openxmlformats.org/drawingml/2006/picture">
+            <wp:extent cx="4434868" cy="5370394"/>
+            <wp:docPr id="27" name="Picture 27"/>
+            <wp:cNvGraphicFramePr>
+              <a:graphicFrameLocks noChangeAspect="1"/>
+            </wp:cNvGraphicFramePr>
+            <a:graphic>
+              <a:graphicData uri="http://schemas.openxmlformats.org/drawingml/2006/picture">
+                <pic:pic>
+                  <pic:nvPicPr>
+                    <pic:cNvPr id="0" name="c-18.png"/>
+                    <pic:cNvPicPr/>
+                  </pic:nvPicPr>
+                  <pic:blipFill>
+                    <a:blip r:embed="rId35"/>
+                    <a:stretch>
+                      <a:fillRect/>
+                    </a:stretch>
+                  </pic:blipFill>
+                  <pic:spPr>
+                    <a:xfrm>
+                      <a:off x="0" y="0"/>
+                      <a:ext cx="4434868" cy="5370394"/>
+                    </a:xfrm>
+                    <a:prstGeom prst="rect"/>
+                  </pic:spPr>
+                </pic:pic>
+              </a:graphicData>
+            </a:graphic>
+          </wp:inline>
+        </w:drawing>
+      </w:r>
+    </w:p>
+    <w:p>
+      <w:pPr>
+        <w:spacing w:after="80" w:line="240" w:lineRule="auto"/>
+        <w:jc w:val="center"/>
+      </w:pPr>
+      <w:r>
+        <w:drawing>
+          <wp:inline xmlns:a="http://schemas.openxmlformats.org/drawingml/2006/main" xmlns:pic="http://schemas.openxmlformats.org/drawingml/2006/picture">
+            <wp:extent cx="4440789" cy="4967763"/>
+            <wp:docPr id="28" name="Picture 28"/>
+            <wp:cNvGraphicFramePr>
+              <a:graphicFrameLocks noChangeAspect="1"/>
+            </wp:cNvGraphicFramePr>
+            <a:graphic>
+              <a:graphicData uri="http://schemas.openxmlformats.org/drawingml/2006/picture">
+                <pic:pic>
+                  <pic:nvPicPr>
+                    <pic:cNvPr id="0" name="c-19.png"/>
+                    <pic:cNvPicPr/>
+                  </pic:nvPicPr>
+                  <pic:blipFill>
+                    <a:blip r:embed="rId36"/>
+                    <a:stretch>
+                      <a:fillRect/>
+                    </a:stretch>
+                  </pic:blipFill>
+                  <pic:spPr>
+                    <a:xfrm>
+                      <a:off x="0" y="0"/>
+                      <a:ext cx="4440789" cy="4967763"/>
+                    </a:xfrm>
+                    <a:prstGeom prst="rect"/>
+                  </pic:spPr>
+                </pic:pic>
+              </a:graphicData>
+            </a:graphic>
+          </wp:inline>
+        </w:drawing>
+      </w:r>
+    </w:p>
+    <w:p>
+      <w:pPr>
+        <w:spacing w:after="80" w:line="240" w:lineRule="auto"/>
+        <w:jc w:val="center"/>
+      </w:pPr>
+      <w:r>
+        <w:drawing>
+          <wp:inline xmlns:a="http://schemas.openxmlformats.org/drawingml/2006/main" xmlns:pic="http://schemas.openxmlformats.org/drawingml/2006/picture">
+            <wp:extent cx="4500000" cy="2350064"/>
+            <wp:docPr id="29" name="Picture 29"/>
+            <wp:cNvGraphicFramePr>
+              <a:graphicFrameLocks noChangeAspect="1"/>
+            </wp:cNvGraphicFramePr>
+            <a:graphic>
+              <a:graphicData uri="http://schemas.openxmlformats.org/drawingml/2006/picture">
+                <pic:pic>
+                  <pic:nvPicPr>
+                    <pic:cNvPr id="0" name="c-20.png"/>
+                    <pic:cNvPicPr/>
+                  </pic:nvPicPr>
+                  <pic:blipFill>
+                    <a:blip r:embed="rId37"/>
+                    <a:stretch>
+                      <a:fillRect/>
+                    </a:stretch>
+                  </pic:blipFill>
+                  <pic:spPr>
+                    <a:xfrm>
+                      <a:off x="0" y="0"/>
+                      <a:ext cx="4500000" cy="2350064"/>
+                    </a:xfrm>
+                    <a:prstGeom prst="rect"/>
+                  </pic:spPr>
+                </pic:pic>
+              </a:graphicData>
+            </a:graphic>
+          </wp:inline>
+        </w:drawing>
+      </w:r>
+    </w:p>
     <w:sectPr>
-      <w:footerReference w:type="default" r:id="rId19"/>
+      <w:footerReference w:type="default" r:id="rId39"/>
       <w:pgSz w:w="11906" w:h="16838"/>
       <w:pgMar w:top="1417" w:right="1417" w:bottom="1417" w:left="1701" w:header="720" w:footer="720" w:gutter="0"/>
       <w:cols w:space="720"/>

</xml_diff>

<commit_message>
Research: verify all references against PubMed; add four recent studies and ClinicalTrials.gov gap
Co-Authored-By: Claude Opus 5.5 <noreply@anthropic.com>
Claude-Session: https://claude.ai/code/session_0186tGPQJ67bKVgWZR7S3c4o
</commit_message>
<xml_diff>
--- a/research/output/Cyberchondria_Research_Baghdad.docx
+++ b/research/output/Cyberchondria_Research_Baghdad.docx
@@ -402,7 +402,7 @@
           <w:sz w:val="24"/>
         </w:rPr>
         <w:tab/>
-        <w:t>4</w:t>
+        <w:t>5</w:t>
       </w:r>
     </w:p>
     <w:p>
@@ -448,7 +448,7 @@
           <w:sz w:val="24"/>
         </w:rPr>
         <w:tab/>
-        <w:t>5</w:t>
+        <w:t>6</w:t>
       </w:r>
     </w:p>
     <w:p>
@@ -471,7 +471,7 @@
           <w:sz w:val="26"/>
         </w:rPr>
         <w:tab/>
-        <w:t>6</w:t>
+        <w:t>7</w:t>
       </w:r>
     </w:p>
     <w:p>
@@ -494,7 +494,7 @@
           <w:sz w:val="24"/>
         </w:rPr>
         <w:tab/>
-        <w:t>6</w:t>
+        <w:t>7</w:t>
       </w:r>
     </w:p>
     <w:p>
@@ -517,7 +517,7 @@
           <w:sz w:val="24"/>
         </w:rPr>
         <w:tab/>
-        <w:t>6</w:t>
+        <w:t>7</w:t>
       </w:r>
     </w:p>
     <w:p>
@@ -563,7 +563,7 @@
           <w:sz w:val="24"/>
         </w:rPr>
         <w:tab/>
-        <w:t>7</w:t>
+        <w:t>8</w:t>
       </w:r>
     </w:p>
     <w:p>
@@ -609,7 +609,7 @@
           <w:sz w:val="24"/>
         </w:rPr>
         <w:tab/>
-        <w:t>9</w:t>
+        <w:t>10</w:t>
       </w:r>
     </w:p>
     <w:p>
@@ -632,7 +632,7 @@
           <w:sz w:val="24"/>
         </w:rPr>
         <w:tab/>
-        <w:t>11</w:t>
+        <w:t>12</w:t>
       </w:r>
     </w:p>
     <w:p>
@@ -724,7 +724,7 @@
           <w:sz w:val="24"/>
         </w:rPr>
         <w:tab/>
-        <w:t>14</w:t>
+        <w:t>15</w:t>
       </w:r>
     </w:p>
     <w:p>
@@ -747,7 +747,7 @@
           <w:sz w:val="24"/>
         </w:rPr>
         <w:tab/>
-        <w:t>15</w:t>
+        <w:t>16</w:t>
       </w:r>
     </w:p>
     <w:p>
@@ -770,7 +770,7 @@
           <w:sz w:val="24"/>
         </w:rPr>
         <w:tab/>
-        <w:t>16</w:t>
+        <w:t>17</w:t>
       </w:r>
     </w:p>
     <w:p>
@@ -793,7 +793,7 @@
           <w:sz w:val="24"/>
         </w:rPr>
         <w:tab/>
-        <w:t>19</w:t>
+        <w:t>20</w:t>
       </w:r>
     </w:p>
     <w:p>
@@ -816,7 +816,7 @@
           <w:sz w:val="24"/>
         </w:rPr>
         <w:tab/>
-        <w:t>23</w:t>
+        <w:t>24</w:t>
       </w:r>
     </w:p>
     <w:p>
@@ -839,7 +839,7 @@
           <w:sz w:val="24"/>
         </w:rPr>
         <w:tab/>
-        <w:t>25</w:t>
+        <w:t>26</w:t>
       </w:r>
     </w:p>
     <w:p>
@@ -862,7 +862,7 @@
           <w:sz w:val="24"/>
         </w:rPr>
         <w:tab/>
-        <w:t>26</w:t>
+        <w:t>27</w:t>
       </w:r>
     </w:p>
     <w:p>
@@ -885,7 +885,7 @@
           <w:sz w:val="24"/>
         </w:rPr>
         <w:tab/>
-        <w:t>28</w:t>
+        <w:t>29</w:t>
       </w:r>
     </w:p>
     <w:p>
@@ -908,7 +908,7 @@
           <w:sz w:val="26"/>
         </w:rPr>
         <w:tab/>
-        <w:t>29</w:t>
+        <w:t>30</w:t>
       </w:r>
     </w:p>
     <w:p>
@@ -931,7 +931,7 @@
           <w:sz w:val="24"/>
         </w:rPr>
         <w:tab/>
-        <w:t>29</w:t>
+        <w:t>30</w:t>
       </w:r>
     </w:p>
     <w:p>
@@ -954,7 +954,7 @@
           <w:sz w:val="24"/>
         </w:rPr>
         <w:tab/>
-        <w:t>29</w:t>
+        <w:t>30</w:t>
       </w:r>
     </w:p>
     <w:p>
@@ -977,7 +977,7 @@
           <w:sz w:val="24"/>
         </w:rPr>
         <w:tab/>
-        <w:t>30</w:t>
+        <w:t>31</w:t>
       </w:r>
     </w:p>
     <w:p>
@@ -1000,7 +1000,7 @@
           <w:sz w:val="24"/>
         </w:rPr>
         <w:tab/>
-        <w:t>31</w:t>
+        <w:t>32</w:t>
       </w:r>
     </w:p>
     <w:p>
@@ -1023,7 +1023,7 @@
           <w:sz w:val="24"/>
         </w:rPr>
         <w:tab/>
-        <w:t>32</w:t>
+        <w:t>33</w:t>
       </w:r>
     </w:p>
     <w:p>
@@ -1046,7 +1046,7 @@
           <w:sz w:val="24"/>
         </w:rPr>
         <w:tab/>
-        <w:t>33</w:t>
+        <w:t>34</w:t>
       </w:r>
     </w:p>
     <w:p>
@@ -1069,7 +1069,7 @@
           <w:sz w:val="24"/>
         </w:rPr>
         <w:tab/>
-        <w:t>33</w:t>
+        <w:t>34</w:t>
       </w:r>
     </w:p>
     <w:p>
@@ -1092,7 +1092,7 @@
           <w:sz w:val="24"/>
         </w:rPr>
         <w:tab/>
-        <w:t>33</w:t>
+        <w:t>35</w:t>
       </w:r>
     </w:p>
     <w:p>
@@ -1115,7 +1115,7 @@
           <w:sz w:val="26"/>
         </w:rPr>
         <w:tab/>
-        <w:t>35</w:t>
+        <w:t>36</w:t>
       </w:r>
     </w:p>
     <w:p>
@@ -1138,7 +1138,7 @@
           <w:sz w:val="24"/>
         </w:rPr>
         <w:tab/>
-        <w:t>35</w:t>
+        <w:t>36</w:t>
       </w:r>
     </w:p>
     <w:p>
@@ -1161,7 +1161,7 @@
           <w:sz w:val="24"/>
         </w:rPr>
         <w:tab/>
-        <w:t>36</w:t>
+        <w:t>37</w:t>
       </w:r>
     </w:p>
     <w:p>
@@ -1184,7 +1184,7 @@
           <w:sz w:val="26"/>
         </w:rPr>
         <w:tab/>
-        <w:t>37</w:t>
+        <w:t>39</w:t>
       </w:r>
     </w:p>
     <w:p>
@@ -1207,7 +1207,7 @@
           <w:sz w:val="26"/>
         </w:rPr>
         <w:tab/>
-        <w:t>42</w:t>
+        <w:t>44</w:t>
       </w:r>
     </w:p>
     <w:p>
@@ -1230,7 +1230,7 @@
           <w:sz w:val="24"/>
         </w:rPr>
         <w:tab/>
-        <w:t>42</w:t>
+        <w:t>44</w:t>
       </w:r>
     </w:p>
     <w:p>
@@ -1253,7 +1253,7 @@
           <w:sz w:val="24"/>
         </w:rPr>
         <w:tab/>
-        <w:t>43</w:t>
+        <w:t>45</w:t>
         <w:fldChar w:fldCharType="end"/>
       </w:r>
     </w:p>
@@ -2264,7 +2264,7 @@
           <w:sz w:val="26"/>
         </w:rPr>
         <w:tab/>
-        <w:t>16</w:t>
+        <w:t>17</w:t>
       </w:r>
     </w:p>
     <w:p>
@@ -2295,7 +2295,7 @@
           <w:sz w:val="26"/>
         </w:rPr>
         <w:tab/>
-        <w:t>17</w:t>
+        <w:t>18</w:t>
       </w:r>
     </w:p>
     <w:p>
@@ -2326,7 +2326,7 @@
           <w:sz w:val="26"/>
         </w:rPr>
         <w:tab/>
-        <w:t>20</w:t>
+        <w:t>21</w:t>
       </w:r>
     </w:p>
     <w:p>
@@ -2357,7 +2357,7 @@
           <w:sz w:val="26"/>
         </w:rPr>
         <w:tab/>
-        <w:t>22</w:t>
+        <w:t>23</w:t>
       </w:r>
     </w:p>
     <w:p>
@@ -2388,7 +2388,7 @@
           <w:sz w:val="26"/>
         </w:rPr>
         <w:tab/>
-        <w:t>24</w:t>
+        <w:t>25</w:t>
       </w:r>
     </w:p>
     <w:p>
@@ -2419,7 +2419,7 @@
           <w:sz w:val="26"/>
         </w:rPr>
         <w:tab/>
-        <w:t>24</w:t>
+        <w:t>25</w:t>
       </w:r>
     </w:p>
     <w:p>
@@ -2450,7 +2450,7 @@
           <w:sz w:val="26"/>
         </w:rPr>
         <w:tab/>
-        <w:t>26</w:t>
+        <w:t>27</w:t>
       </w:r>
     </w:p>
     <w:p>
@@ -2481,7 +2481,7 @@
           <w:sz w:val="26"/>
         </w:rPr>
         <w:tab/>
-        <w:t>27</w:t>
+        <w:t>28</w:t>
         <w:fldChar w:fldCharType="end"/>
       </w:r>
     </w:p>
@@ -2532,7 +2532,7 @@
           <w:sz w:val="26"/>
         </w:rPr>
         <w:tab/>
-        <w:t>14</w:t>
+        <w:t>15</w:t>
       </w:r>
     </w:p>
     <w:p>
@@ -2563,7 +2563,7 @@
           <w:sz w:val="26"/>
         </w:rPr>
         <w:tab/>
-        <w:t>15</w:t>
+        <w:t>16</w:t>
       </w:r>
     </w:p>
     <w:p>
@@ -2594,7 +2594,7 @@
           <w:sz w:val="26"/>
         </w:rPr>
         <w:tab/>
-        <w:t>18</w:t>
+        <w:t>19</w:t>
       </w:r>
     </w:p>
     <w:p>
@@ -2625,7 +2625,7 @@
           <w:sz w:val="26"/>
         </w:rPr>
         <w:tab/>
-        <w:t>19</w:t>
+        <w:t>20</w:t>
       </w:r>
     </w:p>
     <w:p>
@@ -2656,7 +2656,7 @@
           <w:sz w:val="26"/>
         </w:rPr>
         <w:tab/>
-        <w:t>22</w:t>
+        <w:t>23</w:t>
       </w:r>
     </w:p>
     <w:p>
@@ -2687,7 +2687,7 @@
           <w:sz w:val="26"/>
         </w:rPr>
         <w:tab/>
-        <w:t>25</w:t>
+        <w:t>26</w:t>
       </w:r>
     </w:p>
     <w:p>
@@ -2718,7 +2718,7 @@
           <w:sz w:val="26"/>
         </w:rPr>
         <w:tab/>
-        <w:t>28</w:t>
+        <w:t>29</w:t>
       </w:r>
     </w:p>
     <w:p>
@@ -2749,7 +2749,7 @@
           <w:sz w:val="26"/>
         </w:rPr>
         <w:tab/>
-        <w:t>28</w:t>
+        <w:t>29</w:t>
       </w:r>
     </w:p>
     <w:p>
@@ -2780,7 +2780,7 @@
           <w:sz w:val="26"/>
         </w:rPr>
         <w:tab/>
-        <w:t>42</w:t>
+        <w:t>44</w:t>
         <w:fldChar w:fldCharType="end"/>
       </w:r>
     </w:p>
@@ -3016,7 +3016,7 @@
         <w:rPr>
           <w:rFonts w:ascii="Times New Roman" w:hAnsi="Times New Roman"/>
         </w:rPr>
-        <w:t>Health anxiety is not rare. In a national Australian survey, 5.7% of adults met lifetime criteria and 3.4% current criteria for health anxiety [6], and sub-threshold forms are considerably more common. Its costs are substantial: patients in the top band of health anxiety and somatisation in primary care had markedly more physician visits and higher outpatient costs than other patients, even after adjustment for medical comorbidity [7]. In Iraq, almost half of 1591 respondents in an online survey during the COVID-19 restrictions reported health anxiety [8], suggesting that the population is far from immune to illness worry.</w:t>
+        <w:t>Health anxiety is not rare. In a national Australian survey, 5.7% of adults met lifetime criteria and 3.4% current criteria for health anxiety [6], and sub-threshold forms are considerably more common. Its costs are substantial: patients in the top band of health anxiety and somatisation in primary care had markedly more physician visits and higher outpatient costs than other patients, even after adjustment for medical comorbidity [7]. In Iraq, almost half of 1591 respondents in an online survey during the COVID-19 restrictions reported health anxiety [8], and a second national online survey of 1578 Iraqi adults found that home quarantine was accompanied by greater health anxiety and increased reassurance-seeking behaviour [9], suggesting that the population is far from immune to illness worry.</w:t>
       </w:r>
     </w:p>
     <w:p>
@@ -3037,7 +3037,7 @@
         <w:rPr>
           <w:rFonts w:ascii="Times New Roman" w:hAnsi="Times New Roman"/>
         </w:rPr>
-        <w:t>The term cyberchondria was popularised by White and Horvitz, whose analysis of large-scale search logs showed that searches for common, benign symptoms frequently escalated towards rare and serious diagnoses, and that this escalation was driven by the amount and wording of medical content viewed and by the user's own predisposition to escalate [1]. Starcevic and Berle later defined cyberchondria as excessive or repeated online searching for health information that is associated with increasing, rather than relieving, distress or anxiety [2]. Crucially, searching for health information is not itself pathological; it becomes cyberchondria when it is excessive, compulsive and distressing, and when it drives further reassurance seeking [9,10]. A systematic review described cyberchondria as a possible transdiagnostic, compulsive digital syndrome closely linked to health anxiety and obsessive-compulsive symptoms, while noting that the evidence base was almost entirely cross-sectional and based on online student samples [11].</w:t>
+        <w:t>The term cyberchondria was popularised by White and Horvitz, whose analysis of large-scale search logs showed that searches for common, benign symptoms frequently escalated towards rare and serious diagnoses, and that this escalation was driven by the amount and wording of medical content viewed and by the user's own predisposition to escalate [1]. Starcevic and Berle later defined cyberchondria as excessive or repeated online searching for health information that is associated with increasing, rather than relieving, distress or anxiety [2]. Crucially, searching for health information is not itself pathological; it becomes cyberchondria when it is excessive, compulsive and distressing, and when it drives further reassurance seeking [10,11]. A systematic review described cyberchondria as a possible transdiagnostic, compulsive digital syndrome closely linked to health anxiety and obsessive-compulsive symptoms, while noting that the evidence base was almost entirely cross-sectional and based on online student samples [12].</w:t>
       </w:r>
     </w:p>
     <w:p>
@@ -3050,7 +3050,7 @@
         <w:rPr>
           <w:rFonts w:ascii="Times New Roman" w:hAnsi="Times New Roman"/>
         </w:rPr>
-        <w:t>The most widely used instrument is the Cyberchondria Severity Scale (CSS), originally a 33-item measure with five factors: compulsion, distress, excessiveness, reassurance seeking and mistrust of medical professionals [12]. Its 12-item short form (CSS-12) drops the mistrust dimension and retains four three-item subscales that load substantially on a general cyberchondria factor, supporting both a total and subscale scores [13]. An Arabic version of the CSS-12 has shown acceptable structure and validity among Lebanese adults [14].</w:t>
+        <w:t>The most widely used instrument is the Cyberchondria Severity Scale (CSS), originally a 33-item measure with five factors: compulsion, distress, excessiveness, reassurance seeking and mistrust of medical professionals [13]. Its 12-item short form (CSS-12) drops the mistrust dimension and retains four three-item subscales that load substantially on a general cyberchondria factor, supporting both a total and subscale scores [14]. An Arabic version of the CSS-12 has shown acceptable structure and validity among Lebanese adults [15].</w:t>
       </w:r>
     </w:p>
     <w:p>
@@ -3071,7 +3071,7 @@
         <w:rPr>
           <w:rFonts w:ascii="Times New Roman" w:hAnsi="Times New Roman"/>
         </w:rPr>
-        <w:t>People with higher health anxiety search for health information more often, spend longer doing so and find searching more distressing than people with low health anxiety [15]. Among people who search online for symptoms, those with high illness anxiety tend to feel worse after searching whereas those with low illness anxiety tend to feel relieved [16]. Two meta-analyses have quantified the association: health anxiety correlates moderately with general online health information seeking (r = 0.34) but strongly with cyberchondria (r = 0.62) [17], and a later meta-analysis reported a similar pooled correlation (r = 0.63), with subscale correlations ranging from 0.24 to 0.66 [18]. The same work frames health-related Internet use in anxious individuals as a safety behaviour maintained by intermittent reinforcement [18]. Intolerance of uncertainty strengthens the link between searching and anxiety, presumably because search results rarely deliver a single, certain answer [19].</w:t>
+        <w:t>People with higher health anxiety search for health information more often, spend longer doing so and find searching more distressing than people with low health anxiety [16]. Among people who search online for symptoms, those with high illness anxiety tend to feel worse after searching whereas those with low illness anxiety tend to feel relieved [17]. Two meta-analyses have quantified the association: health anxiety correlates moderately with general online health information seeking (r = 0.34) but strongly with cyberchondria (r = 0.62) [18], and a later meta-analysis reported a similar pooled correlation (r = 0.63), with subscale correlations ranging from 0.24 to 0.66 [19]. The same work frames health-related Internet use in anxious individuals as a safety behaviour maintained by intermittent reinforcement [19]. Intolerance of uncertainty strengthens the link between searching and anxiety, presumably because search results rarely deliver a single, certain answer [20].</w:t>
       </w:r>
     </w:p>
     <w:p>
@@ -3084,7 +3084,7 @@
         <w:rPr>
           <w:rFonts w:ascii="Times New Roman" w:hAnsi="Times New Roman"/>
         </w:rPr>
-        <w:t>Whether the two conditions "fuel each other" is the central question. The only large longitudinal study, a four-wave Dutch panel of 5322 adults, found initial evidence of a reciprocal relationship in which health-anxious people search more and searching in turn raises health anxiety; however, this loop appeared among people with non-clinical health anxiety and not in the clinically anxious subsample, in whom searching seemed to maintain rather than worsen anxiety [20]. The COVID-19 pandemic offered a natural test of the cycle: cyberchondria tracked rising concern and safety behaviours in Croatia [21], and was linked with health anxiety among university students in Turkey [22]. A recent scoping review reported cyberchondria prevalence estimates between 30.7% and 55.6% across studies and consistent associations with health anxiety [23].</w:t>
+        <w:t>Whether the two conditions "fuel each other" is the central question. The only large longitudinal study, a four-wave Dutch panel of 5322 adults, found initial evidence of a reciprocal relationship in which health-anxious people search more and searching in turn raises health anxiety; however, this loop appeared among people with non-clinical health anxiety and not in the clinically anxious subsample, in whom searching seemed to maintain rather than worsen anxiety [21]. The COVID-19 pandemic offered a natural test of the cycle: cyberchondria tracked rising concern and safety behaviours in Croatia [22], and was linked with health anxiety among university students in Turkey [23]. A recent scoping review reported cyberchondria prevalence estimates between 30.7% and 55.6% across studies and consistent associations with health anxiety [24].</w:t>
       </w:r>
     </w:p>
     <w:p>
@@ -3105,7 +3105,7 @@
         <w:rPr>
           <w:rFonts w:ascii="Times New Roman" w:hAnsi="Times New Roman"/>
         </w:rPr>
-        <w:t>Most of this evidence was gathered when "searching online" meant using a search engine. Large language model (LLM) chatbots such as ChatGPT and Gemini change the experience in important ways: they answer in fluent, personalised, conversational language; they can be questioned repeatedly; and their responses can appear more empathetic than those of physicians [24,25]. In a large US survey, about one in five respondents had used ChatGPT for health information, most of them remained sceptical of its output, and most then turned to their physicians [26]. Health anxiety has also been identified as a stable predictor of symptom-checker app use, with over half of users meeting a hypochondria classification [27]. Whether AI chatbots relieve worry, by offering calm and contextualised answers, or amplify it, by being endlessly available for another round of reassurance, is an open empirical question.</w:t>
+        <w:t>Most of this evidence was gathered when "searching online" meant using a search engine. Large language model (LLM) chatbots such as ChatGPT and Gemini change the experience in important ways: they answer in fluent, personalised, conversational language; they can be questioned repeatedly; and their responses can appear more empathetic than those of physicians [25,26]. In a large US survey, about one in five respondents had used ChatGPT for health information, most of them remained sceptical of its output, and most then turned to their physicians [27]. Health anxiety has also been identified as a stable predictor of symptom-checker app use, with over half of users meeting a hypochondria classification [28]. In a representative Czech sample of 4775 Internet users, health anxiety was associated with willingness to use generative AI for health information only indirectly, through greater trust in AI [29], and among young dermatology outpatients in Turkey 61% had consulted an AI chatbot (mostly ChatGPT) before their visit, without a detectable increase in anxiety [30]. Whether AI chatbots relieve worry, by offering calm and contextualised answers, or amplify it, by being endlessly available for another round of reassurance, is an open empirical question.</w:t>
       </w:r>
     </w:p>
     <w:p>
@@ -3126,7 +3126,7 @@
         <w:rPr>
           <w:rFonts w:ascii="Times New Roman" w:hAnsi="Times New Roman"/>
         </w:rPr>
-        <w:t>What patients do after searching matters for clinical care. Online information can improve the doctor–patient relationship when patients discuss it with their physician, but can strain it when it is withheld or used to challenge the physician [28]. Reassurance seeking may translate into additional consultations, requests for investigations or "doctor shopping", while false reassurance may lead to delayed care. Studies in the Arab region have begun to describe these patterns: cyberchondria was common among adults in Jeddah and associated with smartphone addiction [29], and among Saudi primary-care patients cyberchondria was linked with health anxiety [30]. No comparable study has been reported from Iraq, and none, to our knowledge, has placed AI chatbots alongside search engines in this population.</w:t>
+        <w:t>What patients do after searching matters for clinical care. Online information can improve the doctor–patient relationship when patients discuss it with their physician, but can strain it when it is withheld or used to challenge the physician [31]. Reassurance seeking may translate into additional consultations, requests for investigations or "doctor shopping", while false reassurance may lead to delayed care. Studies in the Arab region have begun to describe these patterns: cyberchondria was common among adults in Jeddah and associated with smartphone addiction [32], and among Saudi primary-care patients cyberchondria was linked with health anxiety [33]. Across 13 Arabic-speaking countries of the Middle East and North Africa, about a third of 4276 migraine patients had delayed consultation or modified treatment because of online information, and higher trust in online information strongly predicted delayed consultation [34]. No comparable study has been reported from Iraq, and none, to our knowledge, has placed AI chatbots alongside search engines in this population.</w:t>
       </w:r>
     </w:p>
     <w:p>
@@ -3326,7 +3326,7 @@
         <w:rPr>
           <w:rFonts w:ascii="Times New Roman" w:hAnsi="Times New Roman"/>
         </w:rPr>
-        <w:t>This was an analytical cross-sectional study reported in line with the STROBE statement for observational studies [31] and the CHERRIES checklist for web-based surveys [32]. Data were collected online in Baghdad, Iraq, between 17 July 2026 and 11 September 2026.</w:t>
+        <w:t>This was an analytical cross-sectional study reported in line with the STROBE statement for observational studies [35] and the CHERRIES checklist for web-based surveys [36]. Data were collected online in Baghdad, Iraq, between 17 July 2026 and 11 September 2026.</w:t>
       </w:r>
     </w:p>
     <w:p>
@@ -3368,7 +3368,7 @@
         <w:rPr>
           <w:rFonts w:ascii="Times New Roman" w:hAnsi="Times New Roman"/>
         </w:rPr>
-        <w:t>The study was powered for its primary objective, the correlation between health anxiety and cyberchondria. Using Fisher's z approximation with two-sided α = 0.05 and 80% power, a minimum of 194 participants is required to detect a small-to-moderate correlation (r = 0.20), and 85 to detect r = 0.30 [33]. Meta-analytic estimates of this association are far larger (r ≈ 0.62) [17,18], so these targets are conservative. With the achieved sample of 300, the study had 93.7% power to detect r = 0.20, and the smallest detectable correlation at 80% power was r = 0.16. For the multivariable model with 20 predictors, power to detect the unique contribution of a single predictor of small size (f² = 0.03) was 84.8%. For descriptive proportions, 300 participants give a margin of error of ±5.7% at 95% confidence (worst case, p = 0.5), compared with ±5% for the 385 participants of a Cochran-based calculation. The logistic model for clinically relevant health anxiety had 57 events for 11 predictors (≈5 events per variable), which is acknowledged as a limitation of that model.</w:t>
+        <w:t>The study was powered for its primary objective, the correlation between health anxiety and cyberchondria. Using Fisher's z approximation with two-sided α = 0.05 and 80% power, a minimum of 194 participants is required to detect a small-to-moderate correlation (r = 0.20), and 85 to detect r = 0.30 [37]. Meta-analytic estimates of this association are far larger (r ≈ 0.62) [18,19], so these targets are conservative. With the achieved sample of 300, the study had 93.7% power to detect r = 0.20, and the smallest detectable correlation at 80% power was r = 0.16. For the multivariable model with 20 predictors, power to detect the unique contribution of a single predictor of small size (f² = 0.03) was 84.8%. For descriptive proportions, 300 participants give a margin of error of ±5.7% at 95% confidence (worst case, p = 0.5), compared with ±5% for the 385 participants of a Cochran-based calculation. The logistic model for clinically relevant health anxiety had 57 events for 11 predictors (≈5 events per variable), which is acknowledged as a limitation of that model.</w:t>
       </w:r>
     </w:p>
     <w:p>
@@ -3449,7 +3449,7 @@
         <w:rPr>
           <w:rFonts w:ascii="Times New Roman" w:hAnsi="Times New Roman"/>
         </w:rPr>
-        <w:t xml:space="preserve"> the 14-item Short Health Anxiety Inventory (SHAI-14) [34]. Each item offers four statements scored 0–3, giving a total of 0–42; higher scores indicate greater health anxiety. The SHAI has good reliability and validity in clinical and non-clinical samples [35,36], and an Arabic version has been validated in Saudi Arabia [37].</w:t>
+        <w:t xml:space="preserve"> the 14-item Short Health Anxiety Inventory (SHAI-14) [38]. Each item offers four statements scored 0–3, giving a total of 0–42; higher scores indicate greater health anxiety. The SHAI has good reliability and validity in clinical and non-clinical samples [39,40], and an Arabic version has been validated in Saudi Arabia [41].</w:t>
       </w:r>
     </w:p>
     <w:p>
@@ -3469,7 +3469,7 @@
         <w:rPr>
           <w:rFonts w:ascii="Times New Roman" w:hAnsi="Times New Roman"/>
         </w:rPr>
-        <w:t xml:space="preserve"> the CSS-12 [13], with items rated on a 5-point frequency scale (1 = never to 5 = always), giving a total of 12–60 and four subscales (3–15 each): Excessiveness (items 1–3), Compulsion (4–6), Distress (7–9) and Reassurance seeking (10–12).</w:t>
+        <w:t xml:space="preserve"> the CSS-12 [14], with items rated on a 5-point frequency scale (1 = never to 5 = always), giving a total of 12–60 and four subscales (3–15 each): Excessiveness (items 1–3), Compulsion (4–6), Distress (7–9) and Reassurance seeking (10–12).</w:t>
       </w:r>
     </w:p>
     <w:p>
@@ -3530,7 +3530,7 @@
         <w:rPr>
           <w:rFonts w:ascii="Times New Roman" w:hAnsi="Times New Roman"/>
         </w:rPr>
-        <w:t xml:space="preserve"> SHAI-14 ≥ 18, the optimal cut-off for distinguishing patients with health anxiety from healthy controls in a recent diagnostic accuracy study [38]. Prevalence at alternative cut-offs (15 and 22) was also reported.</w:t>
+        <w:t xml:space="preserve"> SHAI-14 ≥ 18, the optimal cut-off for distinguishing patients with health anxiety from healthy controls in a recent diagnostic accuracy study [42]. Prevalence at alternative cut-offs (15 and 22) was also reported.</w:t>
       </w:r>
     </w:p>
     <w:p>
@@ -3671,7 +3671,7 @@
         <w:rPr>
           <w:rFonts w:ascii="Times New Roman" w:hAnsi="Times New Roman"/>
         </w:rPr>
-        <w:t xml:space="preserve"> internal consistency by Cronbach's α (with 95% CI) and McDonald's ω [39]; corrected item–rest correlations; sampling adequacy (KMO, Bartlett's test); and confirmatory factor analysis using diagonally weighted least squares (appropriate for ordinal items) with maximum-likelihood estimates reported alongside as a stricter check. Fit was judged against conventional criteria (CFI/TLI ≥ 0.95, RMSEA ≤ 0.06–0.08) [40]. Equivalence of the Arabic and English responders was tested by comparing α values with Feldt's test [41], factor-loading similarity with Tucker's congruence coefficient [42], and adjusted mean differences.</w:t>
+        <w:t xml:space="preserve"> internal consistency by Cronbach's α (with 95% CI) and McDonald's ω [43]; corrected item–rest correlations; sampling adequacy (KMO, Bartlett's test); and confirmatory factor analysis using diagonally weighted least squares (appropriate for ordinal items) with maximum-likelihood estimates reported alongside as a stricter check. Fit was judged against conventional criteria (CFI/TLI ≥ 0.95, RMSEA ≤ 0.06–0.08) [44]. Equivalence of the Arabic and English responders was tested by comparing α values with Feldt's test [45], factor-loading similarity with Tucker's congruence coefficient [46], and adjusted mean differences.</w:t>
       </w:r>
     </w:p>
     <w:p>
@@ -3691,7 +3691,7 @@
         <w:rPr>
           <w:rFonts w:ascii="Times New Roman" w:hAnsi="Times New Roman"/>
         </w:rPr>
-        <w:t xml:space="preserve"> Pearson and Spearman correlations (bootstrapped 95% CIs) and partial correlations adjusted for covariates. Differences between dependent correlations (health anxiety with each CSS subscale) were tested with Williams' t [43]. Item-level correlations were computed for every SHAI item with the CSS total and every CSS item with the SHAI total.</w:t>
+        <w:t xml:space="preserve"> Pearson and Spearman correlations (bootstrapped 95% CIs) and partial correlations adjusted for covariates. Differences between dependent correlations (health anxiety with each CSS subscale) were tested with Williams' t [47]. Item-level correlations were computed for every SHAI item with the CSS total and every CSS item with the SHAI total.</w:t>
       </w:r>
     </w:p>
     <w:p>
@@ -3731,7 +3731,7 @@
         <w:rPr>
           <w:rFonts w:ascii="Times New Roman" w:hAnsi="Times New Roman"/>
         </w:rPr>
-        <w:t xml:space="preserve"> because many associations were tested, p-values within each family of tests were adjusted with the Benjamini–Hochberg false discovery rate procedure (q-values) [44]. Unadjusted p-values are reported, and associations that do not survive correction are labelled as exploratory.</w:t>
+        <w:t xml:space="preserve"> because many associations were tested, p-values within each family of tests were adjusted with the Benjamini–Hochberg false discovery rate procedure (q-values) [48]. Unadjusted p-values are reported, and associations that do not survive correction are labelled as exploratory.</w:t>
       </w:r>
     </w:p>
     <w:p>
@@ -3771,7 +3771,7 @@
         <w:rPr>
           <w:rFonts w:ascii="Times New Roman" w:hAnsi="Times New Roman"/>
         </w:rPr>
-        <w:t xml:space="preserve"> mediation models with bootstrap confidence intervals (5000 resamples) tested whether excessive searching mediated the link between health anxiety and post-search distress, and related pathways, including a reverse-direction model and a serial model [45]. Moderation of the SHAI–CSS association by trust, AI use, health background, gender, chronic disease, language and age was tested with interaction terms and simple slopes.</w:t>
+        <w:t xml:space="preserve"> mediation models with bootstrap confidence intervals (5000 resamples) tested whether excessive searching mediated the link between health anxiety and post-search distress, and related pathways, including a reverse-direction model and a serial model [49]. Moderation of the SHAI–CSS association by trust, AI use, health background, gender, chronic disease, language and age was tested with interaction terms and simple slopes.</w:t>
       </w:r>
     </w:p>
     <w:p>
@@ -24120,7 +24120,7 @@
         <w:rPr>
           <w:rFonts w:ascii="Times New Roman" w:hAnsi="Times New Roman"/>
         </w:rPr>
-        <w:t xml:space="preserve">The observed correlation (r = 0.47) confirms H1 and H2 but is weaker than the pooled estimates of about 0.62–0.63 from meta-analyses [17,18]. Several explanations are plausible. Our sample had relatively low health anxiety (mean SHAI 12.3) and a narrow range in which correlations are attenuated; recruitment through online channels may have favoured confident, habitual Internet users for whom searching is routine rather than alarming; and most previous studies used the full 33-item CSS, whose distress and reassurance items overlap more with health anxiety. The pattern across dimensions is also informative. Distress and excessiveness, the dimensions closest to the cognitive model of health anxiety, were most strongly related to SHAI, while compulsion (interference with work and social life) was rare and only weakly related, consistent with the subscale range reported previously [18]. At item level, it was the </w:t>
+        <w:t xml:space="preserve">The observed correlation (r = 0.47) confirms H1 and H2 but is weaker than the pooled estimates of about 0.62–0.63 from meta-analyses [18,19]. Several explanations are plausible. Our sample had relatively low health anxiety (mean SHAI 12.3) and a narrow range in which correlations are attenuated; recruitment through online channels may have favoured confident, habitual Internet users for whom searching is routine rather than alarming; and most previous studies used the full 33-item CSS, whose distress and reassurance items overlap more with health anxiety. The pattern across dimensions is also informative. Distress and excessiveness, the dimensions closest to the cognitive model of health anxiety, were most strongly related to SHAI, while compulsion (interference with work and social life) was rare and only weakly related, consistent with the subscale range reported previously [19]. At item level, it was the </w:t>
       </w:r>
       <w:r>
         <w:rPr>
@@ -24146,7 +24146,7 @@
         <w:rPr>
           <w:rFonts w:ascii="Times New Roman" w:hAnsi="Times New Roman"/>
         </w:rPr>
-        <w:t xml:space="preserve"> of serious illness, not mere awareness of bodily sensations, that tracked cyberchondria. This supports the view that cyberchondria is driven by catastrophic appraisal rather than by bodily vigilance itself [5,19].</w:t>
+        <w:t xml:space="preserve"> of serious illness, not mere awareness of bodily sensations, that tracked cyberchondria. This supports the view that cyberchondria is driven by catastrophic appraisal rather than by bodily vigilance itself [5,20].</w:t>
       </w:r>
     </w:p>
     <w:p>
@@ -24159,7 +24159,7 @@
         <w:rPr>
           <w:rFonts w:ascii="Times New Roman" w:hAnsi="Times New Roman"/>
         </w:rPr>
-        <w:t>The prevalence of clinically relevant health anxiety (19% at SHAI ≥ 18) should be interpreted cautiously. The cut-off was derived against healthy controls in Sweden [38]; it is not a diagnosis, and prevalence ranged from 7% to 33% across plausible cut-offs. Nevertheless, it indicates that a substantial minority of digitally active adults in Baghdad experience health worry at a level that would warrant clinical attention, consistent with high rates of health anxiety reported in Iraq during the pandemic [8].</w:t>
+        <w:t>The prevalence of clinically relevant health anxiety (19% at SHAI ≥ 18) should be interpreted cautiously. The cut-off was derived against healthy controls in Sweden [42]; it is not a diagnosis, and prevalence ranged from 7% to 33% across plausible cut-offs. Nevertheless, it indicates that a substantial minority of digitally active adults in Baghdad experience health worry at a level that would warrant clinical attention, consistent with high rates of health anxiety reported in Iraq during the pandemic [8].</w:t>
       </w:r>
     </w:p>
     <w:p>
@@ -24180,7 +24180,7 @@
         <w:rPr>
           <w:rFonts w:ascii="Times New Roman" w:hAnsi="Times New Roman"/>
         </w:rPr>
-        <w:t xml:space="preserve">The mediation results are consistent with the reinforcing cycle proposed by cognitive-behavioural models and by the longitudinal Dutch study [5,20]: people with higher health anxiety search more, more searching goes with more distress, and distress goes with more reassurance seeking from doctors. That the direct effect of health anxiety on reassurance seeking disappeared once post-search distress was accounted for suggests that online searching may be one route by which health anxiety is turned into healthcare use. However, these results must not be over-interpreted. In cross-sectional data, mediation tests are tests of a hypothesised ordering, not of causation, and they can be seriously biased estimates of longitudinal processes [46]. Our reverse-direction model (searching → distress → health anxiety) was equally significant, which is exactly what one would expect if the relationship is bidirectional, but also what one would expect if both constructs simply share variance. In addition, the mediators and outcomes in models A–C are subscales of the same instrument, so part of their association reflects shared method variance. The appropriate conclusion is that our data are </w:t>
+        <w:t xml:space="preserve">The mediation results are consistent with the reinforcing cycle proposed by cognitive-behavioural models and by the longitudinal Dutch study [5,21]: people with higher health anxiety search more, more searching goes with more distress, and distress goes with more reassurance seeking from doctors. That the direct effect of health anxiety on reassurance seeking disappeared once post-search distress was accounted for suggests that online searching may be one route by which health anxiety is turned into healthcare use. However, these results must not be over-interpreted. In cross-sectional data, mediation tests are tests of a hypothesised ordering, not of causation, and they can be seriously biased estimates of longitudinal processes [50]. Our reverse-direction model (searching → distress → health anxiety) was equally significant, which is exactly what one would expect if the relationship is bidirectional, but also what one would expect if both constructs simply share variance. In addition, the mediators and outcomes in models A–C are subscales of the same instrument, so part of their association reflects shared method variance. The appropriate conclusion is that our data are </w:t>
       </w:r>
       <w:r>
         <w:rPr>
@@ -24227,7 +24227,7 @@
         <w:rPr>
           <w:rFonts w:ascii="Times New Roman" w:hAnsi="Times New Roman"/>
         </w:rPr>
-        <w:t>The dominance of AI chatbots (88.7%) is a new finding and contrasts with a 2024 US survey in which about one in five respondents reported using ChatGPT for health information [26]. Our sample was young and highly educated, which partly explains the difference: AI use fell from 96% in those aged 18–19 to 72% in those aged 40 and over. AI users had higher cyberchondria, and AI use remained an independent predictor after adjustment for health anxiety, age, occupation and other tools. The effect was concentrated in excessiveness and reassurance seeking. Two interpretations are possible. Because LLM chatbots answer in fluent, personalised and empathetic language [24,25], they may invite repeated, conversational querying (asking "one more question"), which is the behavioural core of the excessiveness dimension. Alternatively, people who already search more heavily may simply have adopted every available tool, so that AI use marks intensity rather than causes it. The comparison group of non-users was small (n = 34) and older, the association disappeared when the 32 respondents with inconsistent answers about AI use were classed as non-users, and AI use did not modify the strength of the health anxiety–cyberchondria link. On current evidence, AI chatbots appear to be a new channel for, rather than a qualitatively different driver of, cyberchondria, which is consistent with observations that health-anxious people are over-represented among users of digital symptom checkers [27].</w:t>
+        <w:t>The dominance of AI chatbots (88.7%) is a new finding and contrasts with a 2024 US survey in which about one in five respondents reported using ChatGPT for health information [27]. Our sample was young and highly educated, which partly explains the difference: AI use fell from 96% in those aged 18–19 to 72% in those aged 40 and over. AI users had higher cyberchondria, and AI use remained an independent predictor after adjustment for health anxiety, age, occupation and other tools. The effect was concentrated in excessiveness and reassurance seeking. Two interpretations are possible. Because LLM chatbots answer in fluent, personalised and empathetic language [25,26], they may invite repeated, conversational querying (asking "one more question"), which is the behavioural core of the excessiveness dimension. Alternatively, people who already search more heavily may simply have adopted every available tool, so that AI use marks intensity rather than causes it. The comparison group of non-users was small (n = 34) and older, the association disappeared when the 32 respondents with inconsistent answers about AI use were classed as non-users, and AI use did not modify the strength of the health anxiety–cyberchondria link. The level of AI use in our sample resembles that of young Turkish dermatology outpatients (61%), in whom pre-visit AI consultation mainly confirmed an existing decision to seek care and was not associated with increased anxiety [30]; in a large Czech sample, health anxiety was linked to AI use only through trust [29], whereas in our data trust was unrelated to health anxiety. On current evidence, AI chatbots appear to be a new channel for, rather than a qualitatively different driver of, cyberchondria, which is consistent with observations that health-anxious people are over-represented among users of digital symptom checkers [28].</w:t>
       </w:r>
     </w:p>
     <w:p>
@@ -24240,7 +24240,7 @@
         <w:rPr>
           <w:rFonts w:ascii="Times New Roman" w:hAnsi="Times New Roman"/>
         </w:rPr>
-        <w:t>Trust in online and AI information was mostly moderate and was associated with excessive searching but not with distress. Higher trust was also associated with lower odds of consulting several doctors, suggesting that trusted AI answers may substitute for some "doctor shopping". This is potentially beneficial for health services, but it is also where false reassurance becomes a risk.</w:t>
+        <w:t>Trust in online and AI information was mostly moderate and was associated with excessive searching but not with distress. Higher trust was also associated with lower odds of consulting several doctors, suggesting that trusted AI answers may substitute for some "doctor shopping". This is potentially beneficial for health services, but it is also where false reassurance becomes a risk: higher trust showed a non-significant trend towards delaying care because of reassurance (AOR = 1.33, p = 0.088), echoing a multinational study from the Middle East and North Africa in which trust in online information strongly predicted delayed consultation [34].</w:t>
       </w:r>
     </w:p>
     <w:p>
@@ -24274,7 +24274,7 @@
         <w:rPr>
           <w:rFonts w:ascii="Times New Roman" w:hAnsi="Times New Roman"/>
         </w:rPr>
-        <w:t>The disclosure findings are clinically important. Almost a third of participants never told their doctor about their searches, for fear of being judged or dismissed, and those with higher health anxiety were more likely to conceal searching, whereas those with higher cyberchondria were more likely to disclose it. One interpretation is that health-anxious patients anticipate being labelled as "worried well" and hide their searching, while patients for whom searching is a dominant behaviour bring their findings to the consultation as part of reassurance seeking. Concealment matters because online information discussed openly can strengthen the doctor–patient relationship, whereas undisclosed information is more likely to undermine it [28]. One in three participants reported that searching had complicated their relationship with or reduced their trust in physicians, and this was more likely at higher levels of cyberchondria.</w:t>
+        <w:t>The disclosure findings are clinically important. Almost a third of participants never told their doctor about their searches, for fear of being judged or dismissed, and those with higher health anxiety were more likely to conceal searching, whereas those with higher cyberchondria were more likely to disclose it. One interpretation is that health-anxious patients anticipate being labelled as "worried well" and hide their searching, while patients for whom searching is a dominant behaviour bring their findings to the consultation as part of reassurance seeking. Concealment matters because online information discussed openly can strengthen the doctor–patient relationship, whereas undisclosed information is more likely to undermine it [31]. One in three participants reported that searching had complicated their relationship with or reduced their trust in physicians, and this was more likely at higher levels of cyberchondria.</w:t>
       </w:r>
     </w:p>
     <w:p>
@@ -24295,7 +24295,7 @@
         <w:rPr>
           <w:rFonts w:ascii="Times New Roman" w:hAnsi="Times New Roman"/>
         </w:rPr>
-        <w:t>Medical students had higher unadjusted health anxiety than non-health employees, but this difference disappeared after adjustment, largely reflecting their younger age; age was an independent predictor of clinically relevant health anxiety. The SHAI–CSS correlation tended to be stronger among medical students. This is compatible with the idea of "medical student syndrome", but evidence for that concept is weak [47], and our data suggest that medical knowledge does not protect against cyberchondria (medical students' CSS scores were identical to those of other participants).</w:t>
+        <w:t>Medical students had higher unadjusted health anxiety than non-health employees, but this difference disappeared after adjustment, largely reflecting their younger age; age was an independent predictor of clinically relevant health anxiety. The SHAI–CSS correlation tended to be stronger among medical students. This is compatible with the idea of "medical student syndrome", but evidence for that concept is weak [51], and our data suggest that medical knowledge does not protect against cyberchondria (medical students' CSS scores were identical to those of other participants).</w:t>
       </w:r>
     </w:p>
     <w:p>
@@ -24316,7 +24316,7 @@
         <w:rPr>
           <w:rFonts w:ascii="Times New Roman" w:hAnsi="Times New Roman"/>
         </w:rPr>
-        <w:t>Our findings are in line with emerging Arab-region data. In Jeddah, cyberchondria was common and associated with smartphone addiction [29]; among Saudi primary-care patients, cyberchondria had a positive effect on health anxiety in structural models [30]; and the Arabic CSS-12 showed a structure similar to ours in Lebanon [14]. The good fit of the four-factor CSS-12 and the comparable reliability across Arabic and English responders add to the evidence that the instrument functions well in Arabic-speaking populations.</w:t>
+        <w:t>Our findings are in line with emerging Arab-region data. In Jeddah, cyberchondria was common and associated with smartphone addiction [32]; among Saudi primary-care patients, cyberchondria had a positive effect on health anxiety in structural models [33]; and the Arabic CSS-12 showed a structure similar to ours in Lebanon [15]. The good fit of the four-factor CSS-12 and the comparable reliability across Arabic and English responders add to the evidence that the instrument functions well in Arabic-speaking populations.</w:t>
       </w:r>
     </w:p>
     <w:p>
@@ -24755,7 +24755,7 @@
         <w:rPr>
           <w:rFonts w:ascii="Times New Roman" w:hAnsi="Times New Roman"/>
         </w:rPr>
-        <w:t>Conduct longitudinal or experience-sampling studies to test whether health anxiety and cyberchondria reinforce each other over time, and experimental studies comparing AI chatbot and search-engine answers on post-search anxiety.</w:t>
+        <w:t>Develop and test interventions: ClinicalTrials.gov lists only nine registered studies on cyberchondria (October 2026), none in Iraq and almost all observational [52], so trials of brief digital health-literacy or cognitive-behavioural interventions in Arabic are a clear gap.</w:t>
       </w:r>
     </w:p>
     <w:p>
@@ -24768,7 +24768,7 @@
         <w:rPr>
           <w:rFonts w:ascii="Times New Roman" w:hAnsi="Times New Roman"/>
         </w:rPr>
-        <w:t>Use probability sampling of the general Baghdad population, including older and less-educated adults, and validate the Arabic SHAI-14 and CSS-12 formally (forward–backward translation, measurement invariance and clinical cut-offs).</w:t>
+        <w:t>Conduct longitudinal or experience-sampling studies to test whether health anxiety and cyberchondria reinforce each other over time, and experimental studies comparing AI chatbot and search-engine answers on post-search anxiety.</w:t>
       </w:r>
     </w:p>
     <w:p>
@@ -24781,6 +24781,19 @@
         <w:rPr>
           <w:rFonts w:ascii="Times New Roman" w:hAnsi="Times New Roman"/>
         </w:rPr>
+        <w:t>Use probability sampling of the general Baghdad population, including older and less-educated adults, and validate the Arabic SHAI-14 and CSS-12 formally (forward–backward translation, measurement invariance and clinical cut-offs).</w:t>
+      </w:r>
+    </w:p>
+    <w:p>
+      <w:pPr>
+        <w:pStyle w:val="ListBullet"/>
+        <w:spacing w:after="60"/>
+        <w:jc w:val="both"/>
+      </w:pPr>
+      <w:r>
+        <w:rPr>
+          <w:rFonts w:ascii="Times New Roman" w:hAnsi="Times New Roman"/>
+        </w:rPr>
         <w:t>Link self-reported behaviours to objective healthcare utilisation and clinical outcomes, especially delayed diagnosis following false reassurance.</w:t>
       </w:r>
     </w:p>
@@ -24879,7 +24892,7 @@
         </w:rPr>
         <w:t>6.</w:t>
         <w:tab/>
-        <w:t>Sunderland M, Newby JM, Andrews G. Health anxiety in Australia: prevalence, comorbidity, disability and service use. Br J Psychiatry. 2013;202:56-61.</w:t>
+        <w:t>Sunderland M, Newby JM, Andrews G. Health anxiety in Australia: prevalence, comorbidity, disability and service use. Br J Psychiatry. 2013;202(1):56-61. doi:10.1192/bjp.bp.111.103960</w:t>
       </w:r>
     </w:p>
     <w:p>
@@ -24924,7 +24937,7 @@
         </w:rPr>
         <w:t>9.</w:t>
         <w:tab/>
-        <w:t>Starcevic V. Cyberchondria: challenges of problematic online searches for health-related information. Psychother Psychosom. 2017;86(3):129-33.</w:t>
+        <w:t>Taha PH. Home quarantine induced health anxiety during the beginning of the COVID-19 pandemic: evidence from Iraq. Disaster Med Public Health Prep. 2021;17:e26. doi:10.1017/dmp.2021.242</w:t>
       </w:r>
     </w:p>
     <w:p>
@@ -24939,7 +24952,7 @@
         </w:rPr>
         <w:t>10.</w:t>
         <w:tab/>
-        <w:t>Starcevic V, Berle D, Arnáez S. Recent insights into cyberchondria. Curr Psychiatry Rep. 2020;22(11):56. doi:10.1007/s11920-020-01179-8</w:t>
+        <w:t>Starcevic V. Cyberchondria: challenges of problematic online searches for health-related information. Psychother Psychosom. 2017;86(3):129-33. doi:10.1159/000465525</w:t>
       </w:r>
     </w:p>
     <w:p>
@@ -24954,7 +24967,7 @@
         </w:rPr>
         <w:t>11.</w:t>
         <w:tab/>
-        <w:t>Vismara M, Caricasole V, Starcevic V, Cinosi E, Dell'Osso B, Martinotti G, et al. Is cyberchondria a new transdiagnostic digital compulsive syndrome? A systematic review of the evidence. Compr Psychiatry. 2020;99:152167. doi:10.1016/j.comppsych.2020.152167</w:t>
+        <w:t>Starcevic V, Berle D, Arnáez S. Recent insights into cyberchondria. Curr Psychiatry Rep. 2020;22(11):56. doi:10.1007/s11920-020-01179-8</w:t>
       </w:r>
     </w:p>
     <w:p>
@@ -24969,7 +24982,7 @@
         </w:rPr>
         <w:t>12.</w:t>
         <w:tab/>
-        <w:t>McElroy E, Shevlin M. The development and initial validation of the cyberchondria severity scale (CSS). J Anxiety Disord. 2014;28(2):259-65. doi:10.1016/j.janxdis.2013.12.007</w:t>
+        <w:t>Vismara M, Caricasole V, Starcevic V, Cinosi E, Dell'Osso B, Martinotti G, et al. Is cyberchondria a new transdiagnostic digital compulsive syndrome? A systematic review of the evidence. Compr Psychiatry. 2020;99:152167. doi:10.1016/j.comppsych.2020.152167</w:t>
       </w:r>
     </w:p>
     <w:p>
@@ -24984,7 +24997,7 @@
         </w:rPr>
         <w:t>13.</w:t>
         <w:tab/>
-        <w:t>McElroy E, Kearney M, Touhey J, Evans J, Cooke Y, Shevlin M. The CSS-12: development and validation of a short-form version of the cyberchondria severity scale. Cyberpsychol Behav Soc Netw. 2019;22(5):330-5. doi:10.1089/cyber.2018.0624</w:t>
+        <w:t>McElroy E, Shevlin M. The development and initial validation of the cyberchondria severity scale (CSS). J Anxiety Disord. 2014;28(2):259-65. doi:10.1016/j.janxdis.2013.12.007</w:t>
       </w:r>
     </w:p>
     <w:p>
@@ -24999,7 +25012,7 @@
         </w:rPr>
         <w:t>14.</w:t>
         <w:tab/>
-        <w:t>Hallit S, Rogoza R, Abi Semaan C, Azzi V, Sawma T, Obeid S. Validation of the Arabic version of the cyberchondria severity scale 12 items (CSS-12-Ar) among a sample of Lebanese adults. BMC Psychiatry. 2023;23:618. doi:10.1186/s12888-023-05123-x</w:t>
+        <w:t>McElroy E, Kearney M, Touhey J, Evans J, Cooke Y, Shevlin M. The CSS-12: development and validation of a short-form version of the cyberchondria severity scale. Cyberpsychol Behav Soc Netw. 2019;22(5):330-5. doi:10.1089/cyber.2018.0624</w:t>
       </w:r>
     </w:p>
     <w:p>
@@ -25014,7 +25027,7 @@
         </w:rPr>
         <w:t>15.</w:t>
         <w:tab/>
-        <w:t>Muse K, McManus F, Leung C, Meghreblian B, Williams JMG. Cyberchondriasis: fact or fiction? A preliminary examination of the relationship between health anxiety and searching for health information on the Internet. J Anxiety Disord. 2012;26(1):189-96. doi:10.1016/j.janxdis.2011.11.005</w:t>
+        <w:t>Hallit S, Rogoza R, Abi Semaan C, Azzi V, Sawma T, Obeid S. Validation of the Arabic version of the cyberchondria severity scale 12 items (CSS-12-Ar) among a sample of Lebanese adults. BMC Psychiatry. 2023;23(1):618. doi:10.1186/s12888-023-05123-x</w:t>
       </w:r>
     </w:p>
     <w:p>
@@ -25029,7 +25042,7 @@
         </w:rPr>
         <w:t>16.</w:t>
         <w:tab/>
-        <w:t>Doherty-Torstrick ER, Walton KE, Fallon BA. Cyberchondria: parsing health anxiety from online behavior. Psychosomatics. 2016;57(4):390-400.</w:t>
+        <w:t>Muse K, McManus F, Leung C, Meghreblian B, Williams JMG. Cyberchondriasis: fact or fiction? A preliminary examination of the relationship between health anxiety and searching for health information on the Internet. J Anxiety Disord. 2012;26(1):189-96. doi:10.1016/j.janxdis.2011.11.005</w:t>
       </w:r>
     </w:p>
     <w:p>
@@ -25044,7 +25057,7 @@
         </w:rPr>
         <w:t>17.</w:t>
         <w:tab/>
-        <w:t>McMullan RD, Berle D, Arnáez S, Starcevic V. The relationships between health anxiety, online health information seeking, and cyberchondria: systematic review and meta-analysis. J Affect Disord. 2019;245:270-8. doi:10.1016/j.jad.2018.11.037</w:t>
+        <w:t>Doherty-Torstrick ER, Walton KE, Fallon BA. Cyberchondria: parsing health anxiety from online behavior. Psychosomatics. 2016;57(4):390-400. doi:10.1016/j.psym.2016.02.002</w:t>
       </w:r>
     </w:p>
     <w:p>
@@ -25059,7 +25072,7 @@
         </w:rPr>
         <w:t>18.</w:t>
         <w:tab/>
-        <w:t>Schenkel SK, Jungmann SM, Gropalis M, Witthöft M. Conceptualizations of cyberchondria and relations to the anxiety spectrum: systematic review and meta-analysis. J Med Internet Res. 2021;23(11):e27835. doi:10.2196/27835</w:t>
+        <w:t>McMullan RD, Berle D, Arnáez S, Starcevic V. The relationships between health anxiety, online health information seeking, and cyberchondria: systematic review and meta-analysis. J Affect Disord. 2019;245:270-8. doi:10.1016/j.jad.2018.11.037</w:t>
       </w:r>
     </w:p>
     <w:p>
@@ -25074,7 +25087,7 @@
         </w:rPr>
         <w:t>19.</w:t>
         <w:tab/>
-        <w:t>Fergus TA. Cyberchondria and intolerance of uncertainty: examining when individuals experience health anxiety in response to Internet searches for medical information. Cyberpsychol Behav Soc Netw. 2013;16(10):735-9. doi:10.1089/cyber.2012.0671</w:t>
+        <w:t>Schenkel SK, Jungmann SM, Gropalis M, Witthöft M. Conceptualizations of cyberchondria and relations to the anxiety spectrum: systematic review and meta-analysis. J Med Internet Res. 2021;23(11):e27835. doi:10.2196/27835</w:t>
       </w:r>
     </w:p>
     <w:p>
@@ -25089,7 +25102,7 @@
         </w:rPr>
         <w:t>20.</w:t>
         <w:tab/>
-        <w:t>te Poel F, Baumgartner SE, Hartmann T, Tanis M. The curious case of cyberchondria: a longitudinal study on the reciprocal relationship between health anxiety and online health information seeking. J Anxiety Disord. 2016;43:32-40. doi:10.1016/j.janxdis.2016.07.009</w:t>
+        <w:t>Fergus TA. Cyberchondria and intolerance of uncertainty: examining when individuals experience health anxiety in response to Internet searches for medical information. Cyberpsychol Behav Soc Netw. 2013;16(10):735-9. doi:10.1089/cyber.2012.0671</w:t>
       </w:r>
     </w:p>
     <w:p>
@@ -25104,7 +25117,7 @@
         </w:rPr>
         <w:t>21.</w:t>
         <w:tab/>
-        <w:t>Jokic-Begic N, Lauri Korajlija A, Mikac U. Cyberchondria in the age of COVID-19. PLoS One. 2020;15(12):e0243704. doi:10.1371/journal.pone.0243704</w:t>
+        <w:t>te Poel F, Baumgartner SE, Hartmann T, Tanis M. The curious case of cyberchondria: a longitudinal study on the reciprocal relationship between health anxiety and online health information seeking. J Anxiety Disord. 2016;43:32-40. doi:10.1016/j.janxdis.2016.07.009</w:t>
       </w:r>
     </w:p>
     <w:p>
@@ -25119,7 +25132,7 @@
         </w:rPr>
         <w:t>22.</w:t>
         <w:tab/>
-        <w:t>Kurcer MA, Erdogan Z, Cakir Kardes V. The effect of the COVID-19 pandemic on health anxiety and cyberchondria levels of university students. Perspect Psychiatr Care. 2022;58(1):132-40. doi:10.1111/ppc.12850</w:t>
+        <w:t>Jokic-Begic N, Lauri Korajlija A, Mikac U. Cyberchondria in the age of COVID-19. PLoS One. 2020;15(12):e0243704. doi:10.1371/journal.pone.0243704</w:t>
       </w:r>
     </w:p>
     <w:p>
@@ -25134,7 +25147,7 @@
         </w:rPr>
         <w:t>23.</w:t>
         <w:tab/>
-        <w:t>Miezah D, Adzakpa R, Bani EMA, Obeng P. Prevalence and associated factors of cyberchondria: a scoping review. ScientificWorldJournal. 2026. doi:10.1155/tswj/9950027</w:t>
+        <w:t>Kurcer MA, Erdogan Z, Cakir Kardes V. The effect of the COVID-19 pandemic on health anxiety and cyberchondria levels of university students. Perspect Psychiatr Care. 2022;58(1):132-40. doi:10.1111/ppc.12850</w:t>
       </w:r>
     </w:p>
     <w:p>
@@ -25149,7 +25162,7 @@
         </w:rPr>
         <w:t>24.</w:t>
         <w:tab/>
-        <w:t>Thirunavukarasu AJ, Ting DSJ, Elangovan K, Gutierrez L, Tan TF, Ting DSW. Large language models in medicine. Nat Med. 2023;29(8):1930-40. doi:10.1038/s41591-023-02448-8</w:t>
+        <w:t>Miezah D, Adzakpa R, Bani EMA, Obeng P. Prevalence and associated factors of cyberchondria: a scoping review. ScientificWorldJournal. 2026;2026:9950027. doi:10.1155/tswj/9950027</w:t>
       </w:r>
     </w:p>
     <w:p>
@@ -25164,7 +25177,7 @@
         </w:rPr>
         <w:t>25.</w:t>
         <w:tab/>
-        <w:t>Ayers JW, Poliak A, Dredze M, Leas EC, Zhu Z, Kelley JB, et al. Comparing physician and artificial intelligence chatbot responses to patient questions posted to a public social media forum. JAMA Intern Med. 2023;183(6):589-96. doi:10.1001/jamainternmed.2023.1838</w:t>
+        <w:t>Thirunavukarasu AJ, Ting DSJ, Elangovan K, Gutierrez L, Tan TF, Ting DSW. Large language models in medicine. Nat Med. 2023;29(8):1930-40. doi:10.1038/s41591-023-02448-8</w:t>
       </w:r>
     </w:p>
     <w:p>
@@ -25179,7 +25192,7 @@
         </w:rPr>
         <w:t>26.</w:t>
         <w:tab/>
-        <w:t>Ayo-Ajibola O, Davis RJ, Lin ME, Riddell J, Kravitz RL. Characterizing the adoption and experiences of users of artificial intelligence-generated health information in the United States: cross-sectional questionnaire study. J Med Internet Res. 2024;26:e55138. doi:10.2196/55138</w:t>
+        <w:t>Ayers JW, Poliak A, Dredze M, Leas EC, Zhu Z, Kelley JB, et al. Comparing physician and artificial intelligence chatbot responses to patient questions posted to a public social media forum. JAMA Intern Med. 2023;183(6):589-96. doi:10.1001/jamainternmed.2023.1838</w:t>
       </w:r>
     </w:p>
     <w:p>
@@ -25194,7 +25207,7 @@
         </w:rPr>
         <w:t>27.</w:t>
         <w:tab/>
-        <w:t>Wetzel AJ, et al. Only the anxious ones? Identifying characteristics of symptom checker app users: a cross-sectional survey. BMC Med Inform Decis Mak. 2024;24. doi:10.1186/s12911-024-02430-5</w:t>
+        <w:t>Ayo-Ajibola O, Davis RJ, Lin ME, Riddell J, Kravitz RL. Characterizing the adoption and experiences of users of artificial intelligence-generated health information in the United States: cross-sectional questionnaire study. J Med Internet Res. 2024;26:e55138. doi:10.2196/55138</w:t>
       </w:r>
     </w:p>
     <w:p>
@@ -25209,7 +25222,7 @@
         </w:rPr>
         <w:t>28.</w:t>
         <w:tab/>
-        <w:t>Tan SS, Goonawardene N. Internet health information seeking and the patient-physician relationship: a systematic review. J Med Internet Res. 2017;19(1):e9. doi:10.2196/jmir.5729</w:t>
+        <w:t>Wetzel AJ, Klemmt M, Müller R, Rieger MA, Joos S, Koch R. Only the anxious ones? Identifying characteristics of symptom checker app users: a cross-sectional survey. BMC Med Inform Decis Mak. 2024;24(1):21. doi:10.1186/s12911-024-02430-5</w:t>
       </w:r>
     </w:p>
     <w:p>
@@ -25224,7 +25237,7 @@
         </w:rPr>
         <w:t>29.</w:t>
         <w:tab/>
-        <w:t>El-Zayat A, Namnkani SA, Alshareef NA, Mustfa MM, Eminaga NS, Algarni GA. Cyberchondria and its association with smartphone addiction and electronic health literacy among a Saudi population. Saudi J Med Med Sci. 2023;11(2):162-8. doi:10.4103/sjmms.sjmms_491_22</w:t>
+        <w:t>Svestkova A, Huang Y, Smahel D. Factors that influence trust and willingness to use generative AI for health information: a cross-sectional study. Digit Health. 2025;11:20552076251360973. doi:10.1177/20552076251360973</w:t>
       </w:r>
     </w:p>
     <w:p>
@@ -25239,7 +25252,7 @@
         </w:rPr>
         <w:t>30.</w:t>
         <w:tab/>
-        <w:t>Pasay-an E, et al. "Dr. Google" consultation and health anxiety among primary healthcare patients: the mediation effect of health literacy. PLoS One. 2025;20(10):e0325791. doi:10.1371/journal.pone.0325791</w:t>
+        <w:t>Dığış M, Kaya K, Demir B, Çiçek İN, Akdağ D, Akdağ Ş. Frequency of use and attitudes toward AI-based health counseling among patients attending the dermatology outpatient clinic: a cross-sectional study. Cutan Ocul Toxicol. 2026:1-11. doi:10.1080/15569527.2026.2711643</w:t>
       </w:r>
     </w:p>
     <w:p>
@@ -25254,7 +25267,7 @@
         </w:rPr>
         <w:t>31.</w:t>
         <w:tab/>
-        <w:t>von Elm E, Altman DG, Egger M, Pocock SJ, Gøtzsche PC, Vandenbroucke JP. The Strengthening the Reporting of Observational Studies in Epidemiology (STROBE) statement: guidelines for reporting observational studies. Lancet. 2007;370(9596):1453-7.</w:t>
+        <w:t>Tan SS, Goonawardene N. Internet health information seeking and the patient-physician relationship: a systematic review. J Med Internet Res. 2017;19(1):e9. doi:10.2196/jmir.5729</w:t>
       </w:r>
     </w:p>
     <w:p>
@@ -25269,7 +25282,7 @@
         </w:rPr>
         <w:t>32.</w:t>
         <w:tab/>
-        <w:t>Eysenbach G. Improving the quality of Web surveys: the Checklist for Reporting Results of Internet E-Surveys (CHERRIES). J Med Internet Res. 2004;6(3):e34. doi:10.2196/jmir.6.3.e34</w:t>
+        <w:t>El-Zayat A, Namnkani SA, Alshareef NA, Mustfa MM, Eminaga NS, Algarni GA. Cyberchondria and its association with smartphone addiction and electronic health literacy among a Saudi population. Saudi J Med Med Sci. 2023;11(2):162-8. doi:10.4103/sjmms.sjmms_491_22</w:t>
       </w:r>
     </w:p>
     <w:p>
@@ -25284,7 +25297,7 @@
         </w:rPr>
         <w:t>33.</w:t>
         <w:tab/>
-        <w:t>Cohen J. Statistical power analysis for the behavioral sciences. 2nd ed. Hillsdale (NJ): Lawrence Erlbaum Associates; 1988.</w:t>
+        <w:t>Pasay-An E, Alalawi RH, Shanmugam SR, Alshammari SA, Alreshidi MS, Alkubati S, et al. "Dr. Google" consultation and health anxiety among primary healthcare patients: the mediation effect of health literacy. PLoS One. 2025;20(10):e0325791. doi:10.1371/journal.pone.0325791</w:t>
       </w:r>
     </w:p>
     <w:p>
@@ -25299,7 +25312,7 @@
         </w:rPr>
         <w:t>34.</w:t>
         <w:tab/>
-        <w:t>Salkovskis PM, Rimes KA, Warwick HMC, Clark DM. The Health Anxiety Inventory: development and validation of scales for the measurement of health anxiety and hypochondriasis. Psychol Med. 2002;32(5):843-53.</w:t>
+        <w:t>Dahshan A, Mahfouz Khalil MI, Abdelfatah D, Abu Ejheisheh M, Alshammari MSH, Mekdad AK, et al. Influence of online health information and artificial intelligence on decision-making among migraine patients: a multinational cross-sectional study from the MENA region. Cephalalgia. 2026;46(4):3331024261435594. doi:10.1177/03331024261435594</w:t>
       </w:r>
     </w:p>
     <w:p>
@@ -25314,7 +25327,7 @@
         </w:rPr>
         <w:t>35.</w:t>
         <w:tab/>
-        <w:t>Abramowitz JS, Deacon BJ, Valentiner DP. The Short Health Anxiety Inventory: psychometric properties and construct validity in a non-clinical sample. Cognit Ther Res. 2007;31(6):871-83.</w:t>
+        <w:t>von Elm E, Altman DG, Egger M, Pocock SJ, Gøtzsche PC, Vandenbroucke JP. The Strengthening the Reporting of Observational Studies in Epidemiology (STROBE) statement: guidelines for reporting observational studies. Lancet. 2007;370(9596):1453-7.</w:t>
       </w:r>
     </w:p>
     <w:p>
@@ -25329,7 +25342,7 @@
         </w:rPr>
         <w:t>36.</w:t>
         <w:tab/>
-        <w:t>Alberts NM, Hadjistavropoulos HD, Jones SL, Sharpe D. The Short Health Anxiety Inventory: a systematic review and meta-analysis. J Anxiety Disord. 2013;27(1):68-78. doi:10.1016/j.janxdis.2012.10.009</w:t>
+        <w:t>Eysenbach G. Improving the quality of Web surveys: the Checklist for Reporting Results of Internet E-Surveys (CHERRIES). J Med Internet Res. 2004;6(3):e34. doi:10.2196/jmir.6.3.e34</w:t>
       </w:r>
     </w:p>
     <w:p>
@@ -25344,7 +25357,7 @@
         </w:rPr>
         <w:t>37.</w:t>
         <w:tab/>
-        <w:t>Alshayea AK. Latent structure, measurement invariance, and reliability of an Arabic version of the Short Health Anxiety Inventory. J Exp Psychopathol. 2020;11(2). doi:10.1177/2043808720912629</w:t>
+        <w:t>Cohen J. Statistical power analysis for the behavioral sciences. 2nd ed. Hillsdale (NJ): Lawrence Erlbaum Associates; 1988.</w:t>
       </w:r>
     </w:p>
     <w:p>
@@ -25359,7 +25372,7 @@
         </w:rPr>
         <w:t>38.</w:t>
         <w:tab/>
-        <w:t>Österman S, Axelsson E, Lindefors N, Hedman-Lagerlöf E, Hedman-Lagerlöf M, Kern D, et al. The 14-item short health anxiety inventory (SHAI-14) used as a screening tool: appropriate interpretation and diagnostic accuracy of the Swedish version. BMC Psychiatry. 2022;22:701. doi:10.1186/s12888-022-04367-3</w:t>
+        <w:t>Salkovskis PM, Rimes KA, Warwick HMC, Clark DM. The Health Anxiety Inventory: development and validation of scales for the measurement of health anxiety and hypochondriasis. Psychol Med. 2002;32(5):843-53.</w:t>
       </w:r>
     </w:p>
     <w:p>
@@ -25374,7 +25387,7 @@
         </w:rPr>
         <w:t>39.</w:t>
         <w:tab/>
-        <w:t>Hayes AF, Coutts JJ. Use omega rather than Cronbach's alpha for estimating reliability. But… Commun Methods Meas. 2020;14(1):1-24.</w:t>
+        <w:t>Abramowitz JS, Deacon BJ, Valentiner DP. The Short Health Anxiety Inventory: psychometric properties and construct validity in a non-clinical sample. Cognit Ther Res. 2007;31(6):871-83.</w:t>
       </w:r>
     </w:p>
     <w:p>
@@ -25389,7 +25402,7 @@
         </w:rPr>
         <w:t>40.</w:t>
         <w:tab/>
-        <w:t>Hu L, Bentler PM. Cutoff criteria for fit indexes in covariance structure analysis: conventional criteria versus new alternatives. Struct Equ Modeling. 1999;6(1):1-55.</w:t>
+        <w:t>Alberts NM, Hadjistavropoulos HD, Jones SL, Sharpe D. The Short Health Anxiety Inventory: a systematic review and meta-analysis. J Anxiety Disord. 2013;27(1):68-78. doi:10.1016/j.janxdis.2012.10.009</w:t>
       </w:r>
     </w:p>
     <w:p>
@@ -25404,7 +25417,7 @@
         </w:rPr>
         <w:t>41.</w:t>
         <w:tab/>
-        <w:t>Feldt LS, Woodruff DJ, Salih FA. Statistical inference for coefficient alpha. Appl Psychol Meas. 1987;11(1):93-103.</w:t>
+        <w:t>Alshayea AK. Latent structure, measurement invariance, and reliability of an Arabic version of the Short Health Anxiety Inventory. J Exp Psychopathol. 2020;11(2). doi:10.1177/2043808720912629</w:t>
       </w:r>
     </w:p>
     <w:p>
@@ -25419,7 +25432,7 @@
         </w:rPr>
         <w:t>42.</w:t>
         <w:tab/>
-        <w:t>Lorenzo-Seva U, ten Berge JMF. Tucker's congruence coefficient as a meaningful index of factor similarity. Methodology. 2006;2(2):57-64.</w:t>
+        <w:t>Österman S, Axelsson E, Lindefors N, Hedman-Lagerlöf E, Hedman-Lagerlöf M, Kern D, et al. The 14-item short health anxiety inventory (SHAI-14) used as a screening tool: appropriate interpretation and diagnostic accuracy of the Swedish version. BMC Psychiatry. 2022;22:701. doi:10.1186/s12888-022-04367-3</w:t>
       </w:r>
     </w:p>
     <w:p>
@@ -25434,7 +25447,7 @@
         </w:rPr>
         <w:t>43.</w:t>
         <w:tab/>
-        <w:t>Steiger JH. Tests for comparing elements of a correlation matrix. Psychol Bull. 1980;87(2):245-51.</w:t>
+        <w:t>Hayes AF, Coutts JJ. Use omega rather than Cronbach's alpha for estimating reliability. But… Commun Methods Meas. 2020;14(1):1-24.</w:t>
       </w:r>
     </w:p>
     <w:p>
@@ -25449,7 +25462,7 @@
         </w:rPr>
         <w:t>44.</w:t>
         <w:tab/>
-        <w:t>Benjamini Y, Hochberg Y. Controlling the false discovery rate: a practical and powerful approach to multiple testing. J R Stat Soc Series B Stat Methodol. 1995;57(1):289-300.</w:t>
+        <w:t>Hu L, Bentler PM. Cutoff criteria for fit indexes in covariance structure analysis: conventional criteria versus new alternatives. Struct Equ Modeling. 1999;6(1):1-55.</w:t>
       </w:r>
     </w:p>
     <w:p>
@@ -25464,7 +25477,7 @@
         </w:rPr>
         <w:t>45.</w:t>
         <w:tab/>
-        <w:t>Hayes AF. Introduction to mediation, moderation, and conditional process analysis: a regression-based approach. 3rd ed. New York: Guilford Press; 2022.</w:t>
+        <w:t>Feldt LS, Woodruff DJ, Salih FA. Statistical inference for coefficient alpha. Appl Psychol Meas. 1987;11(1):93-103.</w:t>
       </w:r>
     </w:p>
     <w:p>
@@ -25479,7 +25492,7 @@
         </w:rPr>
         <w:t>46.</w:t>
         <w:tab/>
-        <w:t>Maxwell SE, Cole DA. Bias in cross-sectional analyses of longitudinal mediation. Psychol Methods. 2007;12(1):23-44.</w:t>
+        <w:t>Lorenzo-Seva U, ten Berge JMF. Tucker's congruence coefficient as a meaningful index of factor similarity. Methodology. 2006;2(2):57-64.</w:t>
       </w:r>
     </w:p>
     <w:p>
@@ -25494,7 +25507,82 @@
         </w:rPr>
         <w:t>47.</w:t>
         <w:tab/>
+        <w:t>Steiger JH. Tests for comparing elements of a correlation matrix. Psychol Bull. 1980;87(2):245-51.</w:t>
+      </w:r>
+    </w:p>
+    <w:p>
+      <w:pPr>
+        <w:spacing w:line="276" w:lineRule="auto" w:after="80"/>
+        <w:ind w:left="454" w:hanging="454"/>
+        <w:jc w:val="left"/>
+      </w:pPr>
+      <w:r>
+        <w:rPr>
+          <w:sz w:val="24"/>
+        </w:rPr>
+        <w:t>48.</w:t>
+        <w:tab/>
+        <w:t>Benjamini Y, Hochberg Y. Controlling the false discovery rate: a practical and powerful approach to multiple testing. J R Stat Soc Series B Stat Methodol. 1995;57(1):289-300.</w:t>
+      </w:r>
+    </w:p>
+    <w:p>
+      <w:pPr>
+        <w:spacing w:line="276" w:lineRule="auto" w:after="80"/>
+        <w:ind w:left="454" w:hanging="454"/>
+        <w:jc w:val="left"/>
+      </w:pPr>
+      <w:r>
+        <w:rPr>
+          <w:sz w:val="24"/>
+        </w:rPr>
+        <w:t>49.</w:t>
+        <w:tab/>
+        <w:t>Hayes AF. Introduction to mediation, moderation, and conditional process analysis: a regression-based approach. 3rd ed. New York: Guilford Press; 2022.</w:t>
+      </w:r>
+    </w:p>
+    <w:p>
+      <w:pPr>
+        <w:spacing w:line="276" w:lineRule="auto" w:after="80"/>
+        <w:ind w:left="454" w:hanging="454"/>
+        <w:jc w:val="left"/>
+      </w:pPr>
+      <w:r>
+        <w:rPr>
+          <w:sz w:val="24"/>
+        </w:rPr>
+        <w:t>50.</w:t>
+        <w:tab/>
+        <w:t>Maxwell SE, Cole DA. Bias in cross-sectional analyses of longitudinal mediation. Psychol Methods. 2007;12(1):23-44.</w:t>
+      </w:r>
+    </w:p>
+    <w:p>
+      <w:pPr>
+        <w:spacing w:line="276" w:lineRule="auto" w:after="80"/>
+        <w:ind w:left="454" w:hanging="454"/>
+        <w:jc w:val="left"/>
+      </w:pPr>
+      <w:r>
+        <w:rPr>
+          <w:sz w:val="24"/>
+        </w:rPr>
+        <w:t>51.</w:t>
+        <w:tab/>
         <w:t>Waterman LZ, Weinman JA. Medical student syndrome: fact or fiction? A cross-sectional study. JRSM Open. 2014;5(2). doi:10.1177/2042533313512480</w:t>
+      </w:r>
+    </w:p>
+    <w:p>
+      <w:pPr>
+        <w:spacing w:line="276" w:lineRule="auto" w:after="80"/>
+        <w:ind w:left="454" w:hanging="454"/>
+        <w:jc w:val="left"/>
+      </w:pPr>
+      <w:r>
+        <w:rPr>
+          <w:sz w:val="24"/>
+        </w:rPr>
+        <w:t>52.</w:t>
+        <w:tab/>
+        <w:t>ClinicalTrials.gov [Internet]. Bethesda (MD): National Library of Medicine (US). Search results for "cyberchondria"; [cited 2026 Oct 16]. Available from: https://clinicaltrials.gov/search?cond=cyberchondria</w:t>
       </w:r>
     </w:p>
     <w:p>

</xml_diff>

<commit_message>
Research: address external review - mediation b paths, elevated-HA label, hedged claims, refs
- Mediation: report b path adjusted for the predictor (indirect = a x b = c - c')
- SHAI >= 18 relabelled 'elevated' (not 'clinically relevant'); prevalence at 29 added
- Tool count uses the study's AI-user definition; Holm pairwise p reported
- Post-hoc power removed; abstract shortened and hedged; objectives cut to four
- Behavioural findings marked exploratory; H3/H4 verdicts stated
- Limitations: unused Arabic versions and response-option order
- ClinicalTrials.gov description corrected; missing DOIs and entry details added

Co-Authored-By: Claude Opus 5.5 <noreply@anthropic.com>
Claude-Session: https://claude.ai/code/session_0186tGPQJ67bKVgWZR7S3c4o
</commit_message>
<xml_diff>
--- a/research/output/Cyberchondria_Research_Baghdad.docx
+++ b/research/output/Cyberchondria_Research_Baghdad.docx
@@ -1069,7 +1069,7 @@
           <w:sz w:val="24"/>
         </w:rPr>
         <w:tab/>
-        <w:t>34</w:t>
+        <w:t>35</w:t>
       </w:r>
     </w:p>
     <w:p>
@@ -1115,7 +1115,7 @@
           <w:sz w:val="26"/>
         </w:rPr>
         <w:tab/>
-        <w:t>36</w:t>
+        <w:t>37</w:t>
       </w:r>
     </w:p>
     <w:p>
@@ -1138,7 +1138,7 @@
           <w:sz w:val="24"/>
         </w:rPr>
         <w:tab/>
-        <w:t>36</w:t>
+        <w:t>37</w:t>
       </w:r>
     </w:p>
     <w:p>
@@ -1161,7 +1161,7 @@
           <w:sz w:val="24"/>
         </w:rPr>
         <w:tab/>
-        <w:t>37</w:t>
+        <w:t>38</w:t>
       </w:r>
     </w:p>
     <w:p>
@@ -2233,7 +2233,7 @@
           <w:sz w:val="26"/>
         </w:rPr>
         <w:tab/>
-        <w:t>13</w:t>
+        <w:t>14</w:t>
       </w:r>
     </w:p>
     <w:p>
@@ -2350,7 +2350,7 @@
         <w:rPr>
           <w:sz w:val="26"/>
         </w:rPr>
-        <w:t>Variables significantly associated (p &lt; 0.05) with clinically relevant health anxiety and with high cyberchondria</w:t>
+        <w:t>Variables significantly associated (p &lt; 0.05) with elevated health anxiety and with high cyberchondria</w:t>
       </w:r>
       <w:r>
         <w:rPr>
@@ -2412,7 +2412,7 @@
         <w:rPr>
           <w:sz w:val="26"/>
         </w:rPr>
-        <w:t>Multivariable logistic regression of clinically relevant health anxiety (SHAI ≥ 18; 57 events, n = 300)</w:t>
+        <w:t>Multivariable logistic regression of elevated health anxiety (SHAI ≥ 18; 57 events, n = 300)</w:t>
       </w:r>
       <w:r>
         <w:rPr>
@@ -2680,7 +2680,7 @@
         <w:rPr>
           <w:sz w:val="26"/>
         </w:rPr>
-        <w:t>Adjusted odds ratios for clinically relevant health anxiety (SHAI ≥ 18). Orange: p &lt; 0.05.</w:t>
+        <w:t>Adjusted odds ratios for elevated health anxiety (SHAI ≥ 18). Orange: p &lt; 0.05.</w:t>
       </w:r>
       <w:r>
         <w:rPr>
@@ -2814,7 +2814,7 @@
         <w:rPr>
           <w:rFonts w:ascii="Times New Roman" w:hAnsi="Times New Roman"/>
         </w:rPr>
-        <w:t xml:space="preserve"> Patients increasingly consult search engines and, more recently, artificial-intelligence (AI) chatbots before seeing a doctor. Health anxiety and cyberchondria (excessive, distressing online health searching) are thought to reinforce each other, but evidence from Iraq, and on AI chatbots, is scarce.</w:t>
+        <w:t xml:space="preserve"> Adults increasingly consult search engines and, more recently, artificial-intelligence (AI) chatbots before seeing a doctor. Health anxiety and cyberchondria (excessive, distressing online health searching) are thought to reinforce each other, but evidence from Iraq, and on AI chatbots, is scarce.</w:t>
       </w:r>
     </w:p>
     <w:p>
@@ -2834,7 +2834,7 @@
         <w:rPr>
           <w:rFonts w:ascii="Times New Roman" w:hAnsi="Times New Roman"/>
         </w:rPr>
-        <w:t xml:space="preserve"> To measure the association between health anxiety and cyberchondria among adults in Baghdad, to identify the socio-demographic and digital-behaviour factors linked with each, and to describe how online searching shapes pre-consultation behaviour and the doctor–patient relationship.</w:t>
+        <w:t xml:space="preserve"> To measure the association between health anxiety and cyberchondria among adults in Baghdad, and to describe online and AI health-information seeking and pre-consultation behaviour.</w:t>
       </w:r>
     </w:p>
     <w:p>
@@ -2854,7 +2854,7 @@
         <w:rPr>
           <w:rFonts w:ascii="Times New Roman" w:hAnsi="Times New Roman"/>
         </w:rPr>
-        <w:t xml:space="preserve"> A cross-sectional online survey (Google Forms) of 300 adults in Baghdad was conducted between 17 July 2026 and 11 September 2026. Health anxiety was measured with the Short Health Anxiety Inventory (SHAI-14) and cyberchondria with the Cyberchondria Severity Scale short form (CSS-12). Analyses included reliability and confirmatory factor analysis, Spearman and partial correlations, non-parametric group comparisons with false-discovery-rate correction, hierarchical robust regression, logistic and ordinal regression, and bootstrapped mediation and moderation models.</w:t>
+        <w:t xml:space="preserve"> Cross-sectional online survey of 300 adults in Baghdad (July–September 2026) using the Short Health Anxiety Inventory (SHAI-14) and the Cyberchondria Severity Scale (CSS-12). Analyses included FDR-corrected group comparisons, robust regression and bootstrapped mediation.</w:t>
       </w:r>
     </w:p>
     <w:p>
@@ -2874,7 +2874,7 @@
         <w:rPr>
           <w:rFonts w:ascii="Times New Roman" w:hAnsi="Times New Roman"/>
         </w:rPr>
-        <w:t xml:space="preserve"> Participants were mostly young (aged 20–29: 62.3%), female (56.3%) and from health-related fields (63.3%). AI chatbots were the most used tool (88.7%), ahead of search engines (56.3%). Both scales were reliable (α = 0.81 and 0.86). Mean SHAI was 12.3 ± 5.8 and 19.0% scored ≥18. Health anxiety correlated moderately with cyberchondria (r = 0.47, 95% CI 0.38–0.55), independent of covariates (partial r = 0.48), most strongly with excessive searching and post-search distress. Health anxiety was the strongest independent predictor of cyberchondria (β = 0.48), adding 18.4% explained variance; AI-chatbot use was associated with higher cyberchondria (B = 5.3), although this depended on how inconsistent answers were classified. Excessive searching partly mediated the link between health anxiety and post-search distress, and post-search distress almost fully mediated its link with reassurance-seeking consultations. After searching, 34.7% delayed or skipped care because they felt reassured, and 31.7% never disclosed their searches to their doctor for fear of being judged.</w:t>
+        <w:t xml:space="preserve"> AI chatbots were the most used tool (88.7%; search engines 56.3%). Elevated health anxiety (SHAI ≥ 18) was present in 19.0%. Health anxiety correlated with cyberchondria (r = 0.47, 95% CI 0.38–0.55), independently of covariates (partial r = 0.48), most strongly with excessive searching and post-search distress, and was its strongest predictor (β = 0.48). Statistically, excessive searching partly mediated the link with post-search distress, but the reverse ordering fitted equally well. After searching, 34.7% delayed or skipped care because they felt reassured and 31.7% never told their doctor; higher health anxiety went with more concealment. The association of AI use with cyberchondria depended on how 32 inconsistent answers were classified.</w:t>
       </w:r>
     </w:p>
     <w:p>
@@ -2894,7 +2894,7 @@
         <w:rPr>
           <w:rFonts w:ascii="Times New Roman" w:hAnsi="Times New Roman"/>
         </w:rPr>
-        <w:t xml:space="preserve"> Health anxiety and cyberchondria travel together in Baghdad, and AI chatbots are now the main gateway to online health information. Clinicians should ask about online and AI searches, and digital health literacy and anxiety-aware AI design are recommended. Longitudinal work is needed to confirm the direction of the cycle.</w:t>
+        <w:t xml:space="preserve"> Health anxiety and cyberchondria are linked, and AI chatbots are now the main gateway to online health information in this young, health-oriented convenience sample. The cross-sectional design cannot establish direction. Clinicians should ask about online and AI searches.</w:t>
       </w:r>
     </w:p>
     <w:p>
@@ -3105,7 +3105,7 @@
         <w:rPr>
           <w:rFonts w:ascii="Times New Roman" w:hAnsi="Times New Roman"/>
         </w:rPr>
-        <w:t>Most of this evidence was gathered when "searching online" meant using a search engine. Large language model (LLM) chatbots such as ChatGPT and Gemini change the experience in important ways: they answer in fluent, personalised, conversational language; they can be questioned repeatedly; and their responses can appear more empathetic than those of physicians [25,26]. In a large US survey, about one in five respondents had used ChatGPT for health information, most of them remained sceptical of its output, and most then turned to their physicians [27]. Health anxiety has also been identified as a stable predictor of symptom-checker app use, with over half of users meeting a hypochondria classification [28]. In a representative Czech sample of 4775 Internet users, health anxiety was associated with willingness to use generative AI for health information only indirectly, through greater trust in AI [29], and among young dermatology outpatients in Turkey 61% had consulted an AI chatbot (mostly ChatGPT) before their visit, without a detectable increase in anxiety [30]. Whether AI chatbots relieve worry, by offering calm and contextualised answers, or amplify it, by being endlessly available for another round of reassurance, is an open empirical question.</w:t>
+        <w:t>Most of this evidence was gathered when "searching online" meant using a search engine. Large language model (LLM) chatbots such as ChatGPT and Gemini change the experience in important ways: they answer in fluent, personalised, conversational language; they can be questioned repeatedly; and their responses can appear more empathetic than those of physicians [25,26]. In a large US survey, about one in five respondents had used ChatGPT for health information; two-thirds of these users reported scepticism about its output and two-thirds turned to their physicians, yet about a third changed medications or requested referrals based on its answers [27]. Health anxiety has also been identified as a stable predictor of symptom-checker app use, with over half of users meeting a hypochondria classification [28]. In a representative Czech sample of 4775 Internet users, health anxiety was associated with willingness to use generative AI for health information only indirectly, through greater trust in AI [29], and among young dermatology outpatients in Turkey 61% had consulted an AI chatbot (mostly ChatGPT) before their visit, without a detectable increase in anxiety [30]. Whether AI chatbots relieve worry, by offering calm and contextualised answers, or amplify it, by being endlessly available for another round of reassurance, is an open empirical question.</w:t>
       </w:r>
     </w:p>
     <w:p>
@@ -3192,93 +3192,74 @@
     </w:p>
     <w:p>
       <w:pPr>
-        <w:pStyle w:val="ListNumber"/>
+        <w:tabs>
+          <w:tab w:pos="510" w:val="left"/>
+        </w:tabs>
         <w:spacing w:after="60"/>
+        <w:ind w:left="510" w:hanging="510"/>
         <w:jc w:val="both"/>
       </w:pPr>
       <w:r>
         <w:rPr>
           <w:rFonts w:ascii="Times New Roman" w:hAnsi="Times New Roman"/>
         </w:rPr>
-        <w:t>To describe the tools, motivations and behavioural responses associated with online health information seeking, including the use of AI chatbots.</w:t>
+        <w:t>1.</w:t>
+        <w:tab/>
+        <w:t>To describe online and AI-based health-information seeking and pre-consultation behaviour among adults in Baghdad.</w:t>
       </w:r>
     </w:p>
     <w:p>
       <w:pPr>
-        <w:pStyle w:val="ListNumber"/>
+        <w:tabs>
+          <w:tab w:pos="510" w:val="left"/>
+        </w:tabs>
         <w:spacing w:after="60"/>
+        <w:ind w:left="510" w:hanging="510"/>
         <w:jc w:val="both"/>
       </w:pPr>
       <w:r>
         <w:rPr>
           <w:rFonts w:ascii="Times New Roman" w:hAnsi="Times New Roman"/>
         </w:rPr>
-        <w:t>To estimate the level of health anxiety (SHAI-14) and cyberchondria (CSS-12) and the proportion with clinically relevant health anxiety.</w:t>
+        <w:t>2.</w:t>
+        <w:tab/>
+        <w:t>To estimate levels of health anxiety and cyberchondria and the strength of their association, overall and by cyberchondria dimension, independently of socio-demographic and digital-use factors (H1, H2); correlates of each construct were examined as secondary analyses.</w:t>
       </w:r>
     </w:p>
     <w:p>
       <w:pPr>
-        <w:pStyle w:val="ListNumber"/>
+        <w:tabs>
+          <w:tab w:pos="510" w:val="left"/>
+        </w:tabs>
         <w:spacing w:after="60"/>
+        <w:ind w:left="510" w:hanging="510"/>
         <w:jc w:val="both"/>
       </w:pPr>
       <w:r>
         <w:rPr>
           <w:rFonts w:ascii="Times New Roman" w:hAnsi="Times New Roman"/>
         </w:rPr>
-        <w:t>To measure the strength of the association between health anxiety and cyberchondria overall and for each cyberchondria dimension.</w:t>
+        <w:t>3.</w:t>
+        <w:tab/>
+        <w:t>To examine statistical pathways consistent with a mutually reinforcing cycle, and factors that might modify the association (H3).</w:t>
       </w:r>
     </w:p>
     <w:p>
       <w:pPr>
-        <w:pStyle w:val="ListNumber"/>
+        <w:tabs>
+          <w:tab w:pos="510" w:val="left"/>
+        </w:tabs>
         <w:spacing w:after="60"/>
+        <w:ind w:left="510" w:hanging="510"/>
         <w:jc w:val="both"/>
       </w:pPr>
       <w:r>
         <w:rPr>
           <w:rFonts w:ascii="Times New Roman" w:hAnsi="Times New Roman"/>
         </w:rPr>
-        <w:t>To test the association of every socio-demographic, clinical and digital-use variable with health anxiety and cyberchondria.</w:t>
-      </w:r>
-    </w:p>
-    <w:p>
-      <w:pPr>
-        <w:pStyle w:val="ListNumber"/>
-        <w:spacing w:after="60"/>
-        <w:jc w:val="both"/>
-      </w:pPr>
-      <w:r>
-        <w:rPr>
-          <w:rFonts w:ascii="Times New Roman" w:hAnsi="Times New Roman"/>
-        </w:rPr>
-        <w:t>To identify independent predictors of each construct using multivariable models.</w:t>
-      </w:r>
-    </w:p>
-    <w:p>
-      <w:pPr>
-        <w:pStyle w:val="ListNumber"/>
-        <w:spacing w:after="60"/>
-        <w:jc w:val="both"/>
-      </w:pPr>
-      <w:r>
-        <w:rPr>
-          <w:rFonts w:ascii="Times New Roman" w:hAnsi="Times New Roman"/>
-        </w:rPr>
-        <w:t>To examine pathways consistent with a mutually reinforcing cycle (mediation) and factors that modify the association (moderation).</w:t>
-      </w:r>
-    </w:p>
-    <w:p>
-      <w:pPr>
-        <w:pStyle w:val="ListNumber"/>
-        <w:spacing w:after="60"/>
-        <w:jc w:val="both"/>
-      </w:pPr>
-      <w:r>
-        <w:rPr>
-          <w:rFonts w:ascii="Times New Roman" w:hAnsi="Times New Roman"/>
-        </w:rPr>
-        <w:t>To examine the links between health anxiety, cyberchondria and pre-consultation behaviour, disclosure of searches to physicians and trust in physicians.</w:t>
+        <w:t>4.</w:t>
+        <w:tab/>
+        <w:t>To examine how health anxiety and cyberchondria relate to pre-consultation behaviour, disclosure of searches to physicians and trust in physicians (H4).</w:t>
       </w:r>
     </w:p>
     <w:p>
@@ -3368,7 +3349,7 @@
         <w:rPr>
           <w:rFonts w:ascii="Times New Roman" w:hAnsi="Times New Roman"/>
         </w:rPr>
-        <w:t>The study was powered for its primary objective, the correlation between health anxiety and cyberchondria. Using Fisher's z approximation with two-sided α = 0.05 and 80% power, a minimum of 194 participants is required to detect a small-to-moderate correlation (r = 0.20), and 85 to detect r = 0.30 [37]. Meta-analytic estimates of this association are far larger (r ≈ 0.62) [18,19], so these targets are conservative. With the achieved sample of 300, the study had 93.7% power to detect r = 0.20, and the smallest detectable correlation at 80% power was r = 0.16. For the multivariable model with 20 predictors, power to detect the unique contribution of a single predictor of small size (f² = 0.03) was 84.8%. For descriptive proportions, 300 participants give a margin of error of ±5.7% at 95% confidence (worst case, p = 0.5), compared with ±5% for the 385 participants of a Cochran-based calculation. The logistic model for clinically relevant health anxiety had 57 events for 11 predictors (≈5 events per variable), which is acknowledged as a limitation of that model.</w:t>
+        <w:t>The study was powered for its primary objective, the correlation between health anxiety and cyberchondria. Using Fisher's z approximation with two-sided α = 0.05 and 80% power, a minimum of 194 participants is required to detect a small-to-moderate correlation (r = 0.20), and 85 to detect r = 0.30 [37]. Meta-analytic estimates of this association are far larger (r ≈ 0.62) [18,19], so these targets are conservative. For descriptive proportions, 300 participants give a margin of error of ±5.7% at 95% confidence (worst case, p = 0.5), compared with ±5% for the 385 participants of a Cochran-based calculation. The logistic model for elevated health anxiety had 57 events for 11 predictors (≈5 events per variable), which is acknowledged as a limitation of that model.</w:t>
       </w:r>
     </w:p>
     <w:p>
@@ -3394,10 +3375,20 @@
     </w:p>
     <w:p>
       <w:pPr>
-        <w:pStyle w:val="ListNumber"/>
+        <w:tabs>
+          <w:tab w:pos="510" w:val="left"/>
+        </w:tabs>
         <w:spacing w:after="60"/>
+        <w:ind w:left="510" w:hanging="510"/>
         <w:jc w:val="both"/>
       </w:pPr>
+      <w:r>
+        <w:rPr>
+          <w:rFonts w:ascii="Times New Roman" w:hAnsi="Times New Roman"/>
+        </w:rPr>
+        <w:t>1.</w:t>
+        <w:tab/>
+      </w:r>
       <w:r>
         <w:rPr>
           <w:rFonts w:ascii="Times New Roman" w:hAnsi="Times New Roman"/>
@@ -3414,10 +3405,20 @@
     </w:p>
     <w:p>
       <w:pPr>
-        <w:pStyle w:val="ListNumber"/>
+        <w:tabs>
+          <w:tab w:pos="510" w:val="left"/>
+        </w:tabs>
         <w:spacing w:after="60"/>
+        <w:ind w:left="510" w:hanging="510"/>
         <w:jc w:val="both"/>
       </w:pPr>
+      <w:r>
+        <w:rPr>
+          <w:rFonts w:ascii="Times New Roman" w:hAnsi="Times New Roman"/>
+        </w:rPr>
+        <w:t>2.</w:t>
+        <w:tab/>
+      </w:r>
       <w:r>
         <w:rPr>
           <w:rFonts w:ascii="Times New Roman" w:hAnsi="Times New Roman"/>
@@ -3434,10 +3435,20 @@
     </w:p>
     <w:p>
       <w:pPr>
-        <w:pStyle w:val="ListNumber"/>
+        <w:tabs>
+          <w:tab w:pos="510" w:val="left"/>
+        </w:tabs>
         <w:spacing w:after="60"/>
+        <w:ind w:left="510" w:hanging="510"/>
         <w:jc w:val="both"/>
       </w:pPr>
+      <w:r>
+        <w:rPr>
+          <w:rFonts w:ascii="Times New Roman" w:hAnsi="Times New Roman"/>
+        </w:rPr>
+        <w:t>3.</w:t>
+        <w:tab/>
+      </w:r>
       <w:r>
         <w:rPr>
           <w:rFonts w:ascii="Times New Roman" w:hAnsi="Times New Roman"/>
@@ -3454,10 +3465,20 @@
     </w:p>
     <w:p>
       <w:pPr>
-        <w:pStyle w:val="ListNumber"/>
+        <w:tabs>
+          <w:tab w:pos="510" w:val="left"/>
+        </w:tabs>
         <w:spacing w:after="60"/>
+        <w:ind w:left="510" w:hanging="510"/>
         <w:jc w:val="both"/>
       </w:pPr>
+      <w:r>
+        <w:rPr>
+          <w:rFonts w:ascii="Times New Roman" w:hAnsi="Times New Roman"/>
+        </w:rPr>
+        <w:t>4.</w:t>
+        <w:tab/>
+      </w:r>
       <w:r>
         <w:rPr>
           <w:rFonts w:ascii="Times New Roman" w:hAnsi="Times New Roman"/>
@@ -3474,10 +3495,20 @@
     </w:p>
     <w:p>
       <w:pPr>
-        <w:pStyle w:val="ListNumber"/>
+        <w:tabs>
+          <w:tab w:pos="510" w:val="left"/>
+        </w:tabs>
         <w:spacing w:after="60"/>
+        <w:ind w:left="510" w:hanging="510"/>
         <w:jc w:val="both"/>
       </w:pPr>
+      <w:r>
+        <w:rPr>
+          <w:rFonts w:ascii="Times New Roman" w:hAnsi="Times New Roman"/>
+        </w:rPr>
+        <w:t>5.</w:t>
+        <w:tab/>
+      </w:r>
       <w:r>
         <w:rPr>
           <w:rFonts w:ascii="Times New Roman" w:hAnsi="Times New Roman"/>
@@ -3524,13 +3555,13 @@
           <w:rFonts w:ascii="Times New Roman" w:hAnsi="Times New Roman"/>
           <w:b/>
         </w:rPr>
-        <w:t>Clinically relevant health anxiety:</w:t>
+        <w:t>Elevated health anxiety:</w:t>
       </w:r>
       <w:r>
         <w:rPr>
           <w:rFonts w:ascii="Times New Roman" w:hAnsi="Times New Roman"/>
         </w:rPr>
-        <w:t xml:space="preserve"> SHAI-14 ≥ 18, the optimal cut-off for distinguishing patients with health anxiety from healthy controls in a recent diagnostic accuracy study [42]. Prevalence at alternative cut-offs (15 and 22) was also reported.</w:t>
+        <w:t xml:space="preserve"> SHAI-14 ≥ 18, the optimal cut-off for distinguishing people with health anxiety from healthy controls in a Swedish diagnostic-accuracy study [42]. Because the same study recommends higher cut-offs in psychiatric (22) and low-prevalence (29) settings, the term "elevated" rather than "clinically relevant" is used, it is not a diagnosis, and prevalence at 15, 22 and 29 is also reported</w:t>
       </w:r>
     </w:p>
     <w:p>
@@ -3711,7 +3742,7 @@
         <w:rPr>
           <w:rFonts w:ascii="Times New Roman" w:hAnsi="Times New Roman"/>
         </w:rPr>
-        <w:t xml:space="preserve"> Mann–Whitney U (rank-biserial r as effect size) or Kruskal–Wallis H (ε² as effect size) for SHAI, CSS and each CSS subscale, with Welch's t-test/ANOVA as parametric confirmation and pairwise Mann–Whitney post-hoc comparisons with Holm adjustment. Associations of all categorical variables with clinically relevant health anxiety and high cyberchondria were tested with Pearson χ² or Fisher's exact test (Monte-Carlo exact p when expected counts were small), with Cramér's V. Pairwise associations among all categorical variables were also screened.</w:t>
+        <w:t xml:space="preserve"> Mann–Whitney U (rank-biserial r as effect size) or Kruskal–Wallis H (ε² as effect size) for SHAI, CSS and each CSS subscale, with Welch's t-test/ANOVA as parametric confirmation and pairwise Mann–Whitney post-hoc comparisons with Holm adjustment. Associations of all categorical variables with elevated health anxiety and high cyberchondria were tested with Pearson χ² or Fisher's exact test (Monte-Carlo exact p when expected counts were small), with Cramér's V. Pairwise associations among all categorical variables were also screened.</w:t>
       </w:r>
     </w:p>
     <w:p>
@@ -3751,7 +3782,7 @@
         <w:rPr>
           <w:rFonts w:ascii="Times New Roman" w:hAnsi="Times New Roman"/>
         </w:rPr>
-        <w:t xml:space="preserve"> hierarchical OLS regression of CSS on socio-demographics (block 1), digital-use variables (block 2) and SHAI (block 3), with HC3 robust standard errors, standardised coefficients and VIF checks; the reverse model (SHAI on CSS); models for each CSS subscale; quantile regression (25th–90th percentiles) and a quadratic term to examine non-linearity. Logistic regression identified predictors of clinically relevant health anxiety (AORs, AUC) and of each pre-consultation behaviour; ordinal logistic regression was used for the ordered disclosure and relationship outcomes.</w:t>
+        <w:t xml:space="preserve"> hierarchical OLS regression of CSS on socio-demographics (block 1), digital-use variables (block 2) and SHAI (block 3), with HC3 robust standard errors, standardised coefficients and VIF checks; the reverse model (SHAI on CSS); models for each CSS subscale; quantile regression (25th–90th percentiles) and a quadratic term to examine non-linearity. Logistic regression identified predictors of elevated health anxiety (AORs, AUC) and of each pre-consultation behaviour; ordinal logistic regression was used for the ordered disclosure and relationship outcomes.</w:t>
       </w:r>
     </w:p>
     <w:p>
@@ -5936,7 +5967,7 @@
         <w:rPr>
           <w:rFonts w:ascii="Times New Roman" w:hAnsi="Times New Roman"/>
         </w:rPr>
-        <w:t>AI chatbots were the most frequently used tool for looking up symptoms (266 (88.7%)), followed by search engines (169 (56.3%)), dedicated medical platforms (55 (18.3%)) and social media (32 (10.7%)); 144 (48.0%) used more than one tool. ChatGPT was the dominant chatbot (178 (59.3%)), followed by Gemini (71 (23.7%)) and Claude (12 (4.0%)). Notably, 123 (41.0%) used AI chatbots without using search engines at all. Convenience was the leading motive (80.0%), followed by deciding whether a doctor visit was needed (57.7%) and seeking instant reassurance about an unexplained symptom (51.0%). Trust in medical information generated by online tools or AI was mostly moderate (170 (56.7%)); only 27 (9.0%) trusted it very much or completely (Table 2, Figure 1).</w:t>
+        <w:t>AI chatbots were the most frequently used tool for looking up symptoms (266 (88.7%)), followed by search engines (169 (56.3%)), dedicated medical platforms (55 (18.3%)) and social media (32 (10.7%)); 171 (57.0%) used more than one type of tool (counting AI use as defined in Section 2.5). AI use was highest among the youngest participants (96% at 18–19 years) and lowest among the oldest (72% at ≥40), so the 34 non-users were older on average. ChatGPT was the dominant chatbot (178 (59.3%)), followed by Gemini (71 (23.7%)) and Claude (12 (4.0%)). Notably, 123 (41.0%) used AI chatbots without using search engines at all. Convenience was the leading motive (80.0%), followed by deciding whether a doctor visit was needed (57.7%) and seeking instant reassurance about an unexplained symptom (51.0%). Trust in medical information generated by online tools or AI was mostly moderate (170 (56.7%)); only 27 (9.0%) trusted it very much or completely (Table 2, Figure 1).</w:t>
       </w:r>
     </w:p>
     <w:p>
@@ -8945,7 +8976,7 @@
         <w:rPr>
           <w:rFonts w:ascii="Times New Roman" w:hAnsi="Times New Roman"/>
         </w:rPr>
-        <w:t>The mean SHAI-14 score was 12.35 ± 5.83 (median 12, IQR 8–16). Using the cut-off of 18, 57 (19.0%) (95% CI 15.0–23.8%) had clinically relevant health anxiety; prevalence was 32.7% and 7.3% at cut-offs of 15 and 22, respectively. The mean CSS-12 score was 28.86 ± 8.36 (median 29). Excessiveness was the highest-scoring dimension (9.66 ± 2.94) and compulsion the lowest (5.00 ± 2.58). At item level, 63.0% often or always searched online when they noticed an unexplained bodily sensation, whereas fewer than 7% reported that searching often interfered with work, leisure or social activities. Scores deviated modestly from normality (Shapiro–Wilk p &lt; 0.01; skewness 0.52 for SHAI and 0.31 for CSS), so non-parametric tests were used for bivariate comparisons and robust standard errors for regression.</w:t>
+        <w:t>The mean SHAI-14 score was 12.35 ± 5.83 (median 12, IQR 8–16). Using the cut-off of 18, 57 (19.0%) (95% CI 15.0–23.8%) had elevated health anxiety; prevalence was 32.7%, 7.3% and 0.7% at cut-offs of 15, 22 and 29, respectively, so the estimate depends heavily on the threshold chosen. The mean CSS-12 score was 28.86 ± 8.36 (median 29). Excessiveness was the highest-scoring dimension (9.66 ± 2.94) and compulsion the lowest (5.00 ± 2.58). At item level, 63.0% often or always searched online when they noticed an unexplained bodily sensation, whereas fewer than 7% reported that searching often interfered with work, leisure or social activities. Scores deviated modestly from normality (Shapiro–Wilk p &lt; 0.01; skewness 0.52 for SHAI and 0.31 for CSS), so non-parametric tests were used for bivariate comparisons and robust standard errors for regression.</w:t>
       </w:r>
     </w:p>
     <w:p>
@@ -10914,7 +10945,7 @@
         <w:rPr>
           <w:rFonts w:ascii="Times New Roman" w:hAnsi="Times New Roman"/>
         </w:rPr>
-        <w:t>Every variable was tested against SHAI, CSS and each CSS dimension (162 tests; full results in the supplementary workbook). Table 5 summarises the main comparisons. Health anxiety was higher in younger participants (18–19 years: 14.00 ± 5.49 vs 30–39 years: 10.19 ± 6.37; p = 0.008, q = 0.051), in current students (p = 0.002), in medical students compared with non-health employees (p = 0.005), in those with a chronic condition (p = 0.004, q = 0.028), in social-media users (p = 0.001, q = 0.016) and, most clearly, in those whose motive was to obtain instant reassurance (13.76 ± 5.65 vs 10.88 ± 5.65; p &lt; 0.001, q = 0.002). Gender was not associated with either health anxiety (p = 0.378) or cyberchondria (p = 0.859).</w:t>
+        <w:t>Every variable was tested against SHAI, CSS and each CSS dimension (162 tests; full results in the supplementary workbook). Table 5 summarises the main comparisons. Health anxiety tended to be higher in younger participants (18–19 years: 14.00 ± 5.49 vs 30–39 years: 10.19 ± 6.37; p = 0.008, q = 0.051), in current students (p = 0.002), in medical students compared with non-health employees (Kruskal–Wallis p = 0.005; Holm-adjusted pairwise p = 0.004), in those with a chronic condition (p = 0.004, q = 0.028), in social-media users (p = 0.001, q = 0.016) and, most clearly, in those whose motive was to obtain instant reassurance (13.76 ± 5.65 vs 10.88 ± 5.65; p &lt; 0.001, q = 0.002). The age difference was borderline after FDR correction (q ≈ 0.05) and is treated as exploratory. Gender was not associated with either health anxiety (p = 0.378) or cyberchondria (p = 0.859).</w:t>
       </w:r>
     </w:p>
     <w:p>
@@ -16550,7 +16581,7 @@
         <w:rPr>
           <w:rFonts w:ascii="Times New Roman" w:hAnsi="Times New Roman"/>
         </w:rPr>
-        <w:t>In categorical analysis, clinically relevant health anxiety was more common among social-media users (13/32 (40.6%) vs 44/268 (16.4%); q = 0.015) and those seeking instant reassurance (42/153 (27.5%) vs 15/147 (10.2%); q = 0.004). Participants with clinically relevant health anxiety had 3.7 times the odds of high cyberchondria (52.6% vs 23.0%; OR = 3.71, 95% CI 2.04–6.76). High cyberchondria was associated with disclosure pattern (p = 0.001, q = 0.015): it was most frequent among those who always disclosed their searches (33/81 (40.7%)) and least frequent among those who never did (15/95 (15.8%)) (Table 6).</w:t>
+        <w:t>In categorical analysis, elevated health anxiety was more common among social-media users (13/32 (40.6%) vs 44/268 (16.4%); q = 0.015) and those seeking instant reassurance (42/153 (27.5%) vs 15/147 (10.2%); q = 0.004). Participants with elevated health anxiety had 3.7 times the odds of high cyberchondria (52.6% vs 23.0%; OR = 3.71, 95% CI 2.04–6.76). High cyberchondria was associated with disclosure pattern (p = 0.001, q = 0.015): it was most frequent among those who always disclosed their searches (33/81 (40.7%)) and least frequent among those who never did (15/95 (15.8%)) (Table 6).</w:t>
       </w:r>
     </w:p>
     <w:p>
@@ -16613,7 +16644,7 @@
           <w:i w:val="0"/>
           <w:sz w:val="24"/>
         </w:rPr>
-        <w:t>Variables significantly associated (p &lt; 0.05) with clinically relevant health anxiety and with high cyberchondria</w:t>
+        <w:t>Variables significantly associated (p &lt; 0.05) with elevated health anxiety and with high cyberchondria</w:t>
       </w:r>
     </w:p>
     <w:tbl>
@@ -16771,7 +16802,7 @@
                 <w:b/>
                 <w:sz w:val="19"/>
               </w:rPr>
-              <w:t>Clinically relevant HA (SHAI ≥ 18)</w:t>
+              <w:t>Elevated health anxiety (SHAI ≥ 18)</w:t>
             </w:r>
           </w:p>
         </w:tc>
@@ -17363,7 +17394,7 @@
                 <w:b w:val="0"/>
                 <w:sz w:val="19"/>
               </w:rPr>
-              <w:t xml:space="preserve">    Clinically relevant HA</w:t>
+              <w:t xml:space="preserve">    Elevated health anxiety</w:t>
             </w:r>
           </w:p>
         </w:tc>
@@ -20542,7 +20573,7 @@
         <w:rPr>
           <w:rFonts w:ascii="Times New Roman" w:hAnsi="Times New Roman"/>
         </w:rPr>
-        <w:t>In logistic regression (Table 8, Figure 6), clinically relevant health anxiety was independently associated with higher cyberchondria (AOR = 3.12 per SD, 95% CI 2.09–4.65), with searching for instant reassurance (AOR = 3.83, 95% CI 1.75–8.42) and with younger age (AOR = 0.61 per age-group step, 95% CI 0.38–0.96). The model discriminated well (AUC = 0.83; McFadden pseudo-R² = 0.22).</w:t>
+        <w:t>In logistic regression (Table 8, Figure 6), elevated health anxiety was independently associated with higher cyberchondria (AOR = 3.12 per SD, 95% CI 2.09–4.65), with searching for instant reassurance (AOR = 3.83, 95% CI 1.75–8.42) and with younger age (AOR = 0.61 per age-group step, 95% CI 0.38–0.96). The model discriminated well (AUC = 0.83; McFadden pseudo-R² = 0.22).</w:t>
       </w:r>
     </w:p>
     <w:p>
@@ -20605,7 +20636,7 @@
           <w:i w:val="0"/>
           <w:sz w:val="24"/>
         </w:rPr>
-        <w:t>Multivariable logistic regression of clinically relevant health anxiety (SHAI ≥ 18; 57 events, n = 300)</w:t>
+        <w:t>Multivariable logistic regression of elevated health anxiety (SHAI ≥ 18; 57 events, n = 300)</w:t>
       </w:r>
     </w:p>
     <w:tbl>
@@ -21736,7 +21767,7 @@
           <w:i/>
           <w:sz w:val="24"/>
         </w:rPr>
-        <w:t>Adjusted odds ratios for clinically relevant health anxiety (SHAI ≥ 18). Orange: p &lt; 0.05.</w:t>
+        <w:t>Adjusted odds ratios for elevated health anxiety (SHAI ≥ 18). Orange: p &lt; 0.05.</w:t>
       </w:r>
     </w:p>
     <w:p>
@@ -21757,7 +21788,7 @@
         <w:rPr>
           <w:rFonts w:ascii="Times New Roman" w:hAnsi="Times New Roman"/>
         </w:rPr>
-        <w:t>When health anxiety and cyberchondria were entered together, each with adjustment for trust, AI use and socio-demographics (Table 9), cyberchondria, rather than health anxiety, was associated with behaviours: each SD increase in CSS raised the odds of an urgent visit or ER attendance (AOR = 1.51, 95% CI 1.09–2.10) and of delaying care because of fear (AOR = 1.59, 95% CI 1.09–2.30), and lowered the odds of ignoring the symptom (AOR = 0.65, 95% CI 0.48–0.89). Higher cyberchondria was also associated with a more strained relationship with physicians (ordinal OR = 1.34, 95% CI 1.02–1.77). Strikingly, health anxiety and cyberchondria pulled in opposite directions for disclosure: higher health anxiety increased the odds of never telling the physician about online searches (AOR = 1.47, 95% CI 1.08–1.98), whereas higher cyberchondria decreased them (AOR = 0.57, 95% CI 0.43–0.78, q = 0.012). Greater trust in online/AI information was associated with lower odds of consulting multiple doctors (AOR = 0.59, 95% CI 0.41–0.84). Neither score was associated with self-medication or with delaying care because of reassurance. Apart from the disclosure finding, these behavioural associations did not survive FDR correction across the 40 tests (q between 0.08 and 0.28) and should be regarded as exploratory.</w:t>
+        <w:t>When health anxiety and cyberchondria were entered together, each with adjustment for trust, AI use and socio-demographics (Table 9), cyberchondria, rather than health anxiety, was associated with behaviours: each SD increase in CSS raised the odds of an urgent visit or ER attendance (AOR = 1.51, 95% CI 1.09–2.10) and of delaying care because of fear (AOR = 1.59, 95% CI 1.09–2.30), and lowered the odds of ignoring the symptom (AOR = 0.65, 95% CI 0.48–0.89). Higher cyberchondria was also associated with a more strained relationship with physicians in the ordinal model (OR = 1.34, 95% CI 1.02–1.77); in the binary model of any negative effect (Table 9) the estimate was similar but borderline (AOR = 1.35, 95% CI 1.00–1.83, p = 0.049). Strikingly, health anxiety and cyberchondria pulled in opposite directions for disclosure: higher health anxiety increased the odds of never telling the physician about online searches (AOR = 1.47, 95% CI 1.08–1.98), whereas higher cyberchondria decreased them (AOR = 0.57, 95% CI 0.43–0.78, q = 0.012). Greater trust in online/AI information was associated with lower odds of consulting multiple doctors (AOR = 0.59, 95% CI 0.41–0.84) and showed a non-significant trend towards delaying care because of reassurance (AOR = 1.33, p = 0.088). Neither score was associated with self-medication or with delaying care because of reassurance. Apart from the disclosure finding, these behavioural associations did not survive FDR correction across the 40 tests (q between 0.08 and 0.28) and should be regarded as exploratory.</w:t>
       </w:r>
     </w:p>
     <w:p>
@@ -22984,7 +23015,7 @@
         <w:rPr>
           <w:rFonts w:ascii="Times New Roman" w:hAnsi="Times New Roman"/>
         </w:rPr>
-        <w:t>Mediation analyses (standardised, adjusted, 5000 bootstrap resamples) supported pathways consistent with a reinforcing cycle (Table 10, Figure 7). First, excessive searching partly mediated the association between health anxiety and post-search distress (indirect effect = 0.16, 95% CI 0.11–0.23; 35% of the total effect), with the direct effect remaining significant (c′ = 0.30). Second, post-search distress almost fully mediated the association between health anxiety and reassurance-seeking consultations (indirect = 0.22, 95% CI 0.16–0.29; direct c′ = 0.01, p = 0.932). A serial model showed a significant chain from health anxiety to excessive searching to distress to reassurance seeking (indirect = 0.07, 95% CI 0.04–0.11). The reverse ordering, from excessive searching through distress to health anxiety, was also significant (indirect = 0.15, 95% CI 0.09–0.22), which is what a bidirectional relationship would produce, but also what cross-sectional data cannot disentangle. Participants with clinically relevant health anxiety scored higher on all four dimensions, most markedly on excessiveness and distress (Figure 8).</w:t>
+        <w:t>Mediation analyses (standardised, adjusted, 5000 bootstrap resamples) supported pathways consistent with a reinforcing cycle (Table 10, Figure 7). First, excessive searching partly mediated the association between health anxiety and post-search distress (indirect effect = 0.16, 95% CI 0.11–0.23; 35% of the total effect), with the direct effect remaining significant (c′ = 0.30). Second, post-search distress almost fully mediated the association between health anxiety and reassurance-seeking consultations (indirect = 0.22, 95% CI 0.16–0.29; direct c′ = 0.01, p = 0.932). A serial model showed a significant chain from health anxiety to excessive searching to distress to reassurance seeking (indirect = 0.07, 95% CI 0.04–0.11). The reverse ordering, from excessive searching through distress to health anxiety, was also significant (indirect = 0.15, 95% CI 0.09–0.22), which is what a bidirectional relationship would produce, but also what cross-sectional data cannot disentangle. Participants with elevated health anxiety scored higher on all four dimensions, most markedly on excessiveness and distress (Figure 8).</w:t>
       </w:r>
     </w:p>
     <w:p>
@@ -23280,7 +23311,7 @@
                 <w:b w:val="0"/>
                 <w:sz w:val="20"/>
               </w:rPr>
-              <w:t>0.49</w:t>
+              <w:t>0.35</w:t>
             </w:r>
           </w:p>
         </w:tc>
@@ -23399,7 +23430,7 @@
                 <w:b w:val="0"/>
                 <w:sz w:val="20"/>
               </w:rPr>
-              <w:t>0.34</w:t>
+              <w:t>0.27</w:t>
             </w:r>
           </w:p>
         </w:tc>
@@ -23637,7 +23668,7 @@
                 <w:b w:val="0"/>
                 <w:sz w:val="20"/>
               </w:rPr>
-              <w:t>0.45</w:t>
+              <w:t>0.30</w:t>
             </w:r>
           </w:p>
         </w:tc>
@@ -23843,7 +23874,7 @@
           <w:rFonts w:ascii="Times New Roman" w:hAnsi="Times New Roman"/>
           <w:sz w:val="19"/>
         </w:rPr>
-        <w:t>All models adjusted for age, gender, health background, chronic disease, trust and AI use; 5000 bootstrap resamples. All a, b and total paths p &lt; 0.001. Moderation of the SHAI–CSS association (interaction terms): trust in online/ai data p = 0.34; ai chatbot use p = 0.47; health-related background p = 0.66; female gender p = 0.98; chronic condition p = 0.75; english-language responder p = 0.29; age group (ordinal) p = 0.07 (all q &gt; 0.40).</w:t>
+        <w:t>a: predictor → mediator; b: mediator → outcome adjusted for the predictor; indirect effect = a × b = c − c′. All models adjusted for age, gender, health background, chronic disease, trust and AI use; 5000 bootstrap resamples. All a, b and total paths p &lt; 0.001. Moderation of the SHAI–CSS association (interaction terms): trust in online/ai data p = 0.34; ai chatbot use p = 0.47; health-related background p = 0.66; female gender p = 0.98; chronic condition p = 0.75; english-language responder p = 0.29; age group (ordinal) p = 0.07 (all q &gt; 0.40).</w:t>
       </w:r>
     </w:p>
     <w:p>
@@ -24099,7 +24130,7 @@
         <w:rPr>
           <w:rFonts w:ascii="Times New Roman" w:hAnsi="Times New Roman"/>
         </w:rPr>
-        <w:t>This study is, to our knowledge, the first from Iraq to examine health anxiety and cyberchondria together, and among the first anywhere to place AI chatbots alongside search engines as a source of pre-consultation health information. Four findings stand out. First, AI chatbots have already overtaken search engines as the main tool used to look up symptoms in this sample, and about two in five participants used AI without search engines at all. Second, health anxiety and cyberchondria were moderately and robustly associated (r ≈ 0.47), independently of all other measured factors, and health anxiety was the dominant predictor of cyberchondria. Third, the association was concentrated in the excessiveness and distress dimensions, and mediation analyses traced a sequence in which health anxiety is linked with excessive searching, excessive searching with post-search distress, and distress with reassurance-seeking consultations. Fourth, these psychological processes were reflected in pre-consultation behaviour, from urgent visits to non-disclosure of searches to physicians.</w:t>
+        <w:t>This study is, to our knowledge, the first from Iraq to examine health anxiety and cyberchondria together, and among the first anywhere to place AI chatbots alongside search engines as a source of pre-consultation health information. Four findings stand out. First, AI chatbots have already overtaken search engines as the main tool used to look up symptoms in this sample, and about two in five participants used AI without search engines at all. Second, health anxiety and cyberchondria were moderately and robustly associated (r ≈ 0.47), independently of all other measured factors, and health anxiety was the dominant predictor of cyberchondria. Third, the association was concentrated in the excessiveness and distress dimensions, and mediation analyses traced a statistical sequence in which health anxiety is linked with excessive searching, excessive searching with post-search distress, and distress with reassurance-seeking consultations. Fourth, these psychological processes were reflected in pre-consultation behaviour, from urgent visits to non-disclosure of searches to physicians.</w:t>
       </w:r>
     </w:p>
     <w:p>
@@ -24159,7 +24190,7 @@
         <w:rPr>
           <w:rFonts w:ascii="Times New Roman" w:hAnsi="Times New Roman"/>
         </w:rPr>
-        <w:t>The prevalence of clinically relevant health anxiety (19% at SHAI ≥ 18) should be interpreted cautiously. The cut-off was derived against healthy controls in Sweden [42]; it is not a diagnosis, and prevalence ranged from 7% to 33% across plausible cut-offs. Nevertheless, it indicates that a substantial minority of digitally active adults in Baghdad experience health worry at a level that would warrant clinical attention, consistent with high rates of health anxiety reported in Iraq during the pandemic [8].</w:t>
+        <w:t>The prevalence of elevated health anxiety (19% at SHAI ≥ 18) should be interpreted cautiously. The cut-off was derived against healthy controls in Sweden [42]; it is not a diagnosis, and prevalence ranged from 7% to 33% across plausible cut-offs. Nevertheless, it indicates that a substantial minority of digitally active adults in Baghdad experience health worry at a level that would warrant clinical attention, consistent with high rates of health anxiety reported in Iraq during the pandemic [8].</w:t>
       </w:r>
     </w:p>
     <w:p>
@@ -24211,6 +24242,19 @@
     </w:p>
     <w:p>
       <w:pPr>
+        <w:spacing w:after="120"/>
+        <w:ind w:firstLine="567"/>
+        <w:jc w:val="both"/>
+      </w:pPr>
+      <w:r>
+        <w:rPr>
+          <w:rFonts w:ascii="Times New Roman" w:hAnsi="Times New Roman"/>
+        </w:rPr>
+        <w:t>H3 is therefore supported statistically, but not causally.</w:t>
+      </w:r>
+    </w:p>
+    <w:p>
+      <w:pPr>
         <w:pStyle w:val="Heading2"/>
       </w:pPr>
       <w:r>
@@ -24261,7 +24305,7 @@
         <w:rPr>
           <w:rFonts w:ascii="Times New Roman" w:hAnsi="Times New Roman"/>
         </w:rPr>
-        <w:t>The most common response after searching, delaying or skipping care because the information was reassuring (35%), is a double-edged finding. For self-limiting symptoms it may save unnecessary visits; for serious ones it represents a risk of delayed diagnosis. Notably, this behaviour was not related to health anxiety or cyberchondria, meaning it occurs across the spectrum and cannot be dismissed as a feature of anxious users. Conversely, cyberchondria was associated with urgent visits and emergency attendance and with fear-driven delay, mirroring evidence that health anxiety increases healthcare utilisation [7]. Thus online searching appears to push different people in opposite directions: towards complacency in some and towards over-use of services in others.</w:t>
+        <w:t>The most common response after searching, delaying or skipping care because the information was reassuring (35%), is a double-edged finding. For self-limiting symptoms it may save unnecessary visits; for serious ones it represents a risk of delayed diagnosis. Notably, this behaviour was not related to health anxiety or cyberchondria, meaning it occurs across the spectrum and cannot be dismissed as a feature of anxious users. Conversely, cyberchondria was associated with urgent visits and emergency attendance and with fear-driven delay, although these associations did not survive FDR correction and are exploratory, mirroring evidence that health anxiety increases healthcare utilisation [7]. Thus online searching appears to push different people in opposite directions: towards complacency in some and towards over-use of services in others.</w:t>
       </w:r>
     </w:p>
     <w:p>
@@ -24274,15 +24318,7 @@
         <w:rPr>
           <w:rFonts w:ascii="Times New Roman" w:hAnsi="Times New Roman"/>
         </w:rPr>
-        <w:t>The disclosure findings are clinically important. Almost a third of participants never told their doctor about their searches, for fear of being judged or dismissed, and those with higher health anxiety were more likely to conceal searching, whereas those with higher cyberchondria were more likely to disclose it. One interpretation is that health-anxious patients anticipate being labelled as "worried well" and hide their searching, while patients for whom searching is a dominant behaviour bring their findings to the consultation as part of reassurance seeking. Concealment matters because online information discussed openly can strengthen the doctor–patient relationship, whereas undisclosed information is more likely to undermine it [31]. One in three participants reported that searching had complicated their relationship with or reduced their trust in physicians, and this was more likely at higher levels of cyberchondria.</w:t>
-      </w:r>
-    </w:p>
-    <w:p>
-      <w:pPr>
-        <w:pStyle w:val="Heading2"/>
-      </w:pPr>
-      <w:r>
-        <w:t>4.6 Medical and health-science students</w:t>
+        <w:t>The disclosure findings are clinically important. Almost a third of participants never told their doctor about their searches, for fear of being judged or dismissed, and those with higher health anxiety were more likely to conceal searching, whereas those with higher cyberchondria were more likely to disclose it. One interpretation is that health-anxious patients anticipate being labelled as "worried well" and hide their searching, while patients for whom searching is a dominant behaviour bring their findings to the consultation as part of reassurance seeking. Concealment matters because online information discussed openly can strengthen the doctor–patient relationship, whereas undisclosed information is more likely to undermine it [31]. One in three participants reported that searching had complicated their relationship with or reduced their trust in physicians, and this tended to be more likely at higher levels of cyberchondria (a borderline association).</w:t>
       </w:r>
     </w:p>
     <w:p>
@@ -24295,7 +24331,7 @@
         <w:rPr>
           <w:rFonts w:ascii="Times New Roman" w:hAnsi="Times New Roman"/>
         </w:rPr>
-        <w:t>Medical students had higher unadjusted health anxiety than non-health employees, but this difference disappeared after adjustment, largely reflecting their younger age; age was an independent predictor of clinically relevant health anxiety. The SHAI–CSS correlation tended to be stronger among medical students. This is compatible with the idea of "medical student syndrome", but evidence for that concept is weak [51], and our data suggest that medical knowledge does not protect against cyberchondria (medical students' CSS scores were identical to those of other participants).</w:t>
+        <w:t>H4 is therefore only partially supported, and on exploratory evidence: the clearest behavioural finding is the opposite direction of health anxiety and cyberchondria for disclosure, which survived correction for multiple testing.</w:t>
       </w:r>
     </w:p>
     <w:p>
@@ -24303,7 +24339,7 @@
         <w:pStyle w:val="Heading2"/>
       </w:pPr>
       <w:r>
-        <w:t>4.7 Comparison with regional studies</w:t>
+        <w:t>4.6 Medical and health-science students</w:t>
       </w:r>
     </w:p>
     <w:p>
@@ -24316,7 +24352,7 @@
         <w:rPr>
           <w:rFonts w:ascii="Times New Roman" w:hAnsi="Times New Roman"/>
         </w:rPr>
-        <w:t>Our findings are in line with emerging Arab-region data. In Jeddah, cyberchondria was common and associated with smartphone addiction [32]; among Saudi primary-care patients, cyberchondria had a positive effect on health anxiety in structural models [33]; and the Arabic CSS-12 showed a structure similar to ours in Lebanon [15]. The good fit of the four-factor CSS-12 and the comparable reliability across Arabic and English responders add to the evidence that the instrument functions well in Arabic-speaking populations.</w:t>
+        <w:t>Medical students had higher unadjusted health anxiety than non-health employees, but this difference disappeared after adjustment, largely reflecting their younger age; age was an independent predictor of elevated health anxiety. The SHAI–CSS correlation tended to be stronger among medical students. This is compatible with the idea of "medical student syndrome", but evidence for that concept is weak [51], and our data suggest that medical knowledge does not protect against cyberchondria (medical students' CSS scores were identical to those of other participants).</w:t>
       </w:r>
     </w:p>
     <w:p>
@@ -24324,7 +24360,7 @@
         <w:pStyle w:val="Heading2"/>
       </w:pPr>
       <w:r>
-        <w:t>4.8 Strengths and limitations</w:t>
+        <w:t>4.7 Comparison with regional studies</w:t>
       </w:r>
     </w:p>
     <w:p>
@@ -24337,7 +24373,15 @@
         <w:rPr>
           <w:rFonts w:ascii="Times New Roman" w:hAnsi="Times New Roman"/>
         </w:rPr>
-        <w:t>Strengths of this study include the use of two established instruments with good reliability and confirmed structure; a bilingual questionnaire with empirical checks of language equivalence; the separate assessment of AI chatbots; complete data; correction for multiple testing; robust regression, bootstrap inference and several sensitivity analyses; and the linking of psychological measures to concrete behaviours relevant to clinical practice.</w:t>
+        <w:t>Our findings are in line with emerging Arab-region data. In Jeddah, cyberchondria was common and associated with smartphone addiction [32]; among Saudi primary-care patients, cyberchondria had a positive effect on health anxiety in structural models [33]; and the Arabic CSS-12 showed a structure similar to ours in Lebanon [15]. The good fit of the four-factor CSS-12 and the comparable reliability across Arabic and English responders add to the evidence that the instrument functions well in Arabic-speaking populations.</w:t>
+      </w:r>
+    </w:p>
+    <w:p>
+      <w:pPr>
+        <w:pStyle w:val="Heading2"/>
+      </w:pPr>
+      <w:r>
+        <w:t>4.8 Strengths and limitations</w:t>
       </w:r>
     </w:p>
     <w:p>
@@ -24350,6 +24394,19 @@
         <w:rPr>
           <w:rFonts w:ascii="Times New Roman" w:hAnsi="Times New Roman"/>
         </w:rPr>
+        <w:t>Strengths of this study include the use of two established instruments with good reliability and confirmed structure; a bilingual questionnaire with empirical checks of language equivalence; the separate assessment of AI chatbots; complete data; correction for multiple testing; robust regression, bootstrap inference and several sensitivity analyses; and the linking of psychological measures to concrete behaviours relevant to clinical practice.</w:t>
+      </w:r>
+    </w:p>
+    <w:p>
+      <w:pPr>
+        <w:spacing w:after="120"/>
+        <w:ind w:firstLine="567"/>
+        <w:jc w:val="both"/>
+      </w:pPr>
+      <w:r>
+        <w:rPr>
+          <w:rFonts w:ascii="Times New Roman" w:hAnsi="Times New Roman"/>
+        </w:rPr>
         <w:t>The limitations are substantial and should be weighed carefully:</w:t>
       </w:r>
     </w:p>
@@ -24410,7 +24467,7 @@
         <w:rPr>
           <w:rFonts w:ascii="Times New Roman" w:hAnsi="Times New Roman"/>
         </w:rPr>
-        <w:t xml:space="preserve"> the Arabic wording was produced by the research team without a formal forward–backward translation and cognitive pre-testing; equivalence was supported empirically (similar reliability, congruent loadings and equal means across language groups) but not established by formal measurement-invariance testing. "Language relied on" was self-selected, not randomised. The SHAI-14 showed only moderate fit under maximum-likelihood estimation. The SHAI cut-off was derived in Sweden, and the CSS-12 has no validated clinical cut-off, so the "high cyberchondria" group is sample-relative.</w:t>
+        <w:t xml:space="preserve"> the Arabic wording was produced by the research team without a formal forward–backward translation and cognitive pre-testing; equivalence was supported empirically (similar reliability, congruent loadings and equal means across language groups) but not established by formal measurement-invariance testing. Published Arabic versions of both scales exist [15,41] but were not used, so comparability with Arabic studies that used them is uncertain. On the form, the response options of some SHAI items were displayed in an order that differed from the original scale; although scoring followed the original key, the changed order may have influenced how people answered. "Language relied on" was self-selected, not randomised. The SHAI-14 showed only moderate fit under maximum-likelihood estimation. The SHAI cut-off was derived in Sweden, and the CSS-12 has no validated clinical cut-off, so the "high cyberchondria" group is sample-relative.</w:t>
       </w:r>
     </w:p>
     <w:p>
@@ -24531,80 +24588,110 @@
     </w:p>
     <w:p>
       <w:pPr>
-        <w:pStyle w:val="ListNumber"/>
+        <w:tabs>
+          <w:tab w:pos="510" w:val="left"/>
+        </w:tabs>
         <w:spacing w:after="60"/>
+        <w:ind w:left="510" w:hanging="510"/>
         <w:jc w:val="both"/>
       </w:pPr>
       <w:r>
         <w:rPr>
           <w:rFonts w:ascii="Times New Roman" w:hAnsi="Times New Roman"/>
         </w:rPr>
+        <w:t>1.</w:t>
+        <w:tab/>
         <w:t>AI chatbots, mainly ChatGPT, have become the leading source of pre-consultation health information among digitally active adults in Baghdad, used by 88.7% of participants, ahead of search engines.</w:t>
       </w:r>
     </w:p>
     <w:p>
       <w:pPr>
-        <w:pStyle w:val="ListNumber"/>
+        <w:tabs>
+          <w:tab w:pos="510" w:val="left"/>
+        </w:tabs>
         <w:spacing w:after="60"/>
+        <w:ind w:left="510" w:hanging="510"/>
         <w:jc w:val="both"/>
       </w:pPr>
       <w:r>
         <w:rPr>
           <w:rFonts w:ascii="Times New Roman" w:hAnsi="Times New Roman"/>
         </w:rPr>
-        <w:t>About one in five participants (19%) had health anxiety above a clinically relevant threshold, and younger people and those searching for instant reassurance were most affected.</w:t>
+        <w:t>2.</w:t>
+        <w:tab/>
+        <w:t>About one in five participants (19%) had elevated health anxiety (SHAI ≥ 18, a screening threshold rather than a diagnosis; 0.7% at the stricter cut-off of 29), and younger people and those searching for instant reassurance were most affected.</w:t>
       </w:r>
     </w:p>
     <w:p>
       <w:pPr>
-        <w:pStyle w:val="ListNumber"/>
+        <w:tabs>
+          <w:tab w:pos="510" w:val="left"/>
+        </w:tabs>
         <w:spacing w:after="60"/>
+        <w:ind w:left="510" w:hanging="510"/>
         <w:jc w:val="both"/>
       </w:pPr>
       <w:r>
         <w:rPr>
           <w:rFonts w:ascii="Times New Roman" w:hAnsi="Times New Roman"/>
         </w:rPr>
+        <w:t>3.</w:t>
+        <w:tab/>
         <w:t>Health anxiety and cyberchondria are moderately and robustly associated (r = 0.47); health anxiety is the strongest independent predictor of cyberchondria, especially of excessive searching and post-search distress.</w:t>
       </w:r>
     </w:p>
     <w:p>
       <w:pPr>
-        <w:pStyle w:val="ListNumber"/>
+        <w:tabs>
+          <w:tab w:pos="510" w:val="left"/>
+        </w:tabs>
         <w:spacing w:after="60"/>
+        <w:ind w:left="510" w:hanging="510"/>
         <w:jc w:val="both"/>
       </w:pPr>
       <w:r>
         <w:rPr>
           <w:rFonts w:ascii="Times New Roman" w:hAnsi="Times New Roman"/>
         </w:rPr>
+        <w:t>4.</w:t>
+        <w:tab/>
         <w:t>The pattern of associations is consistent with a reinforcing cycle (health anxiety → excessive searching → distress → reassurance-seeking consultations), although the cross-sectional design cannot prove its direction.</w:t>
       </w:r>
     </w:p>
     <w:p>
       <w:pPr>
-        <w:pStyle w:val="ListNumber"/>
+        <w:tabs>
+          <w:tab w:pos="510" w:val="left"/>
+        </w:tabs>
         <w:spacing w:after="60"/>
+        <w:ind w:left="510" w:hanging="510"/>
         <w:jc w:val="both"/>
       </w:pPr>
       <w:r>
         <w:rPr>
           <w:rFonts w:ascii="Times New Roman" w:hAnsi="Times New Roman"/>
         </w:rPr>
+        <w:t>5.</w:t>
+        <w:tab/>
         <w:t>AI-chatbot use is associated with higher cyberchondria, mainly excessive searching and reassurance seeking, although this depends on how inconsistent answers are classified; AI use does not change the strength of the health anxiety–cyberchondria link.</w:t>
       </w:r>
     </w:p>
     <w:p>
       <w:pPr>
-        <w:pStyle w:val="ListNumber"/>
+        <w:tabs>
+          <w:tab w:pos="510" w:val="left"/>
+        </w:tabs>
         <w:spacing w:after="60"/>
+        <w:ind w:left="510" w:hanging="510"/>
         <w:jc w:val="both"/>
       </w:pPr>
       <w:r>
         <w:rPr>
           <w:rFonts w:ascii="Times New Roman" w:hAnsi="Times New Roman"/>
         </w:rPr>
-        <w:t>Online searching shapes the consultation: one-third of participants delay care because they feel reassured, one-third never disclose their searches to their doctor, and one-third report a negative effect on their relationship with or trust in physicians. Higher cyberchondria is linked with urgent care-seeking and a more strained relationship.</w:t>
+        <w:t>6.</w:t>
+        <w:tab/>
+        <w:t>Online searching shapes the consultation: one-third of participants delay care because they feel reassured, one-third never disclose their searches to their doctor, and one-third report a negative effect on their relationship with or trust in physicians. Higher cyberchondria may be linked with urgent care-seeking and a more strained relationship, although these associations were exploratory.</w:t>
       </w:r>
     </w:p>
     <w:p>
@@ -24755,7 +24842,7 @@
         <w:rPr>
           <w:rFonts w:ascii="Times New Roman" w:hAnsi="Times New Roman"/>
         </w:rPr>
-        <w:t>Develop and test interventions: ClinicalTrials.gov lists only nine registered studies on cyberchondria (October 2026), none in Iraq and almost all observational [52], so trials of brief digital health-literacy or cognitive-behavioural interventions in Arabic are a clear gap.</w:t>
+        <w:t>Develop and test interventions: ClinicalTrials.gov lists only nine registered studies on cyberchondria (October 2026), none in Iraq and six of them observational and three interventional [52], so trials of brief digital health-literacy or cognitive-behavioural interventions in Arabic are a clear gap.</w:t>
       </w:r>
     </w:p>
     <w:p>
@@ -24832,7 +24919,7 @@
         </w:rPr>
         <w:t>2.</w:t>
         <w:tab/>
-        <w:t>Starcevic V, Berle D. Cyberchondria: towards a better understanding of excessive health-related Internet use. Expert Rev Neurother. 2013;13(2):205-13.</w:t>
+        <w:t>Starcevic V, Berle D. Cyberchondria: towards a better understanding of excessive health-related Internet use. Expert Rev Neurother. 2013;13(2):205-13. doi:10.1586/ern.12.162</w:t>
       </w:r>
     </w:p>
     <w:p>
@@ -24907,7 +24994,7 @@
         </w:rPr>
         <w:t>7.</w:t>
         <w:tab/>
-        <w:t>Barsky AJ, Ettner SL, Horsky J, Bates DW. Resource utilization of patients with hypochondriacal health anxiety and somatization. Med Care. 2001;39(7):705-15.</w:t>
+        <w:t>Barsky AJ, Ettner SL, Horsky J, Bates DW. Resource utilization of patients with hypochondriacal health anxiety and somatization. Med Care. 2001;39(7):705-15. doi:10.1097/00005650-200107000-00007</w:t>
       </w:r>
     </w:p>
     <w:p>
@@ -24922,7 +25009,7 @@
         </w:rPr>
         <w:t>8.</w:t>
         <w:tab/>
-        <w:t>Karim SK, Taha PH, Amin NMM, Ahmed HS, Yousif MK, Hallumy AM. COVID-19-related anxiety disorder in Iraq during the pandemic: an online cross-sectional study. Middle East Curr Psychiatry. 2020;27. doi:10.1186/s43045-020-00067-4</w:t>
+        <w:t>Karim SK, Taha PH, Amin NMM, Ahmed HS, Yousif MK, Hallumy AM. COVID-19-related anxiety disorder in Iraq during the pandemic: an online cross-sectional study. Middle East Curr Psychiatry. 2020;27(1):55. doi:10.1186/s43045-020-00067-4</w:t>
       </w:r>
     </w:p>
     <w:p>
@@ -24937,7 +25024,7 @@
         </w:rPr>
         <w:t>9.</w:t>
         <w:tab/>
-        <w:t>Taha PH. Home quarantine induced health anxiety during the beginning of the COVID-19 pandemic: evidence from Iraq. Disaster Med Public Health Prep. 2021;17:e26. doi:10.1017/dmp.2021.242</w:t>
+        <w:t>Taha PH. Home quarantine induced health anxiety during the beginning of the COVID-19 pandemic: evidence from Iraq. Disaster Med Public Health Prep. 2023;17:e26. Epub 2021 Jul 26. doi:10.1017/dmp.2021.242</w:t>
       </w:r>
     </w:p>
     <w:p>
@@ -25252,7 +25339,7 @@
         </w:rPr>
         <w:t>30.</w:t>
         <w:tab/>
-        <w:t>Dığış M, Kaya K, Demir B, Çiçek İN, Akdağ D, Akdağ Ş. Frequency of use and attitudes toward AI-based health counseling among patients attending the dermatology outpatient clinic: a cross-sectional study. Cutan Ocul Toxicol. 2026:1-11. doi:10.1080/15569527.2026.2711643</w:t>
+        <w:t>Dığış M, Kaya K, Demir B, Çiçek İN, Akdağ D, Akdağ Ş. Frequency of use and attitudes toward AI-based health counseling among patients attending the dermatology outpatient clinic: a cross-sectional study. Cutan Ocul Toxicol. 2026 Aug 6:1-11. Epub ahead of print. doi:10.1080/15569527.2026.2711643</w:t>
       </w:r>
     </w:p>
     <w:p>
@@ -25327,7 +25414,7 @@
         </w:rPr>
         <w:t>35.</w:t>
         <w:tab/>
-        <w:t>von Elm E, Altman DG, Egger M, Pocock SJ, Gøtzsche PC, Vandenbroucke JP. The Strengthening the Reporting of Observational Studies in Epidemiology (STROBE) statement: guidelines for reporting observational studies. Lancet. 2007;370(9596):1453-7.</w:t>
+        <w:t>von Elm E, Altman DG, Egger M, Pocock SJ, Gøtzsche PC, Vandenbroucke JP. The Strengthening the Reporting of Observational Studies in Epidemiology (STROBE) statement: guidelines for reporting observational studies. Lancet. 2007;370(9596):1453-7. doi:10.1016/S0140-6736(07)61602-X</w:t>
       </w:r>
     </w:p>
     <w:p>
@@ -25372,7 +25459,7 @@
         </w:rPr>
         <w:t>38.</w:t>
         <w:tab/>
-        <w:t>Salkovskis PM, Rimes KA, Warwick HMC, Clark DM. The Health Anxiety Inventory: development and validation of scales for the measurement of health anxiety and hypochondriasis. Psychol Med. 2002;32(5):843-53.</w:t>
+        <w:t>Salkovskis PM, Rimes KA, Warwick HMC, Clark DM. The Health Anxiety Inventory: development and validation of scales for the measurement of health anxiety and hypochondriasis. Psychol Med. 2002;32(5):843-53. doi:10.1017/S0033291702005822</w:t>
       </w:r>
     </w:p>
     <w:p>
@@ -25387,7 +25474,7 @@
         </w:rPr>
         <w:t>39.</w:t>
         <w:tab/>
-        <w:t>Abramowitz JS, Deacon BJ, Valentiner DP. The Short Health Anxiety Inventory: psychometric properties and construct validity in a non-clinical sample. Cognit Ther Res. 2007;31(6):871-83.</w:t>
+        <w:t>Abramowitz JS, Deacon BJ, Valentiner DP. The Short Health Anxiety Inventory: psychometric properties and construct validity in a non-clinical sample. Cognit Ther Res. 2007;31(6):871-83. doi:10.1007/s10608-006-9058-1</w:t>
       </w:r>
     </w:p>
     <w:p>
@@ -25447,7 +25534,7 @@
         </w:rPr>
         <w:t>43.</w:t>
         <w:tab/>
-        <w:t>Hayes AF, Coutts JJ. Use omega rather than Cronbach's alpha for estimating reliability. But… Commun Methods Meas. 2020;14(1):1-24.</w:t>
+        <w:t>Hayes AF, Coutts JJ. Use omega rather than Cronbach's alpha for estimating reliability. But… Commun Methods Meas. 2020;14(1):1-24. doi:10.1080/19312458.2020.1718629</w:t>
       </w:r>
     </w:p>
     <w:p>
@@ -25462,7 +25549,7 @@
         </w:rPr>
         <w:t>44.</w:t>
         <w:tab/>
-        <w:t>Hu L, Bentler PM. Cutoff criteria for fit indexes in covariance structure analysis: conventional criteria versus new alternatives. Struct Equ Modeling. 1999;6(1):1-55.</w:t>
+        <w:t>Hu L, Bentler PM. Cutoff criteria for fit indexes in covariance structure analysis: conventional criteria versus new alternatives. Struct Equ Modeling. 1999;6(1):1-55. doi:10.1080/10705519909540118</w:t>
       </w:r>
     </w:p>
     <w:p>
@@ -25477,7 +25564,7 @@
         </w:rPr>
         <w:t>45.</w:t>
         <w:tab/>
-        <w:t>Feldt LS, Woodruff DJ, Salih FA. Statistical inference for coefficient alpha. Appl Psychol Meas. 1987;11(1):93-103.</w:t>
+        <w:t>Feldt LS, Woodruff DJ, Salih FA. Statistical inference for coefficient alpha. Appl Psychol Meas. 1987;11(1):93-103. doi:10.1177/014662168701100107</w:t>
       </w:r>
     </w:p>
     <w:p>
@@ -25492,7 +25579,7 @@
         </w:rPr>
         <w:t>46.</w:t>
         <w:tab/>
-        <w:t>Lorenzo-Seva U, ten Berge JMF. Tucker's congruence coefficient as a meaningful index of factor similarity. Methodology. 2006;2(2):57-64.</w:t>
+        <w:t>Lorenzo-Seva U, ten Berge JMF. Tucker's congruence coefficient as a meaningful index of factor similarity. Methodology. 2006;2(2):57-64. doi:10.1027/1614-2241.2.2.57</w:t>
       </w:r>
     </w:p>
     <w:p>
@@ -25507,7 +25594,7 @@
         </w:rPr>
         <w:t>47.</w:t>
         <w:tab/>
-        <w:t>Steiger JH. Tests for comparing elements of a correlation matrix. Psychol Bull. 1980;87(2):245-51.</w:t>
+        <w:t>Steiger JH. Tests for comparing elements of a correlation matrix. Psychol Bull. 1980;87(2):245-51. doi:10.1037/0033-2909.87.2.245</w:t>
       </w:r>
     </w:p>
     <w:p>
@@ -25522,7 +25609,7 @@
         </w:rPr>
         <w:t>48.</w:t>
         <w:tab/>
-        <w:t>Benjamini Y, Hochberg Y. Controlling the false discovery rate: a practical and powerful approach to multiple testing. J R Stat Soc Series B Stat Methodol. 1995;57(1):289-300.</w:t>
+        <w:t>Benjamini Y, Hochberg Y. Controlling the false discovery rate: a practical and powerful approach to multiple testing. J R Stat Soc Series B Methodol. 1995;57(1):289-300. doi:10.1111/j.2517-6161.1995.tb02031.x</w:t>
       </w:r>
     </w:p>
     <w:p>
@@ -25552,7 +25639,7 @@
         </w:rPr>
         <w:t>50.</w:t>
         <w:tab/>
-        <w:t>Maxwell SE, Cole DA. Bias in cross-sectional analyses of longitudinal mediation. Psychol Methods. 2007;12(1):23-44.</w:t>
+        <w:t>Maxwell SE, Cole DA. Bias in cross-sectional analyses of longitudinal mediation. Psychol Methods. 2007;12(1):23-44. doi:10.1037/1082-989X.12.1.23</w:t>
       </w:r>
     </w:p>
     <w:p>

</xml_diff>